<commit_message>
Convert Algebra 1 Lesson 1 to fill-in-the-blank student packet
Rework to match the Geometry student packet: vocabulary is now a
fill-in-the-blank table (word column blank + word bank), and the 11
practice problems are laid out in Geometry-style tables with blank
answer columns instead of pre-filled solutions. Teaching illustrations
now use neutral variables so no practice answer is revealed. Intended
answers moved to a teacher-only key in the QA report.

Co-Authored-By: Claude Opus 4.8 <noreply@anthropic.com>
Claude-Session: https://claude.ai/code/session_01FC3BfbH3eZoJiVptb2oNST
</commit_message>
<xml_diff>
--- a/algebra1-notes/Algebra1_Unit1_Lesson1_Variables_and_Expressions.docx
+++ b/algebra1-notes/Algebra1_Unit1_Lesson1_Variables_and_Expressions.docx
@@ -488,6 +488,19 @@
       <w:r>
         <w:rPr>
           <w:rFonts w:ascii="Arial" w:cs="Arial" w:eastAsia="Arial" w:hAnsi="Arial"/>
+          <w:b/>
+          <w:bCs/>
+          <w:i w:val="false"/>
+          <w:iCs w:val="false"/>
+          <w:color w:val="1F3864"/>
+          <w:sz w:val="22"/>
+          <w:szCs w:val="22"/>
+        </w:rPr>
+        <w:t xml:space="preserve">Directions: </w:t>
+      </w:r>
+      <w:r>
+        <w:rPr>
+          <w:rFonts w:ascii="Arial" w:cs="Arial" w:eastAsia="Arial" w:hAnsi="Arial"/>
           <w:b w:val="false"/>
           <w:bCs w:val="false"/>
           <w:i/>
@@ -496,7 +509,7 @@
           <w:sz w:val="22"/>
           <w:szCs w:val="22"/>
         </w:rPr>
-        <w:t xml:space="preserve">Fill in / study the key terms. Definitions from the lesson are shown in full below.</w:t>
+        <w:t xml:space="preserve">Read each definition and write the correct vocabulary word in the first column. Then write your own example in the last column.</w:t>
       </w:r>
     </w:p>
     <w:tbl>
@@ -512,9 +525,9 @@
         </w:tblBorders>
       </w:tblPr>
       <w:tblGrid>
+        <w:gridCol w:w="2600"/>
+        <w:gridCol w:w="4560"/>
         <w:gridCol w:w="2200"/>
-        <w:gridCol w:w="4560"/>
-        <w:gridCol w:w="2600"/>
       </w:tblGrid>
       <w:tr>
         <w:trPr>
@@ -522,7 +535,7 @@
         </w:trPr>
         <w:tc>
           <w:tcPr>
-            <w:tcW w:type="dxa" w:w="2200"/>
+            <w:tcW w:type="dxa" w:w="2600"/>
             <w:shd w:fill="DEEAF6" w:val="clear"/>
             <w:tcMar>
               <w:top w:type="dxa" w:w="70"/>
@@ -532,6 +545,9 @@
             </w:tcMar>
           </w:tcPr>
           <w:p>
+            <w:pPr>
+              <w:jc w:val="center"/>
+            </w:pPr>
             <w:r>
               <w:rPr>
                 <w:rFonts w:ascii="Arial" w:cs="Arial" w:eastAsia="Arial" w:hAnsi="Arial"/>
@@ -541,7 +557,7 @@
                 <w:sz w:val="21"/>
                 <w:szCs w:val="21"/>
               </w:rPr>
-              <w:t xml:space="preserve">Term</w:t>
+              <w:t xml:space="preserve">Vocabulary Word</w:t>
             </w:r>
           </w:p>
         </w:tc>
@@ -557,6 +573,9 @@
             </w:tcMar>
           </w:tcPr>
           <w:p>
+            <w:pPr>
+              <w:jc w:val="center"/>
+            </w:pPr>
             <w:r>
               <w:rPr>
                 <w:rFonts w:ascii="Arial" w:cs="Arial" w:eastAsia="Arial" w:hAnsi="Arial"/>
@@ -572,7 +591,7 @@
         </w:tc>
         <w:tc>
           <w:tcPr>
-            <w:tcW w:type="dxa" w:w="2600"/>
+            <w:tcW w:type="dxa" w:w="2200"/>
             <w:shd w:fill="DEEAF6" w:val="clear"/>
             <w:tcMar>
               <w:top w:type="dxa" w:w="70"/>
@@ -582,6 +601,9 @@
             </w:tcMar>
           </w:tcPr>
           <w:p>
+            <w:pPr>
+              <w:jc w:val="center"/>
+            </w:pPr>
             <w:r>
               <w:rPr>
                 <w:rFonts w:ascii="Arial" w:cs="Arial" w:eastAsia="Arial" w:hAnsi="Arial"/>
@@ -597,27 +619,31 @@
         </w:tc>
       </w:tr>
       <w:tr>
-        <w:tc>
-          <w:tcPr>
-            <w:tcW w:type="dxa" w:w="2200"/>
-            <w:tcMar>
-              <w:top w:type="dxa" w:w="70"/>
-              <w:left w:type="dxa" w:w="110"/>
-              <w:bottom w:type="dxa" w:w="70"/>
-              <w:right w:type="dxa" w:w="110"/>
-            </w:tcMar>
-          </w:tcPr>
-          <w:p>
-            <w:r>
-              <w:rPr>
-                <w:rFonts w:ascii="Arial" w:cs="Arial" w:eastAsia="Arial" w:hAnsi="Arial"/>
-                <w:b/>
-                <w:bCs/>
-                <w:color w:val="000000"/>
-                <w:sz w:val="21"/>
-                <w:szCs w:val="21"/>
-              </w:rPr>
-              <w:t xml:space="preserve">Variable</w:t>
+        <w:trPr>
+          <w:trHeight w:val="620" w:hRule="atLeast"/>
+        </w:trPr>
+        <w:tc>
+          <w:tcPr>
+            <w:tcW w:type="dxa" w:w="2600"/>
+            <w:tcMar>
+              <w:top w:type="dxa" w:w="70"/>
+              <w:left w:type="dxa" w:w="110"/>
+              <w:bottom w:type="dxa" w:w="70"/>
+              <w:right w:type="dxa" w:w="110"/>
+            </w:tcMar>
+          </w:tcPr>
+          <w:p>
+            <w:pPr>
+              <w:spacing w:after="20" w:before="60"/>
+            </w:pPr>
+            <w:r>
+              <w:rPr>
+                <w:rFonts w:ascii="Arial" w:cs="Arial" w:eastAsia="Arial" w:hAnsi="Arial"/>
+                <w:color w:val="808080"/>
+                <w:sz w:val="20"/>
+                <w:szCs w:val="20"/>
+              </w:rPr>
+              <w:t xml:space="preserve">__________________________________</w:t>
             </w:r>
           </w:p>
         </w:tc>
@@ -647,51 +673,56 @@
         </w:tc>
         <w:tc>
           <w:tcPr>
-            <w:tcW w:type="dxa" w:w="2600"/>
-            <w:tcMar>
-              <w:top w:type="dxa" w:w="70"/>
-              <w:left w:type="dxa" w:w="110"/>
-              <w:bottom w:type="dxa" w:w="70"/>
-              <w:right w:type="dxa" w:w="110"/>
-            </w:tcMar>
-          </w:tcPr>
-          <w:p>
-            <w:r>
-              <w:rPr>
-                <w:rFonts w:ascii="Arial" w:cs="Arial" w:eastAsia="Arial" w:hAnsi="Arial"/>
-                <w:i/>
-                <w:iCs/>
-                <w:color w:val="595959"/>
-                <w:sz w:val="21"/>
-                <w:szCs w:val="21"/>
-              </w:rPr>
-              <w:t xml:space="preserve">x, m, g, h</w:t>
+            <w:tcW w:type="dxa" w:w="2200"/>
+            <w:tcMar>
+              <w:top w:type="dxa" w:w="70"/>
+              <w:left w:type="dxa" w:w="110"/>
+              <w:bottom w:type="dxa" w:w="70"/>
+              <w:right w:type="dxa" w:w="110"/>
+            </w:tcMar>
+          </w:tcPr>
+          <w:p>
+            <w:pPr>
+              <w:spacing w:after="20" w:before="60"/>
+            </w:pPr>
+            <w:r>
+              <w:rPr>
+                <w:rFonts w:ascii="Arial" w:cs="Arial" w:eastAsia="Arial" w:hAnsi="Arial"/>
+                <w:color w:val="808080"/>
+                <w:sz w:val="20"/>
+                <w:szCs w:val="20"/>
+              </w:rPr>
+              <w:t xml:space="preserve">__________________________________</w:t>
             </w:r>
           </w:p>
         </w:tc>
       </w:tr>
       <w:tr>
-        <w:tc>
-          <w:tcPr>
-            <w:tcW w:type="dxa" w:w="2200"/>
-            <w:tcMar>
-              <w:top w:type="dxa" w:w="70"/>
-              <w:left w:type="dxa" w:w="110"/>
-              <w:bottom w:type="dxa" w:w="70"/>
-              <w:right w:type="dxa" w:w="110"/>
-            </w:tcMar>
-          </w:tcPr>
-          <w:p>
-            <w:r>
-              <w:rPr>
-                <w:rFonts w:ascii="Arial" w:cs="Arial" w:eastAsia="Arial" w:hAnsi="Arial"/>
-                <w:b/>
-                <w:bCs/>
-                <w:color w:val="000000"/>
-                <w:sz w:val="21"/>
-                <w:szCs w:val="21"/>
-              </w:rPr>
-              <w:t xml:space="preserve">Constant</w:t>
+        <w:trPr>
+          <w:trHeight w:val="620" w:hRule="atLeast"/>
+        </w:trPr>
+        <w:tc>
+          <w:tcPr>
+            <w:tcW w:type="dxa" w:w="2600"/>
+            <w:tcMar>
+              <w:top w:type="dxa" w:w="70"/>
+              <w:left w:type="dxa" w:w="110"/>
+              <w:bottom w:type="dxa" w:w="70"/>
+              <w:right w:type="dxa" w:w="110"/>
+            </w:tcMar>
+          </w:tcPr>
+          <w:p>
+            <w:pPr>
+              <w:spacing w:after="20" w:before="60"/>
+            </w:pPr>
+            <w:r>
+              <w:rPr>
+                <w:rFonts w:ascii="Arial" w:cs="Arial" w:eastAsia="Arial" w:hAnsi="Arial"/>
+                <w:color w:val="808080"/>
+                <w:sz w:val="20"/>
+                <w:szCs w:val="20"/>
+              </w:rPr>
+              <w:t xml:space="preserve">__________________________________</w:t>
             </w:r>
           </w:p>
         </w:tc>
@@ -721,51 +752,56 @@
         </w:tc>
         <w:tc>
           <w:tcPr>
-            <w:tcW w:type="dxa" w:w="2600"/>
-            <w:tcMar>
-              <w:top w:type="dxa" w:w="70"/>
-              <w:left w:type="dxa" w:w="110"/>
-              <w:bottom w:type="dxa" w:w="70"/>
-              <w:right w:type="dxa" w:w="110"/>
-            </w:tcMar>
-          </w:tcPr>
-          <w:p>
-            <w:r>
-              <w:rPr>
-                <w:rFonts w:ascii="Arial" w:cs="Arial" w:eastAsia="Arial" w:hAnsi="Arial"/>
-                <w:i/>
-                <w:iCs/>
-                <w:color w:val="595959"/>
-                <w:sz w:val="21"/>
-                <w:szCs w:val="21"/>
-              </w:rPr>
-              <w:t xml:space="preserve">12, 7.9, π</w:t>
+            <w:tcW w:type="dxa" w:w="2200"/>
+            <w:tcMar>
+              <w:top w:type="dxa" w:w="70"/>
+              <w:left w:type="dxa" w:w="110"/>
+              <w:bottom w:type="dxa" w:w="70"/>
+              <w:right w:type="dxa" w:w="110"/>
+            </w:tcMar>
+          </w:tcPr>
+          <w:p>
+            <w:pPr>
+              <w:spacing w:after="20" w:before="60"/>
+            </w:pPr>
+            <w:r>
+              <w:rPr>
+                <w:rFonts w:ascii="Arial" w:cs="Arial" w:eastAsia="Arial" w:hAnsi="Arial"/>
+                <w:color w:val="808080"/>
+                <w:sz w:val="20"/>
+                <w:szCs w:val="20"/>
+              </w:rPr>
+              <w:t xml:space="preserve">__________________________________</w:t>
             </w:r>
           </w:p>
         </w:tc>
       </w:tr>
       <w:tr>
-        <w:tc>
-          <w:tcPr>
-            <w:tcW w:type="dxa" w:w="2200"/>
-            <w:tcMar>
-              <w:top w:type="dxa" w:w="70"/>
-              <w:left w:type="dxa" w:w="110"/>
-              <w:bottom w:type="dxa" w:w="70"/>
-              <w:right w:type="dxa" w:w="110"/>
-            </w:tcMar>
-          </w:tcPr>
-          <w:p>
-            <w:r>
-              <w:rPr>
-                <w:rFonts w:ascii="Arial" w:cs="Arial" w:eastAsia="Arial" w:hAnsi="Arial"/>
-                <w:b/>
-                <w:bCs/>
-                <w:color w:val="000000"/>
-                <w:sz w:val="21"/>
-                <w:szCs w:val="21"/>
-              </w:rPr>
-              <w:t xml:space="preserve">Numerical expression</w:t>
+        <w:trPr>
+          <w:trHeight w:val="620" w:hRule="atLeast"/>
+        </w:trPr>
+        <w:tc>
+          <w:tcPr>
+            <w:tcW w:type="dxa" w:w="2600"/>
+            <w:tcMar>
+              <w:top w:type="dxa" w:w="70"/>
+              <w:left w:type="dxa" w:w="110"/>
+              <w:bottom w:type="dxa" w:w="70"/>
+              <w:right w:type="dxa" w:w="110"/>
+            </w:tcMar>
+          </w:tcPr>
+          <w:p>
+            <w:pPr>
+              <w:spacing w:after="20" w:before="60"/>
+            </w:pPr>
+            <w:r>
+              <w:rPr>
+                <w:rFonts w:ascii="Arial" w:cs="Arial" w:eastAsia="Arial" w:hAnsi="Arial"/>
+                <w:color w:val="808080"/>
+                <w:sz w:val="20"/>
+                <w:szCs w:val="20"/>
+              </w:rPr>
+              <w:t xml:space="preserve">__________________________________</w:t>
             </w:r>
           </w:p>
         </w:tc>
@@ -795,51 +831,56 @@
         </w:tc>
         <w:tc>
           <w:tcPr>
-            <w:tcW w:type="dxa" w:w="2600"/>
-            <w:tcMar>
-              <w:top w:type="dxa" w:w="70"/>
-              <w:left w:type="dxa" w:w="110"/>
-              <w:bottom w:type="dxa" w:w="70"/>
-              <w:right w:type="dxa" w:w="110"/>
-            </w:tcMar>
-          </w:tcPr>
-          <w:p>
-            <w:r>
-              <w:rPr>
-                <w:rFonts w:ascii="Arial" w:cs="Arial" w:eastAsia="Arial" w:hAnsi="Arial"/>
-                <w:i/>
-                <w:iCs/>
-                <w:color w:val="595959"/>
-                <w:sz w:val="21"/>
-                <w:szCs w:val="21"/>
-              </w:rPr>
-              <w:t xml:space="preserve">6 + 4 × 2</w:t>
+            <w:tcW w:type="dxa" w:w="2200"/>
+            <w:tcMar>
+              <w:top w:type="dxa" w:w="70"/>
+              <w:left w:type="dxa" w:w="110"/>
+              <w:bottom w:type="dxa" w:w="70"/>
+              <w:right w:type="dxa" w:w="110"/>
+            </w:tcMar>
+          </w:tcPr>
+          <w:p>
+            <w:pPr>
+              <w:spacing w:after="20" w:before="60"/>
+            </w:pPr>
+            <w:r>
+              <w:rPr>
+                <w:rFonts w:ascii="Arial" w:cs="Arial" w:eastAsia="Arial" w:hAnsi="Arial"/>
+                <w:color w:val="808080"/>
+                <w:sz w:val="20"/>
+                <w:szCs w:val="20"/>
+              </w:rPr>
+              <w:t xml:space="preserve">__________________________________</w:t>
             </w:r>
           </w:p>
         </w:tc>
       </w:tr>
       <w:tr>
-        <w:tc>
-          <w:tcPr>
-            <w:tcW w:type="dxa" w:w="2200"/>
-            <w:tcMar>
-              <w:top w:type="dxa" w:w="70"/>
-              <w:left w:type="dxa" w:w="110"/>
-              <w:bottom w:type="dxa" w:w="70"/>
-              <w:right w:type="dxa" w:w="110"/>
-            </w:tcMar>
-          </w:tcPr>
-          <w:p>
-            <w:r>
-              <w:rPr>
-                <w:rFonts w:ascii="Arial" w:cs="Arial" w:eastAsia="Arial" w:hAnsi="Arial"/>
-                <w:b/>
-                <w:bCs/>
-                <w:color w:val="000000"/>
-                <w:sz w:val="21"/>
-                <w:szCs w:val="21"/>
-              </w:rPr>
-              <w:t xml:space="preserve">Algebraic expression</w:t>
+        <w:trPr>
+          <w:trHeight w:val="620" w:hRule="atLeast"/>
+        </w:trPr>
+        <w:tc>
+          <w:tcPr>
+            <w:tcW w:type="dxa" w:w="2600"/>
+            <w:tcMar>
+              <w:top w:type="dxa" w:w="70"/>
+              <w:left w:type="dxa" w:w="110"/>
+              <w:bottom w:type="dxa" w:w="70"/>
+              <w:right w:type="dxa" w:w="110"/>
+            </w:tcMar>
+          </w:tcPr>
+          <w:p>
+            <w:pPr>
+              <w:spacing w:after="20" w:before="60"/>
+            </w:pPr>
+            <w:r>
+              <w:rPr>
+                <w:rFonts w:ascii="Arial" w:cs="Arial" w:eastAsia="Arial" w:hAnsi="Arial"/>
+                <w:color w:val="808080"/>
+                <w:sz w:val="20"/>
+                <w:szCs w:val="20"/>
+              </w:rPr>
+              <w:t xml:space="preserve">__________________________________</w:t>
             </w:r>
           </w:p>
         </w:tc>
@@ -869,51 +910,56 @@
         </w:tc>
         <w:tc>
           <w:tcPr>
-            <w:tcW w:type="dxa" w:w="2600"/>
-            <w:tcMar>
-              <w:top w:type="dxa" w:w="70"/>
-              <w:left w:type="dxa" w:w="110"/>
-              <w:bottom w:type="dxa" w:w="70"/>
-              <w:right w:type="dxa" w:w="110"/>
-            </w:tcMar>
-          </w:tcPr>
-          <w:p>
-            <w:r>
-              <w:rPr>
-                <w:rFonts w:ascii="Arial" w:cs="Arial" w:eastAsia="Arial" w:hAnsi="Arial"/>
-                <w:i/>
-                <w:iCs/>
-                <w:color w:val="595959"/>
-                <w:sz w:val="21"/>
-                <w:szCs w:val="21"/>
-              </w:rPr>
-              <w:t xml:space="preserve">6h + 7.9</w:t>
+            <w:tcW w:type="dxa" w:w="2200"/>
+            <w:tcMar>
+              <w:top w:type="dxa" w:w="70"/>
+              <w:left w:type="dxa" w:w="110"/>
+              <w:bottom w:type="dxa" w:w="70"/>
+              <w:right w:type="dxa" w:w="110"/>
+            </w:tcMar>
+          </w:tcPr>
+          <w:p>
+            <w:pPr>
+              <w:spacing w:after="20" w:before="60"/>
+            </w:pPr>
+            <w:r>
+              <w:rPr>
+                <w:rFonts w:ascii="Arial" w:cs="Arial" w:eastAsia="Arial" w:hAnsi="Arial"/>
+                <w:color w:val="808080"/>
+                <w:sz w:val="20"/>
+                <w:szCs w:val="20"/>
+              </w:rPr>
+              <w:t xml:space="preserve">__________________________________</w:t>
             </w:r>
           </w:p>
         </w:tc>
       </w:tr>
       <w:tr>
-        <w:tc>
-          <w:tcPr>
-            <w:tcW w:type="dxa" w:w="2200"/>
-            <w:tcMar>
-              <w:top w:type="dxa" w:w="70"/>
-              <w:left w:type="dxa" w:w="110"/>
-              <w:bottom w:type="dxa" w:w="70"/>
-              <w:right w:type="dxa" w:w="110"/>
-            </w:tcMar>
-          </w:tcPr>
-          <w:p>
-            <w:r>
-              <w:rPr>
-                <w:rFonts w:ascii="Arial" w:cs="Arial" w:eastAsia="Arial" w:hAnsi="Arial"/>
-                <w:b/>
-                <w:bCs/>
-                <w:color w:val="000000"/>
-                <w:sz w:val="21"/>
-                <w:szCs w:val="21"/>
-              </w:rPr>
-              <w:t xml:space="preserve">Term</w:t>
+        <w:trPr>
+          <w:trHeight w:val="620" w:hRule="atLeast"/>
+        </w:trPr>
+        <w:tc>
+          <w:tcPr>
+            <w:tcW w:type="dxa" w:w="2600"/>
+            <w:tcMar>
+              <w:top w:type="dxa" w:w="70"/>
+              <w:left w:type="dxa" w:w="110"/>
+              <w:bottom w:type="dxa" w:w="70"/>
+              <w:right w:type="dxa" w:w="110"/>
+            </w:tcMar>
+          </w:tcPr>
+          <w:p>
+            <w:pPr>
+              <w:spacing w:after="20" w:before="60"/>
+            </w:pPr>
+            <w:r>
+              <w:rPr>
+                <w:rFonts w:ascii="Arial" w:cs="Arial" w:eastAsia="Arial" w:hAnsi="Arial"/>
+                <w:color w:val="808080"/>
+                <w:sz w:val="20"/>
+                <w:szCs w:val="20"/>
+              </w:rPr>
+              <w:t xml:space="preserve">__________________________________</w:t>
             </w:r>
           </w:p>
         </w:tc>
@@ -937,57 +983,62 @@
                 <w:sz w:val="21"/>
                 <w:szCs w:val="21"/>
               </w:rPr>
-              <w:t xml:space="preserve">A single number, variable, or product/quotient of numbers and variables, separated by + or –.</w:t>
-            </w:r>
-          </w:p>
-        </w:tc>
-        <w:tc>
-          <w:tcPr>
-            <w:tcW w:type="dxa" w:w="2600"/>
-            <w:tcMar>
-              <w:top w:type="dxa" w:w="70"/>
-              <w:left w:type="dxa" w:w="110"/>
-              <w:bottom w:type="dxa" w:w="70"/>
-              <w:right w:type="dxa" w:w="110"/>
-            </w:tcMar>
-          </w:tcPr>
-          <w:p>
-            <w:r>
-              <w:rPr>
-                <w:rFonts w:ascii="Arial" w:cs="Arial" w:eastAsia="Arial" w:hAnsi="Arial"/>
-                <w:i/>
-                <w:iCs/>
-                <w:color w:val="595959"/>
-                <w:sz w:val="21"/>
-                <w:szCs w:val="21"/>
-              </w:rPr>
-              <w:t xml:space="preserve">In 7m + 5, the terms are 7m and 5</w:t>
+              <w:t xml:space="preserve">A single number, a variable, or the product/quotient of numbers and variables, separated by + or – signs.</w:t>
+            </w:r>
+          </w:p>
+        </w:tc>
+        <w:tc>
+          <w:tcPr>
+            <w:tcW w:type="dxa" w:w="2200"/>
+            <w:tcMar>
+              <w:top w:type="dxa" w:w="70"/>
+              <w:left w:type="dxa" w:w="110"/>
+              <w:bottom w:type="dxa" w:w="70"/>
+              <w:right w:type="dxa" w:w="110"/>
+            </w:tcMar>
+          </w:tcPr>
+          <w:p>
+            <w:pPr>
+              <w:spacing w:after="20" w:before="60"/>
+            </w:pPr>
+            <w:r>
+              <w:rPr>
+                <w:rFonts w:ascii="Arial" w:cs="Arial" w:eastAsia="Arial" w:hAnsi="Arial"/>
+                <w:color w:val="808080"/>
+                <w:sz w:val="20"/>
+                <w:szCs w:val="20"/>
+              </w:rPr>
+              <w:t xml:space="preserve">__________________________________</w:t>
             </w:r>
           </w:p>
         </w:tc>
       </w:tr>
       <w:tr>
-        <w:tc>
-          <w:tcPr>
-            <w:tcW w:type="dxa" w:w="2200"/>
-            <w:tcMar>
-              <w:top w:type="dxa" w:w="70"/>
-              <w:left w:type="dxa" w:w="110"/>
-              <w:bottom w:type="dxa" w:w="70"/>
-              <w:right w:type="dxa" w:w="110"/>
-            </w:tcMar>
-          </w:tcPr>
-          <w:p>
-            <w:r>
-              <w:rPr>
-                <w:rFonts w:ascii="Arial" w:cs="Arial" w:eastAsia="Arial" w:hAnsi="Arial"/>
-                <w:b/>
-                <w:bCs/>
-                <w:color w:val="000000"/>
-                <w:sz w:val="21"/>
-                <w:szCs w:val="21"/>
-              </w:rPr>
-              <w:t xml:space="preserve">Coefficient</w:t>
+        <w:trPr>
+          <w:trHeight w:val="620" w:hRule="atLeast"/>
+        </w:trPr>
+        <w:tc>
+          <w:tcPr>
+            <w:tcW w:type="dxa" w:w="2600"/>
+            <w:tcMar>
+              <w:top w:type="dxa" w:w="70"/>
+              <w:left w:type="dxa" w:w="110"/>
+              <w:bottom w:type="dxa" w:w="70"/>
+              <w:right w:type="dxa" w:w="110"/>
+            </w:tcMar>
+          </w:tcPr>
+          <w:p>
+            <w:pPr>
+              <w:spacing w:after="20" w:before="60"/>
+            </w:pPr>
+            <w:r>
+              <w:rPr>
+                <w:rFonts w:ascii="Arial" w:cs="Arial" w:eastAsia="Arial" w:hAnsi="Arial"/>
+                <w:color w:val="808080"/>
+                <w:sz w:val="20"/>
+                <w:szCs w:val="20"/>
+              </w:rPr>
+              <w:t xml:space="preserve">__________________________________</w:t>
             </w:r>
           </w:p>
         </w:tc>
@@ -1011,57 +1062,62 @@
                 <w:sz w:val="21"/>
                 <w:szCs w:val="21"/>
               </w:rPr>
-              <w:t xml:space="preserve">The number multiplied by a variable in a term.</w:t>
-            </w:r>
-          </w:p>
-        </w:tc>
-        <w:tc>
-          <w:tcPr>
-            <w:tcW w:type="dxa" w:w="2600"/>
-            <w:tcMar>
-              <w:top w:type="dxa" w:w="70"/>
-              <w:left w:type="dxa" w:w="110"/>
-              <w:bottom w:type="dxa" w:w="70"/>
-              <w:right w:type="dxa" w:w="110"/>
-            </w:tcMar>
-          </w:tcPr>
-          <w:p>
-            <w:r>
-              <w:rPr>
-                <w:rFonts w:ascii="Arial" w:cs="Arial" w:eastAsia="Arial" w:hAnsi="Arial"/>
-                <w:i/>
-                <w:iCs/>
-                <w:color w:val="595959"/>
-                <w:sz w:val="21"/>
-                <w:szCs w:val="21"/>
-              </w:rPr>
-              <w:t xml:space="preserve">In 7m, the coefficient is 7</w:t>
+              <w:t xml:space="preserve">The number that is multiplied by a variable in a term.</w:t>
+            </w:r>
+          </w:p>
+        </w:tc>
+        <w:tc>
+          <w:tcPr>
+            <w:tcW w:type="dxa" w:w="2200"/>
+            <w:tcMar>
+              <w:top w:type="dxa" w:w="70"/>
+              <w:left w:type="dxa" w:w="110"/>
+              <w:bottom w:type="dxa" w:w="70"/>
+              <w:right w:type="dxa" w:w="110"/>
+            </w:tcMar>
+          </w:tcPr>
+          <w:p>
+            <w:pPr>
+              <w:spacing w:after="20" w:before="60"/>
+            </w:pPr>
+            <w:r>
+              <w:rPr>
+                <w:rFonts w:ascii="Arial" w:cs="Arial" w:eastAsia="Arial" w:hAnsi="Arial"/>
+                <w:color w:val="808080"/>
+                <w:sz w:val="20"/>
+                <w:szCs w:val="20"/>
+              </w:rPr>
+              <w:t xml:space="preserve">__________________________________</w:t>
             </w:r>
           </w:p>
         </w:tc>
       </w:tr>
       <w:tr>
-        <w:tc>
-          <w:tcPr>
-            <w:tcW w:type="dxa" w:w="2200"/>
-            <w:tcMar>
-              <w:top w:type="dxa" w:w="70"/>
-              <w:left w:type="dxa" w:w="110"/>
-              <w:bottom w:type="dxa" w:w="70"/>
-              <w:right w:type="dxa" w:w="110"/>
-            </w:tcMar>
-          </w:tcPr>
-          <w:p>
-            <w:r>
-              <w:rPr>
-                <w:rFonts w:ascii="Arial" w:cs="Arial" w:eastAsia="Arial" w:hAnsi="Arial"/>
-                <w:b/>
-                <w:bCs/>
-                <w:color w:val="000000"/>
-                <w:sz w:val="21"/>
-                <w:szCs w:val="21"/>
-              </w:rPr>
-              <w:t xml:space="preserve">Operation</w:t>
+        <w:trPr>
+          <w:trHeight w:val="620" w:hRule="atLeast"/>
+        </w:trPr>
+        <w:tc>
+          <w:tcPr>
+            <w:tcW w:type="dxa" w:w="2600"/>
+            <w:tcMar>
+              <w:top w:type="dxa" w:w="70"/>
+              <w:left w:type="dxa" w:w="110"/>
+              <w:bottom w:type="dxa" w:w="70"/>
+              <w:right w:type="dxa" w:w="110"/>
+            </w:tcMar>
+          </w:tcPr>
+          <w:p>
+            <w:pPr>
+              <w:spacing w:after="20" w:before="60"/>
+            </w:pPr>
+            <w:r>
+              <w:rPr>
+                <w:rFonts w:ascii="Arial" w:cs="Arial" w:eastAsia="Arial" w:hAnsi="Arial"/>
+                <w:color w:val="808080"/>
+                <w:sz w:val="20"/>
+                <w:szCs w:val="20"/>
+              </w:rPr>
+              <w:t xml:space="preserve">__________________________________</w:t>
             </w:r>
           </w:p>
         </w:tc>
@@ -1085,57 +1141,62 @@
                 <w:sz w:val="21"/>
                 <w:szCs w:val="21"/>
               </w:rPr>
-              <w:t xml:space="preserve">A mathematical action: addition, subtraction, multiplication, or division.</w:t>
-            </w:r>
-          </w:p>
-        </w:tc>
-        <w:tc>
-          <w:tcPr>
-            <w:tcW w:type="dxa" w:w="2600"/>
-            <w:tcMar>
-              <w:top w:type="dxa" w:w="70"/>
-              <w:left w:type="dxa" w:w="110"/>
-              <w:bottom w:type="dxa" w:w="70"/>
-              <w:right w:type="dxa" w:w="110"/>
-            </w:tcMar>
-          </w:tcPr>
-          <w:p>
-            <w:r>
-              <w:rPr>
-                <w:rFonts w:ascii="Arial" w:cs="Arial" w:eastAsia="Arial" w:hAnsi="Arial"/>
-                <w:i/>
-                <w:iCs/>
-                <w:color w:val="595959"/>
-                <w:sz w:val="21"/>
-                <w:szCs w:val="21"/>
-              </w:rPr>
-              <w:t xml:space="preserve">+  –  ×  ÷</w:t>
+              <w:t xml:space="preserve">A mathematical action such as addition, subtraction, multiplication, or division.</w:t>
+            </w:r>
+          </w:p>
+        </w:tc>
+        <w:tc>
+          <w:tcPr>
+            <w:tcW w:type="dxa" w:w="2200"/>
+            <w:tcMar>
+              <w:top w:type="dxa" w:w="70"/>
+              <w:left w:type="dxa" w:w="110"/>
+              <w:bottom w:type="dxa" w:w="70"/>
+              <w:right w:type="dxa" w:w="110"/>
+            </w:tcMar>
+          </w:tcPr>
+          <w:p>
+            <w:pPr>
+              <w:spacing w:after="20" w:before="60"/>
+            </w:pPr>
+            <w:r>
+              <w:rPr>
+                <w:rFonts w:ascii="Arial" w:cs="Arial" w:eastAsia="Arial" w:hAnsi="Arial"/>
+                <w:color w:val="808080"/>
+                <w:sz w:val="20"/>
+                <w:szCs w:val="20"/>
+              </w:rPr>
+              <w:t xml:space="preserve">__________________________________</w:t>
             </w:r>
           </w:p>
         </w:tc>
       </w:tr>
       <w:tr>
-        <w:tc>
-          <w:tcPr>
-            <w:tcW w:type="dxa" w:w="2200"/>
-            <w:tcMar>
-              <w:top w:type="dxa" w:w="70"/>
-              <w:left w:type="dxa" w:w="110"/>
-              <w:bottom w:type="dxa" w:w="70"/>
-              <w:right w:type="dxa" w:w="110"/>
-            </w:tcMar>
-          </w:tcPr>
-          <w:p>
-            <w:r>
-              <w:rPr>
-                <w:rFonts w:ascii="Arial" w:cs="Arial" w:eastAsia="Arial" w:hAnsi="Arial"/>
-                <w:b/>
-                <w:bCs/>
-                <w:color w:val="000000"/>
-                <w:sz w:val="21"/>
-                <w:szCs w:val="21"/>
-              </w:rPr>
-              <w:t xml:space="preserve">Evaluate</w:t>
+        <w:trPr>
+          <w:trHeight w:val="620" w:hRule="atLeast"/>
+        </w:trPr>
+        <w:tc>
+          <w:tcPr>
+            <w:tcW w:type="dxa" w:w="2600"/>
+            <w:tcMar>
+              <w:top w:type="dxa" w:w="70"/>
+              <w:left w:type="dxa" w:w="110"/>
+              <w:bottom w:type="dxa" w:w="70"/>
+              <w:right w:type="dxa" w:w="110"/>
+            </w:tcMar>
+          </w:tcPr>
+          <w:p>
+            <w:pPr>
+              <w:spacing w:after="20" w:before="60"/>
+            </w:pPr>
+            <w:r>
+              <w:rPr>
+                <w:rFonts w:ascii="Arial" w:cs="Arial" w:eastAsia="Arial" w:hAnsi="Arial"/>
+                <w:color w:val="808080"/>
+                <w:sz w:val="20"/>
+                <w:szCs w:val="20"/>
+              </w:rPr>
+              <w:t xml:space="preserve">__________________________________</w:t>
             </w:r>
           </w:p>
         </w:tc>
@@ -1159,31 +1220,32 @@
                 <w:sz w:val="21"/>
                 <w:szCs w:val="21"/>
               </w:rPr>
-              <w:t xml:space="preserve">To find the value of an expression by substituting a number for each variable.</w:t>
-            </w:r>
-          </w:p>
-        </w:tc>
-        <w:tc>
-          <w:tcPr>
-            <w:tcW w:type="dxa" w:w="2600"/>
-            <w:tcMar>
-              <w:top w:type="dxa" w:w="70"/>
-              <w:left w:type="dxa" w:w="110"/>
-              <w:bottom w:type="dxa" w:w="70"/>
-              <w:right w:type="dxa" w:w="110"/>
-            </w:tcMar>
-          </w:tcPr>
-          <w:p>
-            <w:r>
-              <w:rPr>
-                <w:rFonts w:ascii="Arial" w:cs="Arial" w:eastAsia="Arial" w:hAnsi="Arial"/>
-                <w:i/>
-                <w:iCs/>
-                <w:color w:val="595959"/>
-                <w:sz w:val="21"/>
-                <w:szCs w:val="21"/>
-              </w:rPr>
-              <w:t xml:space="preserve">If m = 25, 62m = 1550</w:t>
+              <w:t xml:space="preserve">To find the value of an expression by substituting a number in for each variable.</w:t>
+            </w:r>
+          </w:p>
+        </w:tc>
+        <w:tc>
+          <w:tcPr>
+            <w:tcW w:type="dxa" w:w="2200"/>
+            <w:tcMar>
+              <w:top w:type="dxa" w:w="70"/>
+              <w:left w:type="dxa" w:w="110"/>
+              <w:bottom w:type="dxa" w:w="70"/>
+              <w:right w:type="dxa" w:w="110"/>
+            </w:tcMar>
+          </w:tcPr>
+          <w:p>
+            <w:pPr>
+              <w:spacing w:after="20" w:before="60"/>
+            </w:pPr>
+            <w:r>
+              <w:rPr>
+                <w:rFonts w:ascii="Arial" w:cs="Arial" w:eastAsia="Arial" w:hAnsi="Arial"/>
+                <w:color w:val="808080"/>
+                <w:sz w:val="20"/>
+                <w:szCs w:val="20"/>
+              </w:rPr>
+              <w:t xml:space="preserve">__________________________________</w:t>
             </w:r>
           </w:p>
         </w:tc>
@@ -1191,7 +1253,38 @@
     </w:tbl>
     <w:p>
       <w:pPr>
-        <w:spacing w:before="120"/>
+        <w:spacing w:before="140"/>
+      </w:pPr>
+      <w:r>
+        <w:rPr>
+          <w:rFonts w:ascii="Arial" w:cs="Arial" w:eastAsia="Arial" w:hAnsi="Arial"/>
+          <w:b/>
+          <w:bCs/>
+          <w:i w:val="false"/>
+          <w:iCs w:val="false"/>
+          <w:color w:val="1F3864"/>
+          <w:sz w:val="22"/>
+          <w:szCs w:val="22"/>
+        </w:rPr>
+        <w:t xml:space="preserve">Word Bank:  </w:t>
+      </w:r>
+      <w:r>
+        <w:rPr>
+          <w:rFonts w:ascii="Arial" w:cs="Arial" w:eastAsia="Arial" w:hAnsi="Arial"/>
+          <w:b w:val="false"/>
+          <w:bCs w:val="false"/>
+          <w:i/>
+          <w:iCs/>
+          <w:color w:val="595959"/>
+          <w:sz w:val="22"/>
+          <w:szCs w:val="22"/>
+        </w:rPr>
+        <w:t xml:space="preserve">variable   •   constant   •   numerical expression   •   algebraic expression   •   term   •   coefficient   •   operation   •   evaluate</w:t>
+      </w:r>
+    </w:p>
+    <w:p>
+      <w:pPr>
+        <w:spacing w:before="100"/>
       </w:pPr>
       <w:r>
         <w:rPr>
@@ -2119,7 +2212,7 @@
                 <w:sz w:val="21"/>
                 <w:szCs w:val="21"/>
               </w:rPr>
-              <w:t xml:space="preserve">“5 less than x”  means  x – 5   (NOT 5 – x).</w:t>
+              <w:t xml:space="preserve">“8 less than n”  means  n – 8   (NOT 8 – n).</w:t>
             </w:r>
           </w:p>
           <w:p>
@@ -2133,7 +2226,7 @@
                 <w:sz w:val="21"/>
                 <w:szCs w:val="21"/>
               </w:rPr>
-              <w:t xml:space="preserve">“r subtracted from q”  means  q – r.</w:t>
+              <w:t xml:space="preserve">“b subtracted from a”  means  a – b.</w:t>
             </w:r>
           </w:p>
           <w:p>
@@ -2147,7 +2240,7 @@
                 <w:sz w:val="21"/>
                 <w:szCs w:val="21"/>
               </w:rPr>
-              <w:t xml:space="preserve">“the quotient of m and 18”  means  m ÷ 18   (the first number goes first).</w:t>
+              <w:t xml:space="preserve">“the quotient of a and b”  means  a ÷ b   (the first number named goes first).</w:t>
             </w:r>
           </w:p>
         </w:tc>
@@ -2221,7 +2314,7 @@
           <w:sz w:val="22"/>
           <w:szCs w:val="22"/>
         </w:rPr>
-        <w:t xml:space="preserve">6h  means  6 × h</w:t>
+        <w:t xml:space="preserve">4b  means  4 × b</w:t>
       </w:r>
     </w:p>
     <w:p>
@@ -2257,7 +2350,7 @@
           <w:sz w:val="22"/>
           <w:szCs w:val="22"/>
         </w:rPr>
-        <w:t xml:space="preserve">6 · h</w:t>
+        <w:t xml:space="preserve">4 · b</w:t>
       </w:r>
     </w:p>
     <w:p>
@@ -2293,7 +2386,7 @@
           <w:sz w:val="22"/>
           <w:szCs w:val="22"/>
         </w:rPr>
-        <w:t xml:space="preserve">6(h)  or  (6)(h)</w:t>
+        <w:t xml:space="preserve">4(b)  or  (4)(b)</w:t>
       </w:r>
     </w:p>
     <w:p>
@@ -2350,7 +2443,7 @@
           <w:sz w:val="22"/>
           <w:szCs w:val="22"/>
         </w:rPr>
-        <w:t xml:space="preserve">2g</w:t>
+        <w:t xml:space="preserve">5y</w:t>
       </w:r>
       <w:r>
         <w:rPr>
@@ -2363,7 +2456,7 @@
           <w:sz w:val="22"/>
           <w:szCs w:val="22"/>
         </w:rPr>
-        <w:t xml:space="preserve">, the 2 is the coefficient and means “twice g.”</w:t>
+        <w:t xml:space="preserve">, the 5 is the coefficient and means “5 times y.”</w:t>
       </w:r>
     </w:p>
     <w:p>
@@ -2437,7 +2530,7 @@
           <w:sz w:val="22"/>
           <w:szCs w:val="22"/>
         </w:rPr>
-        <w:t xml:space="preserve">62m</w:t>
+        <w:t xml:space="preserve">3n</w:t>
       </w:r>
       <w:r>
         <w:rPr>
@@ -2463,7 +2556,7 @@
           <w:sz w:val="22"/>
           <w:szCs w:val="22"/>
         </w:rPr>
-        <w:t xml:space="preserve">m = 25</w:t>
+        <w:t xml:space="preserve">n = 4</w:t>
       </w:r>
       <w:r>
         <w:rPr>
@@ -2476,7 +2569,7 @@
           <w:sz w:val="22"/>
           <w:szCs w:val="22"/>
         </w:rPr>
-        <w:t xml:space="preserve">  →  62(25) = 1550.</w:t>
+        <w:t xml:space="preserve">  →  3(4) = 12.</w:t>
       </w:r>
     </w:p>
     <w:p>
@@ -2522,362 +2615,469 @@
         <w:t xml:space="preserve">Set A — Write an algebraic expression for each word phrase.</w:t>
       </w:r>
     </w:p>
-    <w:p>
-      <w:pPr>
-        <w:spacing w:after="100" w:line="276"/>
-      </w:pPr>
-      <w:r>
-        <w:rPr>
-          <w:rFonts w:ascii="Arial" w:cs="Arial" w:eastAsia="Arial" w:hAnsi="Arial"/>
-          <w:b w:val="false"/>
-          <w:bCs w:val="false"/>
-          <w:i/>
-          <w:iCs/>
-          <w:color w:val="595959"/>
-          <w:sz w:val="22"/>
-          <w:szCs w:val="22"/>
-        </w:rPr>
-        <w:t xml:space="preserve">(The word phrase is given; write the matching expression.)</w:t>
-      </w:r>
-    </w:p>
-    <w:p>
-      <w:pPr>
-        <w:spacing w:after="40"/>
-      </w:pPr>
-      <w:r>
-        <w:rPr>
-          <w:rFonts w:ascii="Arial" w:cs="Arial" w:eastAsia="Arial" w:hAnsi="Arial"/>
-          <w:b/>
-          <w:bCs/>
-          <w:color w:val="1F3864"/>
-          <w:sz w:val="22"/>
-          <w:szCs w:val="22"/>
-        </w:rPr>
-        <w:t xml:space="preserve">1.  </w:t>
-      </w:r>
-      <w:r>
-        <w:rPr>
-          <w:rFonts w:ascii="Arial" w:cs="Arial" w:eastAsia="Arial" w:hAnsi="Arial"/>
-          <w:sz w:val="22"/>
-          <w:szCs w:val="22"/>
-        </w:rPr>
-        <w:t xml:space="preserve">12 more than x</w:t>
-      </w:r>
-    </w:p>
-    <w:p>
-      <w:pPr>
-        <w:spacing w:after="30"/>
-        <w:ind w:left="300"/>
-      </w:pPr>
-      <w:r>
-        <w:rPr>
-          <w:rFonts w:ascii="Arial" w:cs="Arial" w:eastAsia="Arial" w:hAnsi="Arial"/>
-          <w:b/>
-          <w:bCs/>
-          <w:color w:val="375623"/>
-          <w:sz w:val="21"/>
-          <w:szCs w:val="21"/>
-        </w:rPr>
-        <w:t xml:space="preserve">Expression: </w:t>
-      </w:r>
-      <w:r>
-        <w:rPr>
-          <w:rFonts w:ascii="Arial" w:cs="Arial" w:eastAsia="Arial" w:hAnsi="Arial"/>
-          <w:i w:val="false"/>
-          <w:iCs w:val="false"/>
-          <w:color w:val="000000"/>
-          <w:sz w:val="21"/>
-          <w:szCs w:val="21"/>
-        </w:rPr>
-        <w:t xml:space="preserve">x + 12</w:t>
-      </w:r>
-    </w:p>
-    <w:p>
-      <w:pPr>
-        <w:spacing w:after="30"/>
-        <w:ind w:left="300"/>
-      </w:pPr>
-      <w:r>
-        <w:rPr>
-          <w:rFonts w:ascii="Arial" w:cs="Arial" w:eastAsia="Arial" w:hAnsi="Arial"/>
-          <w:b/>
-          <w:bCs/>
-          <w:color w:val="375623"/>
-          <w:sz w:val="21"/>
-          <w:szCs w:val="21"/>
-        </w:rPr>
-        <w:t xml:space="preserve">Why: </w:t>
-      </w:r>
-      <w:r>
-        <w:rPr>
-          <w:rFonts w:ascii="Arial" w:cs="Arial" w:eastAsia="Arial" w:hAnsi="Arial"/>
-          <w:i/>
-          <w:iCs/>
-          <w:color w:val="595959"/>
-          <w:sz w:val="21"/>
-          <w:szCs w:val="21"/>
-        </w:rPr>
-        <w:t xml:space="preserve">“more than” = addition; “12 more than x” starts from x.</w:t>
-      </w:r>
-    </w:p>
-    <w:p>
-      <w:pPr>
-        <w:spacing w:after="60"/>
-      </w:pPr>
-    </w:p>
-    <w:p>
-      <w:pPr>
-        <w:spacing w:after="40"/>
-      </w:pPr>
-      <w:r>
-        <w:rPr>
-          <w:rFonts w:ascii="Arial" w:cs="Arial" w:eastAsia="Arial" w:hAnsi="Arial"/>
-          <w:b/>
-          <w:bCs/>
-          <w:color w:val="1F3864"/>
-          <w:sz w:val="22"/>
-          <w:szCs w:val="22"/>
-        </w:rPr>
-        <w:t xml:space="preserve">2.  </w:t>
-      </w:r>
-      <w:r>
-        <w:rPr>
-          <w:rFonts w:ascii="Arial" w:cs="Arial" w:eastAsia="Arial" w:hAnsi="Arial"/>
-          <w:sz w:val="22"/>
-          <w:szCs w:val="22"/>
-        </w:rPr>
-        <w:t xml:space="preserve">The quotient of m and 18</w:t>
-      </w:r>
-    </w:p>
-    <w:p>
-      <w:pPr>
-        <w:spacing w:after="30"/>
-        <w:ind w:left="300"/>
-      </w:pPr>
-      <w:r>
-        <w:rPr>
-          <w:rFonts w:ascii="Arial" w:cs="Arial" w:eastAsia="Arial" w:hAnsi="Arial"/>
-          <w:b/>
-          <w:bCs/>
-          <w:color w:val="375623"/>
-          <w:sz w:val="21"/>
-          <w:szCs w:val="21"/>
-        </w:rPr>
-        <w:t xml:space="preserve">Expression: </w:t>
-      </w:r>
-      <w:r>
-        <w:rPr>
-          <w:rFonts w:ascii="Arial" w:cs="Arial" w:eastAsia="Arial" w:hAnsi="Arial"/>
-          <w:i w:val="false"/>
-          <w:iCs w:val="false"/>
-          <w:color w:val="000000"/>
-          <w:sz w:val="21"/>
-          <w:szCs w:val="21"/>
-        </w:rPr>
-        <w:t xml:space="preserve">m ÷ 18   (also written  m/18)</w:t>
-      </w:r>
-    </w:p>
-    <w:p>
-      <w:pPr>
-        <w:spacing w:after="30"/>
-        <w:ind w:left="300"/>
-      </w:pPr>
-      <w:r>
-        <w:rPr>
-          <w:rFonts w:ascii="Arial" w:cs="Arial" w:eastAsia="Arial" w:hAnsi="Arial"/>
-          <w:b/>
-          <w:bCs/>
-          <w:color w:val="375623"/>
-          <w:sz w:val="21"/>
-          <w:szCs w:val="21"/>
-        </w:rPr>
-        <w:t xml:space="preserve">Why: </w:t>
-      </w:r>
-      <w:r>
-        <w:rPr>
-          <w:rFonts w:ascii="Arial" w:cs="Arial" w:eastAsia="Arial" w:hAnsi="Arial"/>
-          <w:i/>
-          <w:iCs/>
-          <w:color w:val="595959"/>
-          <w:sz w:val="21"/>
-          <w:szCs w:val="21"/>
-        </w:rPr>
-        <w:t xml:space="preserve">“quotient” = division; the first number named goes first.</w:t>
-      </w:r>
-    </w:p>
-    <w:p>
-      <w:pPr>
-        <w:spacing w:after="60"/>
-      </w:pPr>
-    </w:p>
-    <w:p>
-      <w:pPr>
-        <w:spacing w:after="40"/>
-      </w:pPr>
-      <w:r>
-        <w:rPr>
-          <w:rFonts w:ascii="Arial" w:cs="Arial" w:eastAsia="Arial" w:hAnsi="Arial"/>
-          <w:b/>
-          <w:bCs/>
-          <w:color w:val="1F3864"/>
-          <w:sz w:val="22"/>
-          <w:szCs w:val="22"/>
-        </w:rPr>
-        <w:t xml:space="preserve">3.  </w:t>
-      </w:r>
-      <w:r>
-        <w:rPr>
-          <w:rFonts w:ascii="Arial" w:cs="Arial" w:eastAsia="Arial" w:hAnsi="Arial"/>
-          <w:sz w:val="22"/>
-          <w:szCs w:val="22"/>
-        </w:rPr>
-        <w:t xml:space="preserve">7.9 more than the product of 6 and h</w:t>
-      </w:r>
-    </w:p>
-    <w:p>
-      <w:pPr>
-        <w:spacing w:after="30"/>
-        <w:ind w:left="300"/>
-      </w:pPr>
-      <w:r>
-        <w:rPr>
-          <w:rFonts w:ascii="Arial" w:cs="Arial" w:eastAsia="Arial" w:hAnsi="Arial"/>
-          <w:b/>
-          <w:bCs/>
-          <w:color w:val="375623"/>
-          <w:sz w:val="21"/>
-          <w:szCs w:val="21"/>
-        </w:rPr>
-        <w:t xml:space="preserve">Expression: </w:t>
-      </w:r>
-      <w:r>
-        <w:rPr>
-          <w:rFonts w:ascii="Arial" w:cs="Arial" w:eastAsia="Arial" w:hAnsi="Arial"/>
-          <w:i w:val="false"/>
-          <w:iCs w:val="false"/>
-          <w:color w:val="000000"/>
-          <w:sz w:val="21"/>
-          <w:szCs w:val="21"/>
-        </w:rPr>
-        <w:t xml:space="preserve">6h + 7.9</w:t>
-      </w:r>
-    </w:p>
-    <w:p>
-      <w:pPr>
-        <w:spacing w:after="30"/>
-        <w:ind w:left="300"/>
-      </w:pPr>
-      <w:r>
-        <w:rPr>
-          <w:rFonts w:ascii="Arial" w:cs="Arial" w:eastAsia="Arial" w:hAnsi="Arial"/>
-          <w:b/>
-          <w:bCs/>
-          <w:color w:val="375623"/>
-          <w:sz w:val="21"/>
-          <w:szCs w:val="21"/>
-        </w:rPr>
-        <w:t xml:space="preserve">Why: </w:t>
-      </w:r>
-      <w:r>
-        <w:rPr>
-          <w:rFonts w:ascii="Arial" w:cs="Arial" w:eastAsia="Arial" w:hAnsi="Arial"/>
-          <w:i/>
-          <w:iCs/>
-          <w:color w:val="595959"/>
-          <w:sz w:val="21"/>
-          <w:szCs w:val="21"/>
-        </w:rPr>
-        <w:t xml:space="preserve">“product of 6 and h” = 6h, then add 7.9.</w:t>
-      </w:r>
-    </w:p>
-    <w:p>
-      <w:pPr>
-        <w:spacing w:after="60"/>
-      </w:pPr>
-    </w:p>
-    <w:p>
-      <w:pPr>
-        <w:spacing w:after="40"/>
-      </w:pPr>
-      <w:r>
-        <w:rPr>
-          <w:rFonts w:ascii="Arial" w:cs="Arial" w:eastAsia="Arial" w:hAnsi="Arial"/>
-          <w:b/>
-          <w:bCs/>
-          <w:color w:val="1F3864"/>
-          <w:sz w:val="22"/>
-          <w:szCs w:val="22"/>
-        </w:rPr>
-        <w:t xml:space="preserve">4.  </w:t>
-      </w:r>
-      <w:r>
-        <w:rPr>
-          <w:rFonts w:ascii="Arial" w:cs="Arial" w:eastAsia="Arial" w:hAnsi="Arial"/>
-          <w:sz w:val="22"/>
-          <w:szCs w:val="22"/>
-        </w:rPr>
-        <w:t xml:space="preserve">25 more than twice a number, g</w:t>
-      </w:r>
-    </w:p>
-    <w:p>
-      <w:pPr>
-        <w:spacing w:after="30"/>
-        <w:ind w:left="300"/>
-      </w:pPr>
-      <w:r>
-        <w:rPr>
-          <w:rFonts w:ascii="Arial" w:cs="Arial" w:eastAsia="Arial" w:hAnsi="Arial"/>
-          <w:b/>
-          <w:bCs/>
-          <w:color w:val="375623"/>
-          <w:sz w:val="21"/>
-          <w:szCs w:val="21"/>
-        </w:rPr>
-        <w:t xml:space="preserve">Expression: </w:t>
-      </w:r>
-      <w:r>
-        <w:rPr>
-          <w:rFonts w:ascii="Arial" w:cs="Arial" w:eastAsia="Arial" w:hAnsi="Arial"/>
-          <w:i w:val="false"/>
-          <w:iCs w:val="false"/>
-          <w:color w:val="000000"/>
-          <w:sz w:val="21"/>
-          <w:szCs w:val="21"/>
-        </w:rPr>
-        <w:t xml:space="preserve">2g + 25</w:t>
-      </w:r>
-    </w:p>
-    <w:p>
-      <w:pPr>
-        <w:spacing w:after="30"/>
-        <w:ind w:left="300"/>
-      </w:pPr>
-      <w:r>
-        <w:rPr>
-          <w:rFonts w:ascii="Arial" w:cs="Arial" w:eastAsia="Arial" w:hAnsi="Arial"/>
-          <w:b/>
-          <w:bCs/>
-          <w:color w:val="375623"/>
-          <w:sz w:val="21"/>
-          <w:szCs w:val="21"/>
-        </w:rPr>
-        <w:t xml:space="preserve">Why: </w:t>
-      </w:r>
-      <w:r>
-        <w:rPr>
-          <w:rFonts w:ascii="Arial" w:cs="Arial" w:eastAsia="Arial" w:hAnsi="Arial"/>
-          <w:i/>
-          <w:iCs/>
-          <w:color w:val="595959"/>
-          <w:sz w:val="21"/>
-          <w:szCs w:val="21"/>
-        </w:rPr>
-        <w:t xml:space="preserve">“twice a number g” = 2g, then 25 more.</w:t>
-      </w:r>
-    </w:p>
-    <w:p>
-      <w:pPr>
-        <w:spacing w:after="60"/>
+    <w:tbl>
+      <w:tblPr>
+        <w:tblW w:type="dxa" w:w="9360"/>
+        <w:tblBorders>
+          <w:top w:val="single" w:color="BFBFBF" w:sz="4"/>
+          <w:left w:val="single" w:color="BFBFBF" w:sz="4"/>
+          <w:bottom w:val="single" w:color="BFBFBF" w:sz="4"/>
+          <w:right w:val="single" w:color="BFBFBF" w:sz="4"/>
+          <w:insideH w:val="single" w:color="D9D9D9" w:sz="4"/>
+          <w:insideV w:val="single" w:color="D9D9D9" w:sz="4"/>
+        </w:tblBorders>
+      </w:tblPr>
+      <w:tblGrid>
+        <w:gridCol w:w="640"/>
+        <w:gridCol w:w="5360"/>
+        <w:gridCol w:w="3360"/>
+      </w:tblGrid>
+      <w:tr>
+        <w:trPr>
+          <w:tblHeader/>
+        </w:trPr>
+        <w:tc>
+          <w:tcPr>
+            <w:tcW w:type="dxa" w:w="640"/>
+            <w:shd w:fill="DEEAF6" w:val="clear"/>
+            <w:tcMar>
+              <w:top w:type="dxa" w:w="70"/>
+              <w:left w:type="dxa" w:w="110"/>
+              <w:bottom w:type="dxa" w:w="70"/>
+              <w:right w:type="dxa" w:w="110"/>
+            </w:tcMar>
+          </w:tcPr>
+          <w:p>
+            <w:pPr>
+              <w:jc w:val="center"/>
+            </w:pPr>
+            <w:r>
+              <w:rPr>
+                <w:rFonts w:ascii="Arial" w:cs="Arial" w:eastAsia="Arial" w:hAnsi="Arial"/>
+                <w:b/>
+                <w:bCs/>
+                <w:color w:val="1F3864"/>
+                <w:sz w:val="21"/>
+                <w:szCs w:val="21"/>
+              </w:rPr>
+              <w:t xml:space="preserve">#</w:t>
+            </w:r>
+          </w:p>
+        </w:tc>
+        <w:tc>
+          <w:tcPr>
+            <w:tcW w:type="dxa" w:w="5360"/>
+            <w:shd w:fill="DEEAF6" w:val="clear"/>
+            <w:tcMar>
+              <w:top w:type="dxa" w:w="70"/>
+              <w:left w:type="dxa" w:w="110"/>
+              <w:bottom w:type="dxa" w:w="70"/>
+              <w:right w:type="dxa" w:w="110"/>
+            </w:tcMar>
+          </w:tcPr>
+          <w:p>
+            <w:r>
+              <w:rPr>
+                <w:rFonts w:ascii="Arial" w:cs="Arial" w:eastAsia="Arial" w:hAnsi="Arial"/>
+                <w:b/>
+                <w:bCs/>
+                <w:color w:val="1F3864"/>
+                <w:sz w:val="21"/>
+                <w:szCs w:val="21"/>
+              </w:rPr>
+              <w:t xml:space="preserve">Word Phrase</w:t>
+            </w:r>
+          </w:p>
+        </w:tc>
+        <w:tc>
+          <w:tcPr>
+            <w:tcW w:type="dxa" w:w="3360"/>
+            <w:shd w:fill="DEEAF6" w:val="clear"/>
+            <w:tcMar>
+              <w:top w:type="dxa" w:w="70"/>
+              <w:left w:type="dxa" w:w="110"/>
+              <w:bottom w:type="dxa" w:w="70"/>
+              <w:right w:type="dxa" w:w="110"/>
+            </w:tcMar>
+          </w:tcPr>
+          <w:p>
+            <w:pPr>
+              <w:jc w:val="center"/>
+            </w:pPr>
+            <w:r>
+              <w:rPr>
+                <w:rFonts w:ascii="Arial" w:cs="Arial" w:eastAsia="Arial" w:hAnsi="Arial"/>
+                <w:b/>
+                <w:bCs/>
+                <w:color w:val="1F3864"/>
+                <w:sz w:val="21"/>
+                <w:szCs w:val="21"/>
+              </w:rPr>
+              <w:t xml:space="preserve">Algebraic Expression</w:t>
+            </w:r>
+          </w:p>
+        </w:tc>
+      </w:tr>
+      <w:tr>
+        <w:trPr>
+          <w:trHeight w:val="560" w:hRule="atLeast"/>
+        </w:trPr>
+        <w:tc>
+          <w:tcPr>
+            <w:tcW w:type="dxa" w:w="640"/>
+            <w:tcMar>
+              <w:top w:type="dxa" w:w="70"/>
+              <w:left w:type="dxa" w:w="110"/>
+              <w:bottom w:type="dxa" w:w="70"/>
+              <w:right w:type="dxa" w:w="110"/>
+            </w:tcMar>
+          </w:tcPr>
+          <w:p>
+            <w:pPr>
+              <w:jc w:val="center"/>
+            </w:pPr>
+            <w:r>
+              <w:rPr>
+                <w:rFonts w:ascii="Arial" w:cs="Arial" w:eastAsia="Arial" w:hAnsi="Arial"/>
+                <w:b/>
+                <w:bCs/>
+                <w:color w:val="000000"/>
+                <w:sz w:val="21"/>
+                <w:szCs w:val="21"/>
+              </w:rPr>
+              <w:t xml:space="preserve">1</w:t>
+            </w:r>
+          </w:p>
+        </w:tc>
+        <w:tc>
+          <w:tcPr>
+            <w:tcW w:type="dxa" w:w="5360"/>
+            <w:tcMar>
+              <w:top w:type="dxa" w:w="70"/>
+              <w:left w:type="dxa" w:w="110"/>
+              <w:bottom w:type="dxa" w:w="70"/>
+              <w:right w:type="dxa" w:w="110"/>
+            </w:tcMar>
+          </w:tcPr>
+          <w:p>
+            <w:r>
+              <w:rPr>
+                <w:rFonts w:ascii="Arial" w:cs="Arial" w:eastAsia="Arial" w:hAnsi="Arial"/>
+                <w:b/>
+                <w:bCs/>
+                <w:color w:val="1F3864"/>
+                <w:sz w:val="21"/>
+                <w:szCs w:val="21"/>
+              </w:rPr>
+              <w:t xml:space="preserve">  </w:t>
+            </w:r>
+            <w:r>
+              <w:rPr>
+                <w:rFonts w:ascii="Arial" w:cs="Arial" w:eastAsia="Arial" w:hAnsi="Arial"/>
+                <w:sz w:val="21"/>
+                <w:szCs w:val="21"/>
+              </w:rPr>
+              <w:t xml:space="preserve">12 more than x</w:t>
+            </w:r>
+          </w:p>
+        </w:tc>
+        <w:tc>
+          <w:tcPr>
+            <w:tcW w:type="dxa" w:w="3360"/>
+            <w:tcMar>
+              <w:top w:type="dxa" w:w="70"/>
+              <w:left w:type="dxa" w:w="110"/>
+              <w:bottom w:type="dxa" w:w="70"/>
+              <w:right w:type="dxa" w:w="110"/>
+            </w:tcMar>
+          </w:tcPr>
+          <w:p>
+            <w:pPr>
+              <w:spacing w:after="20" w:before="60"/>
+            </w:pPr>
+            <w:r>
+              <w:rPr>
+                <w:rFonts w:ascii="Arial" w:cs="Arial" w:eastAsia="Arial" w:hAnsi="Arial"/>
+                <w:color w:val="808080"/>
+                <w:sz w:val="20"/>
+                <w:szCs w:val="20"/>
+              </w:rPr>
+              <w:t xml:space="preserve">__________________________________</w:t>
+            </w:r>
+          </w:p>
+        </w:tc>
+      </w:tr>
+      <w:tr>
+        <w:trPr>
+          <w:trHeight w:val="560" w:hRule="atLeast"/>
+        </w:trPr>
+        <w:tc>
+          <w:tcPr>
+            <w:tcW w:type="dxa" w:w="640"/>
+            <w:tcMar>
+              <w:top w:type="dxa" w:w="70"/>
+              <w:left w:type="dxa" w:w="110"/>
+              <w:bottom w:type="dxa" w:w="70"/>
+              <w:right w:type="dxa" w:w="110"/>
+            </w:tcMar>
+          </w:tcPr>
+          <w:p>
+            <w:pPr>
+              <w:jc w:val="center"/>
+            </w:pPr>
+            <w:r>
+              <w:rPr>
+                <w:rFonts w:ascii="Arial" w:cs="Arial" w:eastAsia="Arial" w:hAnsi="Arial"/>
+                <w:b/>
+                <w:bCs/>
+                <w:color w:val="000000"/>
+                <w:sz w:val="21"/>
+                <w:szCs w:val="21"/>
+              </w:rPr>
+              <w:t xml:space="preserve">2</w:t>
+            </w:r>
+          </w:p>
+        </w:tc>
+        <w:tc>
+          <w:tcPr>
+            <w:tcW w:type="dxa" w:w="5360"/>
+            <w:tcMar>
+              <w:top w:type="dxa" w:w="70"/>
+              <w:left w:type="dxa" w:w="110"/>
+              <w:bottom w:type="dxa" w:w="70"/>
+              <w:right w:type="dxa" w:w="110"/>
+            </w:tcMar>
+          </w:tcPr>
+          <w:p>
+            <w:r>
+              <w:rPr>
+                <w:rFonts w:ascii="Arial" w:cs="Arial" w:eastAsia="Arial" w:hAnsi="Arial"/>
+                <w:b/>
+                <w:bCs/>
+                <w:color w:val="1F3864"/>
+                <w:sz w:val="21"/>
+                <w:szCs w:val="21"/>
+              </w:rPr>
+              <w:t xml:space="preserve">  </w:t>
+            </w:r>
+            <w:r>
+              <w:rPr>
+                <w:rFonts w:ascii="Arial" w:cs="Arial" w:eastAsia="Arial" w:hAnsi="Arial"/>
+                <w:sz w:val="21"/>
+                <w:szCs w:val="21"/>
+              </w:rPr>
+              <w:t xml:space="preserve">The quotient of m and 18</w:t>
+            </w:r>
+          </w:p>
+        </w:tc>
+        <w:tc>
+          <w:tcPr>
+            <w:tcW w:type="dxa" w:w="3360"/>
+            <w:tcMar>
+              <w:top w:type="dxa" w:w="70"/>
+              <w:left w:type="dxa" w:w="110"/>
+              <w:bottom w:type="dxa" w:w="70"/>
+              <w:right w:type="dxa" w:w="110"/>
+            </w:tcMar>
+          </w:tcPr>
+          <w:p>
+            <w:pPr>
+              <w:spacing w:after="20" w:before="60"/>
+            </w:pPr>
+            <w:r>
+              <w:rPr>
+                <w:rFonts w:ascii="Arial" w:cs="Arial" w:eastAsia="Arial" w:hAnsi="Arial"/>
+                <w:color w:val="808080"/>
+                <w:sz w:val="20"/>
+                <w:szCs w:val="20"/>
+              </w:rPr>
+              <w:t xml:space="preserve">__________________________________</w:t>
+            </w:r>
+          </w:p>
+        </w:tc>
+      </w:tr>
+      <w:tr>
+        <w:trPr>
+          <w:trHeight w:val="560" w:hRule="atLeast"/>
+        </w:trPr>
+        <w:tc>
+          <w:tcPr>
+            <w:tcW w:type="dxa" w:w="640"/>
+            <w:tcMar>
+              <w:top w:type="dxa" w:w="70"/>
+              <w:left w:type="dxa" w:w="110"/>
+              <w:bottom w:type="dxa" w:w="70"/>
+              <w:right w:type="dxa" w:w="110"/>
+            </w:tcMar>
+          </w:tcPr>
+          <w:p>
+            <w:pPr>
+              <w:jc w:val="center"/>
+            </w:pPr>
+            <w:r>
+              <w:rPr>
+                <w:rFonts w:ascii="Arial" w:cs="Arial" w:eastAsia="Arial" w:hAnsi="Arial"/>
+                <w:b/>
+                <w:bCs/>
+                <w:color w:val="000000"/>
+                <w:sz w:val="21"/>
+                <w:szCs w:val="21"/>
+              </w:rPr>
+              <w:t xml:space="preserve">3</w:t>
+            </w:r>
+          </w:p>
+        </w:tc>
+        <w:tc>
+          <w:tcPr>
+            <w:tcW w:type="dxa" w:w="5360"/>
+            <w:tcMar>
+              <w:top w:type="dxa" w:w="70"/>
+              <w:left w:type="dxa" w:w="110"/>
+              <w:bottom w:type="dxa" w:w="70"/>
+              <w:right w:type="dxa" w:w="110"/>
+            </w:tcMar>
+          </w:tcPr>
+          <w:p>
+            <w:r>
+              <w:rPr>
+                <w:rFonts w:ascii="Arial" w:cs="Arial" w:eastAsia="Arial" w:hAnsi="Arial"/>
+                <w:b/>
+                <w:bCs/>
+                <w:color w:val="1F3864"/>
+                <w:sz w:val="21"/>
+                <w:szCs w:val="21"/>
+              </w:rPr>
+              <w:t xml:space="preserve">  </w:t>
+            </w:r>
+            <w:r>
+              <w:rPr>
+                <w:rFonts w:ascii="Arial" w:cs="Arial" w:eastAsia="Arial" w:hAnsi="Arial"/>
+                <w:sz w:val="21"/>
+                <w:szCs w:val="21"/>
+              </w:rPr>
+              <w:t xml:space="preserve">7.9 more than the product of 6 and h</w:t>
+            </w:r>
+          </w:p>
+        </w:tc>
+        <w:tc>
+          <w:tcPr>
+            <w:tcW w:type="dxa" w:w="3360"/>
+            <w:tcMar>
+              <w:top w:type="dxa" w:w="70"/>
+              <w:left w:type="dxa" w:w="110"/>
+              <w:bottom w:type="dxa" w:w="70"/>
+              <w:right w:type="dxa" w:w="110"/>
+            </w:tcMar>
+          </w:tcPr>
+          <w:p>
+            <w:pPr>
+              <w:spacing w:after="20" w:before="60"/>
+            </w:pPr>
+            <w:r>
+              <w:rPr>
+                <w:rFonts w:ascii="Arial" w:cs="Arial" w:eastAsia="Arial" w:hAnsi="Arial"/>
+                <w:color w:val="808080"/>
+                <w:sz w:val="20"/>
+                <w:szCs w:val="20"/>
+              </w:rPr>
+              <w:t xml:space="preserve">__________________________________</w:t>
+            </w:r>
+          </w:p>
+        </w:tc>
+      </w:tr>
+      <w:tr>
+        <w:trPr>
+          <w:trHeight w:val="560" w:hRule="atLeast"/>
+        </w:trPr>
+        <w:tc>
+          <w:tcPr>
+            <w:tcW w:type="dxa" w:w="640"/>
+            <w:tcMar>
+              <w:top w:type="dxa" w:w="70"/>
+              <w:left w:type="dxa" w:w="110"/>
+              <w:bottom w:type="dxa" w:w="70"/>
+              <w:right w:type="dxa" w:w="110"/>
+            </w:tcMar>
+          </w:tcPr>
+          <w:p>
+            <w:pPr>
+              <w:jc w:val="center"/>
+            </w:pPr>
+            <w:r>
+              <w:rPr>
+                <w:rFonts w:ascii="Arial" w:cs="Arial" w:eastAsia="Arial" w:hAnsi="Arial"/>
+                <w:b/>
+                <w:bCs/>
+                <w:color w:val="000000"/>
+                <w:sz w:val="21"/>
+                <w:szCs w:val="21"/>
+              </w:rPr>
+              <w:t xml:space="preserve">4</w:t>
+            </w:r>
+          </w:p>
+        </w:tc>
+        <w:tc>
+          <w:tcPr>
+            <w:tcW w:type="dxa" w:w="5360"/>
+            <w:tcMar>
+              <w:top w:type="dxa" w:w="70"/>
+              <w:left w:type="dxa" w:w="110"/>
+              <w:bottom w:type="dxa" w:w="70"/>
+              <w:right w:type="dxa" w:w="110"/>
+            </w:tcMar>
+          </w:tcPr>
+          <w:p>
+            <w:r>
+              <w:rPr>
+                <w:rFonts w:ascii="Arial" w:cs="Arial" w:eastAsia="Arial" w:hAnsi="Arial"/>
+                <w:b/>
+                <w:bCs/>
+                <w:color w:val="1F3864"/>
+                <w:sz w:val="21"/>
+                <w:szCs w:val="21"/>
+              </w:rPr>
+              <w:t xml:space="preserve">  </w:t>
+            </w:r>
+            <w:r>
+              <w:rPr>
+                <w:rFonts w:ascii="Arial" w:cs="Arial" w:eastAsia="Arial" w:hAnsi="Arial"/>
+                <w:sz w:val="21"/>
+                <w:szCs w:val="21"/>
+              </w:rPr>
+              <w:t xml:space="preserve">25 more than twice a number, g</w:t>
+            </w:r>
+          </w:p>
+        </w:tc>
+        <w:tc>
+          <w:tcPr>
+            <w:tcW w:type="dxa" w:w="3360"/>
+            <w:tcMar>
+              <w:top w:type="dxa" w:w="70"/>
+              <w:left w:type="dxa" w:w="110"/>
+              <w:bottom w:type="dxa" w:w="70"/>
+              <w:right w:type="dxa" w:w="110"/>
+            </w:tcMar>
+          </w:tcPr>
+          <w:p>
+            <w:pPr>
+              <w:spacing w:after="20" w:before="60"/>
+            </w:pPr>
+            <w:r>
+              <w:rPr>
+                <w:rFonts w:ascii="Arial" w:cs="Arial" w:eastAsia="Arial" w:hAnsi="Arial"/>
+                <w:color w:val="808080"/>
+                <w:sz w:val="20"/>
+                <w:szCs w:val="20"/>
+              </w:rPr>
+              <w:t xml:space="preserve">__________________________________</w:t>
+            </w:r>
+          </w:p>
+        </w:tc>
+      </w:tr>
+    </w:tbl>
+    <w:p>
+      <w:pPr>
+        <w:spacing w:before="160"/>
       </w:pPr>
     </w:p>
     <w:p>
@@ -2897,312 +3097,596 @@
         <w:t xml:space="preserve">Set B — Give two ways to write each algebraic expression in words.</w:t>
       </w:r>
     </w:p>
-    <w:p>
-      <w:pPr>
-        <w:spacing w:after="30"/>
-      </w:pPr>
-      <w:r>
-        <w:rPr>
-          <w:rFonts w:ascii="Arial" w:cs="Arial" w:eastAsia="Arial" w:hAnsi="Arial"/>
-          <w:b/>
-          <w:bCs/>
-          <w:color w:val="1F3864"/>
-          <w:sz w:val="22"/>
-          <w:szCs w:val="22"/>
-        </w:rPr>
-        <w:t xml:space="preserve">5.  </w:t>
-      </w:r>
-      <w:r>
-        <w:rPr>
-          <w:rFonts w:ascii="Arial" w:cs="Arial" w:eastAsia="Arial" w:hAnsi="Arial"/>
-          <w:b/>
-          <w:bCs/>
-          <w:sz w:val="22"/>
-          <w:szCs w:val="22"/>
-        </w:rPr>
-        <w:t xml:space="preserve">9 + r</w:t>
-      </w:r>
-    </w:p>
-    <w:p>
-      <w:pPr>
-        <w:spacing w:after="20"/>
-        <w:ind w:left="300"/>
-      </w:pPr>
-      <w:r>
-        <w:rPr>
-          <w:rFonts w:ascii="Arial" w:cs="Arial" w:eastAsia="Arial" w:hAnsi="Arial"/>
-          <w:color w:val="2E74B5"/>
-          <w:sz w:val="21"/>
-          <w:szCs w:val="21"/>
-        </w:rPr>
-        <w:t xml:space="preserve">•  </w:t>
-      </w:r>
-      <w:r>
-        <w:rPr>
-          <w:rFonts w:ascii="Arial" w:cs="Arial" w:eastAsia="Arial" w:hAnsi="Arial"/>
-          <w:sz w:val="21"/>
-          <w:szCs w:val="21"/>
-        </w:rPr>
-        <w:t xml:space="preserve">“9 plus r ”</w:t>
-      </w:r>
-    </w:p>
-    <w:p>
-      <w:pPr>
-        <w:spacing w:after="20"/>
-        <w:ind w:left="300"/>
-      </w:pPr>
-      <w:r>
-        <w:rPr>
-          <w:rFonts w:ascii="Arial" w:cs="Arial" w:eastAsia="Arial" w:hAnsi="Arial"/>
-          <w:color w:val="2E74B5"/>
-          <w:sz w:val="21"/>
-          <w:szCs w:val="21"/>
-        </w:rPr>
-        <w:t xml:space="preserve">•  </w:t>
-      </w:r>
-      <w:r>
-        <w:rPr>
-          <w:rFonts w:ascii="Arial" w:cs="Arial" w:eastAsia="Arial" w:hAnsi="Arial"/>
-          <w:sz w:val="21"/>
-          <w:szCs w:val="21"/>
-        </w:rPr>
-        <w:t xml:space="preserve">“the sum of 9 and r ”   (also: “r more than 9”)</w:t>
-      </w:r>
-    </w:p>
-    <w:p>
-      <w:pPr>
-        <w:spacing w:after="60"/>
-      </w:pPr>
-    </w:p>
-    <w:p>
-      <w:pPr>
-        <w:spacing w:after="30"/>
-      </w:pPr>
-      <w:r>
-        <w:rPr>
-          <w:rFonts w:ascii="Arial" w:cs="Arial" w:eastAsia="Arial" w:hAnsi="Arial"/>
-          <w:b/>
-          <w:bCs/>
-          <w:color w:val="1F3864"/>
-          <w:sz w:val="22"/>
-          <w:szCs w:val="22"/>
-        </w:rPr>
-        <w:t xml:space="preserve">6.  </w:t>
-      </w:r>
-      <w:r>
-        <w:rPr>
-          <w:rFonts w:ascii="Arial" w:cs="Arial" w:eastAsia="Arial" w:hAnsi="Arial"/>
-          <w:b/>
-          <w:bCs/>
-          <w:sz w:val="22"/>
-          <w:szCs w:val="22"/>
-        </w:rPr>
-        <w:t xml:space="preserve">q – r</w:t>
-      </w:r>
-    </w:p>
-    <w:p>
-      <w:pPr>
-        <w:spacing w:after="20"/>
-        <w:ind w:left="300"/>
-      </w:pPr>
-      <w:r>
-        <w:rPr>
-          <w:rFonts w:ascii="Arial" w:cs="Arial" w:eastAsia="Arial" w:hAnsi="Arial"/>
-          <w:color w:val="2E74B5"/>
-          <w:sz w:val="21"/>
-          <w:szCs w:val="21"/>
-        </w:rPr>
-        <w:t xml:space="preserve">•  </w:t>
-      </w:r>
-      <w:r>
-        <w:rPr>
-          <w:rFonts w:ascii="Arial" w:cs="Arial" w:eastAsia="Arial" w:hAnsi="Arial"/>
-          <w:sz w:val="21"/>
-          <w:szCs w:val="21"/>
-        </w:rPr>
-        <w:t xml:space="preserve">“q minus r ”</w:t>
-      </w:r>
-    </w:p>
-    <w:p>
-      <w:pPr>
-        <w:spacing w:after="20"/>
-        <w:ind w:left="300"/>
-      </w:pPr>
-      <w:r>
-        <w:rPr>
-          <w:rFonts w:ascii="Arial" w:cs="Arial" w:eastAsia="Arial" w:hAnsi="Arial"/>
-          <w:color w:val="2E74B5"/>
-          <w:sz w:val="21"/>
-          <w:szCs w:val="21"/>
-        </w:rPr>
-        <w:t xml:space="preserve">•  </w:t>
-      </w:r>
-      <w:r>
-        <w:rPr>
-          <w:rFonts w:ascii="Arial" w:cs="Arial" w:eastAsia="Arial" w:hAnsi="Arial"/>
-          <w:sz w:val="21"/>
-          <w:szCs w:val="21"/>
-        </w:rPr>
-        <w:t xml:space="preserve">“the difference of q and r ”   (also: “r less than q”)</w:t>
-      </w:r>
-    </w:p>
-    <w:p>
-      <w:pPr>
-        <w:spacing w:after="60"/>
-      </w:pPr>
-    </w:p>
-    <w:p>
-      <w:pPr>
-        <w:spacing w:after="30"/>
-      </w:pPr>
-      <w:r>
-        <w:rPr>
-          <w:rFonts w:ascii="Arial" w:cs="Arial" w:eastAsia="Arial" w:hAnsi="Arial"/>
-          <w:b/>
-          <w:bCs/>
-          <w:color w:val="1F3864"/>
-          <w:sz w:val="22"/>
-          <w:szCs w:val="22"/>
-        </w:rPr>
-        <w:t xml:space="preserve">7.  </w:t>
-      </w:r>
-      <w:r>
-        <w:rPr>
-          <w:rFonts w:ascii="Arial" w:cs="Arial" w:eastAsia="Arial" w:hAnsi="Arial"/>
-          <w:b/>
-          <w:bCs/>
-          <w:sz w:val="22"/>
-          <w:szCs w:val="22"/>
-        </w:rPr>
-        <w:t xml:space="preserve">7m + 5</w:t>
-      </w:r>
-    </w:p>
-    <w:p>
-      <w:pPr>
-        <w:spacing w:after="20"/>
-        <w:ind w:left="300"/>
-      </w:pPr>
-      <w:r>
-        <w:rPr>
-          <w:rFonts w:ascii="Arial" w:cs="Arial" w:eastAsia="Arial" w:hAnsi="Arial"/>
-          <w:color w:val="2E74B5"/>
-          <w:sz w:val="21"/>
-          <w:szCs w:val="21"/>
-        </w:rPr>
-        <w:t xml:space="preserve">•  </w:t>
-      </w:r>
-      <w:r>
-        <w:rPr>
-          <w:rFonts w:ascii="Arial" w:cs="Arial" w:eastAsia="Arial" w:hAnsi="Arial"/>
-          <w:sz w:val="21"/>
-          <w:szCs w:val="21"/>
-        </w:rPr>
-        <w:t xml:space="preserve">“5 more than the product of 7 and m ”</w:t>
-      </w:r>
-    </w:p>
-    <w:p>
-      <w:pPr>
-        <w:spacing w:after="20"/>
-        <w:ind w:left="300"/>
-      </w:pPr>
-      <w:r>
-        <w:rPr>
-          <w:rFonts w:ascii="Arial" w:cs="Arial" w:eastAsia="Arial" w:hAnsi="Arial"/>
-          <w:color w:val="2E74B5"/>
-          <w:sz w:val="21"/>
-          <w:szCs w:val="21"/>
-        </w:rPr>
-        <w:t xml:space="preserve">•  </w:t>
-      </w:r>
-      <w:r>
-        <w:rPr>
-          <w:rFonts w:ascii="Arial" w:cs="Arial" w:eastAsia="Arial" w:hAnsi="Arial"/>
-          <w:sz w:val="21"/>
-          <w:szCs w:val="21"/>
-        </w:rPr>
-        <w:t xml:space="preserve">“the product of 7 and m, increased by 5 ”</w:t>
-      </w:r>
-    </w:p>
-    <w:p>
-      <w:pPr>
-        <w:spacing w:after="60"/>
-      </w:pPr>
-    </w:p>
-    <w:p>
-      <w:pPr>
-        <w:spacing w:after="30"/>
-      </w:pPr>
-      <w:r>
-        <w:rPr>
-          <w:rFonts w:ascii="Arial" w:cs="Arial" w:eastAsia="Arial" w:hAnsi="Arial"/>
-          <w:b/>
-          <w:bCs/>
-          <w:color w:val="1F3864"/>
-          <w:sz w:val="22"/>
-          <w:szCs w:val="22"/>
-        </w:rPr>
-        <w:t xml:space="preserve">8.  </w:t>
-      </w:r>
-      <w:r>
-        <w:rPr>
-          <w:rFonts w:ascii="Arial" w:cs="Arial" w:eastAsia="Arial" w:hAnsi="Arial"/>
-          <w:b/>
-          <w:bCs/>
-          <w:sz w:val="22"/>
-          <w:szCs w:val="22"/>
-        </w:rPr>
-        <w:t xml:space="preserve">2j ÷ 6</w:t>
-      </w:r>
-    </w:p>
-    <w:p>
-      <w:pPr>
-        <w:spacing w:after="20"/>
-        <w:ind w:left="300"/>
-      </w:pPr>
-      <w:r>
-        <w:rPr>
-          <w:rFonts w:ascii="Arial" w:cs="Arial" w:eastAsia="Arial" w:hAnsi="Arial"/>
-          <w:color w:val="2E74B5"/>
-          <w:sz w:val="21"/>
-          <w:szCs w:val="21"/>
-        </w:rPr>
-        <w:t xml:space="preserve">•  </w:t>
-      </w:r>
-      <w:r>
-        <w:rPr>
-          <w:rFonts w:ascii="Arial" w:cs="Arial" w:eastAsia="Arial" w:hAnsi="Arial"/>
-          <w:sz w:val="21"/>
-          <w:szCs w:val="21"/>
-        </w:rPr>
-        <w:t xml:space="preserve">“the quotient of 2j and 6 ”</w:t>
-      </w:r>
-    </w:p>
-    <w:p>
-      <w:pPr>
-        <w:spacing w:after="20"/>
-        <w:ind w:left="300"/>
-      </w:pPr>
-      <w:r>
-        <w:rPr>
-          <w:rFonts w:ascii="Arial" w:cs="Arial" w:eastAsia="Arial" w:hAnsi="Arial"/>
-          <w:color w:val="2E74B5"/>
-          <w:sz w:val="21"/>
-          <w:szCs w:val="21"/>
-        </w:rPr>
-        <w:t xml:space="preserve">•  </w:t>
-      </w:r>
-      <w:r>
-        <w:rPr>
-          <w:rFonts w:ascii="Arial" w:cs="Arial" w:eastAsia="Arial" w:hAnsi="Arial"/>
-          <w:sz w:val="21"/>
-          <w:szCs w:val="21"/>
-        </w:rPr>
-        <w:t xml:space="preserve">“the product of 2 and j, divided by 6 ”</w:t>
-      </w:r>
-    </w:p>
-    <w:p>
-      <w:pPr>
-        <w:spacing w:after="60"/>
+    <w:tbl>
+      <w:tblPr>
+        <w:tblW w:type="dxa" w:w="9360"/>
+        <w:tblBorders>
+          <w:top w:val="single" w:color="BFBFBF" w:sz="4"/>
+          <w:left w:val="single" w:color="BFBFBF" w:sz="4"/>
+          <w:bottom w:val="single" w:color="BFBFBF" w:sz="4"/>
+          <w:right w:val="single" w:color="BFBFBF" w:sz="4"/>
+          <w:insideH w:val="single" w:color="D9D9D9" w:sz="4"/>
+          <w:insideV w:val="single" w:color="D9D9D9" w:sz="4"/>
+        </w:tblBorders>
+      </w:tblPr>
+      <w:tblGrid>
+        <w:gridCol w:w="640"/>
+        <w:gridCol w:w="1900"/>
+        <w:gridCol w:w="6820"/>
+      </w:tblGrid>
+      <w:tr>
+        <w:trPr>
+          <w:tblHeader/>
+        </w:trPr>
+        <w:tc>
+          <w:tcPr>
+            <w:tcW w:type="dxa" w:w="640"/>
+            <w:shd w:fill="DEEAF6" w:val="clear"/>
+            <w:tcMar>
+              <w:top w:type="dxa" w:w="70"/>
+              <w:left w:type="dxa" w:w="110"/>
+              <w:bottom w:type="dxa" w:w="70"/>
+              <w:right w:type="dxa" w:w="110"/>
+            </w:tcMar>
+          </w:tcPr>
+          <w:p>
+            <w:pPr>
+              <w:jc w:val="center"/>
+            </w:pPr>
+            <w:r>
+              <w:rPr>
+                <w:rFonts w:ascii="Arial" w:cs="Arial" w:eastAsia="Arial" w:hAnsi="Arial"/>
+                <w:b/>
+                <w:bCs/>
+                <w:color w:val="1F3864"/>
+                <w:sz w:val="21"/>
+                <w:szCs w:val="21"/>
+              </w:rPr>
+              <w:t xml:space="preserve">#</w:t>
+            </w:r>
+          </w:p>
+        </w:tc>
+        <w:tc>
+          <w:tcPr>
+            <w:tcW w:type="dxa" w:w="1900"/>
+            <w:shd w:fill="DEEAF6" w:val="clear"/>
+            <w:tcMar>
+              <w:top w:type="dxa" w:w="70"/>
+              <w:left w:type="dxa" w:w="110"/>
+              <w:bottom w:type="dxa" w:w="70"/>
+              <w:right w:type="dxa" w:w="110"/>
+            </w:tcMar>
+          </w:tcPr>
+          <w:p>
+            <w:pPr>
+              <w:jc w:val="center"/>
+            </w:pPr>
+            <w:r>
+              <w:rPr>
+                <w:rFonts w:ascii="Arial" w:cs="Arial" w:eastAsia="Arial" w:hAnsi="Arial"/>
+                <w:b/>
+                <w:bCs/>
+                <w:color w:val="1F3864"/>
+                <w:sz w:val="21"/>
+                <w:szCs w:val="21"/>
+              </w:rPr>
+              <w:t xml:space="preserve">Expression</w:t>
+            </w:r>
+          </w:p>
+        </w:tc>
+        <w:tc>
+          <w:tcPr>
+            <w:tcW w:type="dxa" w:w="6820"/>
+            <w:shd w:fill="DEEAF6" w:val="clear"/>
+            <w:tcMar>
+              <w:top w:type="dxa" w:w="70"/>
+              <w:left w:type="dxa" w:w="110"/>
+              <w:bottom w:type="dxa" w:w="70"/>
+              <w:right w:type="dxa" w:w="110"/>
+            </w:tcMar>
+          </w:tcPr>
+          <w:p>
+            <w:pPr>
+              <w:jc w:val="center"/>
+            </w:pPr>
+            <w:r>
+              <w:rPr>
+                <w:rFonts w:ascii="Arial" w:cs="Arial" w:eastAsia="Arial" w:hAnsi="Arial"/>
+                <w:b/>
+                <w:bCs/>
+                <w:color w:val="1F3864"/>
+                <w:sz w:val="21"/>
+                <w:szCs w:val="21"/>
+              </w:rPr>
+              <w:t xml:space="preserve">Two Ways to Write It in Words</w:t>
+            </w:r>
+          </w:p>
+        </w:tc>
+      </w:tr>
+      <w:tr>
+        <w:trPr>
+          <w:trHeight w:val="760" w:hRule="atLeast"/>
+        </w:trPr>
+        <w:tc>
+          <w:tcPr>
+            <w:tcW w:type="dxa" w:w="640"/>
+            <w:tcMar>
+              <w:top w:type="dxa" w:w="70"/>
+              <w:left w:type="dxa" w:w="110"/>
+              <w:bottom w:type="dxa" w:w="70"/>
+              <w:right w:type="dxa" w:w="110"/>
+            </w:tcMar>
+          </w:tcPr>
+          <w:p>
+            <w:pPr>
+              <w:jc w:val="center"/>
+            </w:pPr>
+            <w:r>
+              <w:rPr>
+                <w:rFonts w:ascii="Arial" w:cs="Arial" w:eastAsia="Arial" w:hAnsi="Arial"/>
+                <w:b/>
+                <w:bCs/>
+                <w:color w:val="000000"/>
+                <w:sz w:val="21"/>
+                <w:szCs w:val="21"/>
+              </w:rPr>
+              <w:t xml:space="preserve">5</w:t>
+            </w:r>
+          </w:p>
+        </w:tc>
+        <w:tc>
+          <w:tcPr>
+            <w:tcW w:type="dxa" w:w="1900"/>
+            <w:tcMar>
+              <w:top w:type="dxa" w:w="70"/>
+              <w:left w:type="dxa" w:w="110"/>
+              <w:bottom w:type="dxa" w:w="70"/>
+              <w:right w:type="dxa" w:w="110"/>
+            </w:tcMar>
+          </w:tcPr>
+          <w:p>
+            <w:pPr>
+              <w:spacing w:before="120"/>
+              <w:jc w:val="center"/>
+            </w:pPr>
+            <w:r>
+              <w:rPr>
+                <w:rFonts w:ascii="Arial" w:cs="Arial" w:eastAsia="Arial" w:hAnsi="Arial"/>
+                <w:b/>
+                <w:bCs/>
+                <w:sz w:val="22"/>
+                <w:szCs w:val="22"/>
+              </w:rPr>
+              <w:t xml:space="preserve">9 + r</w:t>
+            </w:r>
+          </w:p>
+        </w:tc>
+        <w:tc>
+          <w:tcPr>
+            <w:tcW w:type="dxa" w:w="6820"/>
+            <w:tcMar>
+              <w:top w:type="dxa" w:w="70"/>
+              <w:left w:type="dxa" w:w="110"/>
+              <w:bottom w:type="dxa" w:w="70"/>
+              <w:right w:type="dxa" w:w="110"/>
+            </w:tcMar>
+          </w:tcPr>
+          <w:p>
+            <w:pPr>
+              <w:spacing w:after="30" w:before="80"/>
+            </w:pPr>
+            <w:r>
+              <w:rPr>
+                <w:rFonts w:ascii="Arial" w:cs="Arial" w:eastAsia="Arial" w:hAnsi="Arial"/>
+                <w:b/>
+                <w:bCs/>
+                <w:color w:val="2E74B5"/>
+                <w:sz w:val="21"/>
+                <w:szCs w:val="21"/>
+              </w:rPr>
+              <w:t xml:space="preserve">1)  </w:t>
+            </w:r>
+            <w:r>
+              <w:rPr>
+                <w:rFonts w:ascii="Arial" w:cs="Arial" w:eastAsia="Arial" w:hAnsi="Arial"/>
+                <w:color w:val="808080"/>
+                <w:sz w:val="20"/>
+                <w:szCs w:val="20"/>
+              </w:rPr>
+              <w:t xml:space="preserve">________________________________________________________</w:t>
+            </w:r>
+          </w:p>
+          <w:p>
+            <w:pPr>
+              <w:spacing w:after="40"/>
+            </w:pPr>
+            <w:r>
+              <w:rPr>
+                <w:rFonts w:ascii="Arial" w:cs="Arial" w:eastAsia="Arial" w:hAnsi="Arial"/>
+                <w:b/>
+                <w:bCs/>
+                <w:color w:val="2E74B5"/>
+                <w:sz w:val="21"/>
+                <w:szCs w:val="21"/>
+              </w:rPr>
+              <w:t xml:space="preserve">2)  </w:t>
+            </w:r>
+            <w:r>
+              <w:rPr>
+                <w:rFonts w:ascii="Arial" w:cs="Arial" w:eastAsia="Arial" w:hAnsi="Arial"/>
+                <w:color w:val="808080"/>
+                <w:sz w:val="20"/>
+                <w:szCs w:val="20"/>
+              </w:rPr>
+              <w:t xml:space="preserve">________________________________________________________</w:t>
+            </w:r>
+          </w:p>
+        </w:tc>
+      </w:tr>
+      <w:tr>
+        <w:trPr>
+          <w:trHeight w:val="760" w:hRule="atLeast"/>
+        </w:trPr>
+        <w:tc>
+          <w:tcPr>
+            <w:tcW w:type="dxa" w:w="640"/>
+            <w:tcMar>
+              <w:top w:type="dxa" w:w="70"/>
+              <w:left w:type="dxa" w:w="110"/>
+              <w:bottom w:type="dxa" w:w="70"/>
+              <w:right w:type="dxa" w:w="110"/>
+            </w:tcMar>
+          </w:tcPr>
+          <w:p>
+            <w:pPr>
+              <w:jc w:val="center"/>
+            </w:pPr>
+            <w:r>
+              <w:rPr>
+                <w:rFonts w:ascii="Arial" w:cs="Arial" w:eastAsia="Arial" w:hAnsi="Arial"/>
+                <w:b/>
+                <w:bCs/>
+                <w:color w:val="000000"/>
+                <w:sz w:val="21"/>
+                <w:szCs w:val="21"/>
+              </w:rPr>
+              <w:t xml:space="preserve">6</w:t>
+            </w:r>
+          </w:p>
+        </w:tc>
+        <w:tc>
+          <w:tcPr>
+            <w:tcW w:type="dxa" w:w="1900"/>
+            <w:tcMar>
+              <w:top w:type="dxa" w:w="70"/>
+              <w:left w:type="dxa" w:w="110"/>
+              <w:bottom w:type="dxa" w:w="70"/>
+              <w:right w:type="dxa" w:w="110"/>
+            </w:tcMar>
+          </w:tcPr>
+          <w:p>
+            <w:pPr>
+              <w:spacing w:before="120"/>
+              <w:jc w:val="center"/>
+            </w:pPr>
+            <w:r>
+              <w:rPr>
+                <w:rFonts w:ascii="Arial" w:cs="Arial" w:eastAsia="Arial" w:hAnsi="Arial"/>
+                <w:b/>
+                <w:bCs/>
+                <w:sz w:val="22"/>
+                <w:szCs w:val="22"/>
+              </w:rPr>
+              <w:t xml:space="preserve">q – r</w:t>
+            </w:r>
+          </w:p>
+        </w:tc>
+        <w:tc>
+          <w:tcPr>
+            <w:tcW w:type="dxa" w:w="6820"/>
+            <w:tcMar>
+              <w:top w:type="dxa" w:w="70"/>
+              <w:left w:type="dxa" w:w="110"/>
+              <w:bottom w:type="dxa" w:w="70"/>
+              <w:right w:type="dxa" w:w="110"/>
+            </w:tcMar>
+          </w:tcPr>
+          <w:p>
+            <w:pPr>
+              <w:spacing w:after="30" w:before="80"/>
+            </w:pPr>
+            <w:r>
+              <w:rPr>
+                <w:rFonts w:ascii="Arial" w:cs="Arial" w:eastAsia="Arial" w:hAnsi="Arial"/>
+                <w:b/>
+                <w:bCs/>
+                <w:color w:val="2E74B5"/>
+                <w:sz w:val="21"/>
+                <w:szCs w:val="21"/>
+              </w:rPr>
+              <w:t xml:space="preserve">1)  </w:t>
+            </w:r>
+            <w:r>
+              <w:rPr>
+                <w:rFonts w:ascii="Arial" w:cs="Arial" w:eastAsia="Arial" w:hAnsi="Arial"/>
+                <w:color w:val="808080"/>
+                <w:sz w:val="20"/>
+                <w:szCs w:val="20"/>
+              </w:rPr>
+              <w:t xml:space="preserve">________________________________________________________</w:t>
+            </w:r>
+          </w:p>
+          <w:p>
+            <w:pPr>
+              <w:spacing w:after="40"/>
+            </w:pPr>
+            <w:r>
+              <w:rPr>
+                <w:rFonts w:ascii="Arial" w:cs="Arial" w:eastAsia="Arial" w:hAnsi="Arial"/>
+                <w:b/>
+                <w:bCs/>
+                <w:color w:val="2E74B5"/>
+                <w:sz w:val="21"/>
+                <w:szCs w:val="21"/>
+              </w:rPr>
+              <w:t xml:space="preserve">2)  </w:t>
+            </w:r>
+            <w:r>
+              <w:rPr>
+                <w:rFonts w:ascii="Arial" w:cs="Arial" w:eastAsia="Arial" w:hAnsi="Arial"/>
+                <w:color w:val="808080"/>
+                <w:sz w:val="20"/>
+                <w:szCs w:val="20"/>
+              </w:rPr>
+              <w:t xml:space="preserve">________________________________________________________</w:t>
+            </w:r>
+          </w:p>
+        </w:tc>
+      </w:tr>
+      <w:tr>
+        <w:trPr>
+          <w:trHeight w:val="760" w:hRule="atLeast"/>
+        </w:trPr>
+        <w:tc>
+          <w:tcPr>
+            <w:tcW w:type="dxa" w:w="640"/>
+            <w:tcMar>
+              <w:top w:type="dxa" w:w="70"/>
+              <w:left w:type="dxa" w:w="110"/>
+              <w:bottom w:type="dxa" w:w="70"/>
+              <w:right w:type="dxa" w:w="110"/>
+            </w:tcMar>
+          </w:tcPr>
+          <w:p>
+            <w:pPr>
+              <w:jc w:val="center"/>
+            </w:pPr>
+            <w:r>
+              <w:rPr>
+                <w:rFonts w:ascii="Arial" w:cs="Arial" w:eastAsia="Arial" w:hAnsi="Arial"/>
+                <w:b/>
+                <w:bCs/>
+                <w:color w:val="000000"/>
+                <w:sz w:val="21"/>
+                <w:szCs w:val="21"/>
+              </w:rPr>
+              <w:t xml:space="preserve">7</w:t>
+            </w:r>
+          </w:p>
+        </w:tc>
+        <w:tc>
+          <w:tcPr>
+            <w:tcW w:type="dxa" w:w="1900"/>
+            <w:tcMar>
+              <w:top w:type="dxa" w:w="70"/>
+              <w:left w:type="dxa" w:w="110"/>
+              <w:bottom w:type="dxa" w:w="70"/>
+              <w:right w:type="dxa" w:w="110"/>
+            </w:tcMar>
+          </w:tcPr>
+          <w:p>
+            <w:pPr>
+              <w:spacing w:before="120"/>
+              <w:jc w:val="center"/>
+            </w:pPr>
+            <w:r>
+              <w:rPr>
+                <w:rFonts w:ascii="Arial" w:cs="Arial" w:eastAsia="Arial" w:hAnsi="Arial"/>
+                <w:b/>
+                <w:bCs/>
+                <w:sz w:val="22"/>
+                <w:szCs w:val="22"/>
+              </w:rPr>
+              <w:t xml:space="preserve">7m + 5</w:t>
+            </w:r>
+          </w:p>
+        </w:tc>
+        <w:tc>
+          <w:tcPr>
+            <w:tcW w:type="dxa" w:w="6820"/>
+            <w:tcMar>
+              <w:top w:type="dxa" w:w="70"/>
+              <w:left w:type="dxa" w:w="110"/>
+              <w:bottom w:type="dxa" w:w="70"/>
+              <w:right w:type="dxa" w:w="110"/>
+            </w:tcMar>
+          </w:tcPr>
+          <w:p>
+            <w:pPr>
+              <w:spacing w:after="30" w:before="80"/>
+            </w:pPr>
+            <w:r>
+              <w:rPr>
+                <w:rFonts w:ascii="Arial" w:cs="Arial" w:eastAsia="Arial" w:hAnsi="Arial"/>
+                <w:b/>
+                <w:bCs/>
+                <w:color w:val="2E74B5"/>
+                <w:sz w:val="21"/>
+                <w:szCs w:val="21"/>
+              </w:rPr>
+              <w:t xml:space="preserve">1)  </w:t>
+            </w:r>
+            <w:r>
+              <w:rPr>
+                <w:rFonts w:ascii="Arial" w:cs="Arial" w:eastAsia="Arial" w:hAnsi="Arial"/>
+                <w:color w:val="808080"/>
+                <w:sz w:val="20"/>
+                <w:szCs w:val="20"/>
+              </w:rPr>
+              <w:t xml:space="preserve">________________________________________________________</w:t>
+            </w:r>
+          </w:p>
+          <w:p>
+            <w:pPr>
+              <w:spacing w:after="40"/>
+            </w:pPr>
+            <w:r>
+              <w:rPr>
+                <w:rFonts w:ascii="Arial" w:cs="Arial" w:eastAsia="Arial" w:hAnsi="Arial"/>
+                <w:b/>
+                <w:bCs/>
+                <w:color w:val="2E74B5"/>
+                <w:sz w:val="21"/>
+                <w:szCs w:val="21"/>
+              </w:rPr>
+              <w:t xml:space="preserve">2)  </w:t>
+            </w:r>
+            <w:r>
+              <w:rPr>
+                <w:rFonts w:ascii="Arial" w:cs="Arial" w:eastAsia="Arial" w:hAnsi="Arial"/>
+                <w:color w:val="808080"/>
+                <w:sz w:val="20"/>
+                <w:szCs w:val="20"/>
+              </w:rPr>
+              <w:t xml:space="preserve">________________________________________________________</w:t>
+            </w:r>
+          </w:p>
+        </w:tc>
+      </w:tr>
+      <w:tr>
+        <w:trPr>
+          <w:trHeight w:val="760" w:hRule="atLeast"/>
+        </w:trPr>
+        <w:tc>
+          <w:tcPr>
+            <w:tcW w:type="dxa" w:w="640"/>
+            <w:tcMar>
+              <w:top w:type="dxa" w:w="70"/>
+              <w:left w:type="dxa" w:w="110"/>
+              <w:bottom w:type="dxa" w:w="70"/>
+              <w:right w:type="dxa" w:w="110"/>
+            </w:tcMar>
+          </w:tcPr>
+          <w:p>
+            <w:pPr>
+              <w:jc w:val="center"/>
+            </w:pPr>
+            <w:r>
+              <w:rPr>
+                <w:rFonts w:ascii="Arial" w:cs="Arial" w:eastAsia="Arial" w:hAnsi="Arial"/>
+                <w:b/>
+                <w:bCs/>
+                <w:color w:val="000000"/>
+                <w:sz w:val="21"/>
+                <w:szCs w:val="21"/>
+              </w:rPr>
+              <w:t xml:space="preserve">8</w:t>
+            </w:r>
+          </w:p>
+        </w:tc>
+        <w:tc>
+          <w:tcPr>
+            <w:tcW w:type="dxa" w:w="1900"/>
+            <w:tcMar>
+              <w:top w:type="dxa" w:w="70"/>
+              <w:left w:type="dxa" w:w="110"/>
+              <w:bottom w:type="dxa" w:w="70"/>
+              <w:right w:type="dxa" w:w="110"/>
+            </w:tcMar>
+          </w:tcPr>
+          <w:p>
+            <w:pPr>
+              <w:spacing w:before="120"/>
+              <w:jc w:val="center"/>
+            </w:pPr>
+            <w:r>
+              <w:rPr>
+                <w:rFonts w:ascii="Arial" w:cs="Arial" w:eastAsia="Arial" w:hAnsi="Arial"/>
+                <w:b/>
+                <w:bCs/>
+                <w:sz w:val="22"/>
+                <w:szCs w:val="22"/>
+              </w:rPr>
+              <w:t xml:space="preserve">2j ÷ 6</w:t>
+            </w:r>
+          </w:p>
+        </w:tc>
+        <w:tc>
+          <w:tcPr>
+            <w:tcW w:type="dxa" w:w="6820"/>
+            <w:tcMar>
+              <w:top w:type="dxa" w:w="70"/>
+              <w:left w:type="dxa" w:w="110"/>
+              <w:bottom w:type="dxa" w:w="70"/>
+              <w:right w:type="dxa" w:w="110"/>
+            </w:tcMar>
+          </w:tcPr>
+          <w:p>
+            <w:pPr>
+              <w:spacing w:after="30" w:before="80"/>
+            </w:pPr>
+            <w:r>
+              <w:rPr>
+                <w:rFonts w:ascii="Arial" w:cs="Arial" w:eastAsia="Arial" w:hAnsi="Arial"/>
+                <w:b/>
+                <w:bCs/>
+                <w:color w:val="2E74B5"/>
+                <w:sz w:val="21"/>
+                <w:szCs w:val="21"/>
+              </w:rPr>
+              <w:t xml:space="preserve">1)  </w:t>
+            </w:r>
+            <w:r>
+              <w:rPr>
+                <w:rFonts w:ascii="Arial" w:cs="Arial" w:eastAsia="Arial" w:hAnsi="Arial"/>
+                <w:color w:val="808080"/>
+                <w:sz w:val="20"/>
+                <w:szCs w:val="20"/>
+              </w:rPr>
+              <w:t xml:space="preserve">________________________________________________________</w:t>
+            </w:r>
+          </w:p>
+          <w:p>
+            <w:pPr>
+              <w:spacing w:after="40"/>
+            </w:pPr>
+            <w:r>
+              <w:rPr>
+                <w:rFonts w:ascii="Arial" w:cs="Arial" w:eastAsia="Arial" w:hAnsi="Arial"/>
+                <w:b/>
+                <w:bCs/>
+                <w:color w:val="2E74B5"/>
+                <w:sz w:val="21"/>
+                <w:szCs w:val="21"/>
+              </w:rPr>
+              <w:t xml:space="preserve">2)  </w:t>
+            </w:r>
+            <w:r>
+              <w:rPr>
+                <w:rFonts w:ascii="Arial" w:cs="Arial" w:eastAsia="Arial" w:hAnsi="Arial"/>
+                <w:color w:val="808080"/>
+                <w:sz w:val="20"/>
+                <w:szCs w:val="20"/>
+              </w:rPr>
+              <w:t xml:space="preserve">________________________________________________________</w:t>
+            </w:r>
+          </w:p>
+        </w:tc>
+      </w:tr>
+    </w:tbl>
+    <w:p>
+      <w:pPr>
+        <w:spacing w:before="160"/>
       </w:pPr>
     </w:p>
     <w:p>
@@ -3222,289 +3706,583 @@
         <w:t xml:space="preserve">Set C — Write an expression, then evaluate it (real-world).</w:t>
       </w:r>
     </w:p>
-    <w:p>
-      <w:pPr>
-        <w:spacing w:after="40"/>
-      </w:pPr>
-      <w:r>
-        <w:rPr>
-          <w:rFonts w:ascii="Arial" w:cs="Arial" w:eastAsia="Arial" w:hAnsi="Arial"/>
-          <w:b/>
-          <w:bCs/>
-          <w:color w:val="1F3864"/>
-          <w:sz w:val="22"/>
-          <w:szCs w:val="22"/>
-        </w:rPr>
-        <w:t xml:space="preserve">9.  </w:t>
-      </w:r>
-      <w:r>
-        <w:rPr>
-          <w:rFonts w:ascii="Arial" w:cs="Arial" w:eastAsia="Arial" w:hAnsi="Arial"/>
-          <w:sz w:val="22"/>
-          <w:szCs w:val="22"/>
-        </w:rPr>
-        <w:t xml:space="preserve">John types 62 words per minute. Write an expression for the number of words he types in m minutes.</w:t>
-      </w:r>
-    </w:p>
-    <w:p>
-      <w:pPr>
-        <w:spacing w:after="30"/>
-        <w:ind w:left="300"/>
-      </w:pPr>
-      <w:r>
-        <w:rPr>
-          <w:rFonts w:ascii="Arial" w:cs="Arial" w:eastAsia="Arial" w:hAnsi="Arial"/>
-          <w:b/>
-          <w:bCs/>
-          <w:color w:val="375623"/>
-          <w:sz w:val="21"/>
-          <w:szCs w:val="21"/>
-        </w:rPr>
-        <w:t xml:space="preserve">Expression: </w:t>
-      </w:r>
-      <w:r>
-        <w:rPr>
-          <w:rFonts w:ascii="Arial" w:cs="Arial" w:eastAsia="Arial" w:hAnsi="Arial"/>
-          <w:i w:val="false"/>
-          <w:iCs w:val="false"/>
-          <w:color w:val="000000"/>
-          <w:sz w:val="21"/>
-          <w:szCs w:val="21"/>
-        </w:rPr>
-        <w:t xml:space="preserve">62m   (62 words for every minute)</w:t>
-      </w:r>
-    </w:p>
-    <w:p>
-      <w:pPr>
-        <w:spacing w:after="30"/>
-        <w:ind w:left="300"/>
-      </w:pPr>
-      <w:r>
-        <w:rPr>
-          <w:rFonts w:ascii="Arial" w:cs="Arial" w:eastAsia="Arial" w:hAnsi="Arial"/>
-          <w:b/>
-          <w:bCs/>
-          <w:color w:val="375623"/>
-          <w:sz w:val="21"/>
-          <w:szCs w:val="21"/>
-        </w:rPr>
-        <w:t xml:space="preserve">Evaluate: </w:t>
-      </w:r>
-      <w:r>
-        <w:rPr>
-          <w:rFonts w:ascii="Arial" w:cs="Arial" w:eastAsia="Arial" w:hAnsi="Arial"/>
-          <w:i w:val="false"/>
-          <w:iCs w:val="false"/>
-          <w:color w:val="000000"/>
-          <w:sz w:val="21"/>
-          <w:szCs w:val="21"/>
-        </w:rPr>
-        <w:t xml:space="preserve">If John typed 25 minutes:  62(25) = 1,550 words.</w:t>
-      </w:r>
-    </w:p>
-    <w:p>
-      <w:pPr>
-        <w:spacing w:after="80"/>
-      </w:pPr>
-    </w:p>
-    <w:p>
-      <w:pPr>
-        <w:spacing w:after="40"/>
-      </w:pPr>
-      <w:r>
-        <w:rPr>
-          <w:rFonts w:ascii="Arial" w:cs="Arial" w:eastAsia="Arial" w:hAnsi="Arial"/>
-          <w:b/>
-          <w:bCs/>
-          <w:color w:val="1F3864"/>
-          <w:sz w:val="22"/>
-          <w:szCs w:val="22"/>
-        </w:rPr>
-        <w:t xml:space="preserve">10.  </w:t>
-      </w:r>
-      <w:r>
-        <w:rPr>
-          <w:rFonts w:ascii="Arial" w:cs="Arial" w:eastAsia="Arial" w:hAnsi="Arial"/>
-          <w:sz w:val="22"/>
-          <w:szCs w:val="22"/>
-        </w:rPr>
-        <w:t xml:space="preserve">Joey earns $5 for each car he washes. Write an expression for the number of cars Joey must wash to earn d dollars.</w:t>
-      </w:r>
-    </w:p>
-    <w:p>
-      <w:pPr>
-        <w:spacing w:after="30"/>
-        <w:ind w:left="300"/>
-      </w:pPr>
-      <w:r>
-        <w:rPr>
-          <w:rFonts w:ascii="Arial" w:cs="Arial" w:eastAsia="Arial" w:hAnsi="Arial"/>
-          <w:b/>
-          <w:bCs/>
-          <w:color w:val="375623"/>
-          <w:sz w:val="21"/>
-          <w:szCs w:val="21"/>
-        </w:rPr>
-        <w:t xml:space="preserve">Expression: </w:t>
-      </w:r>
-      <w:r>
-        <w:rPr>
-          <w:rFonts w:ascii="Arial" w:cs="Arial" w:eastAsia="Arial" w:hAnsi="Arial"/>
-          <w:i w:val="false"/>
-          <w:iCs w:val="false"/>
-          <w:color w:val="000000"/>
-          <w:sz w:val="21"/>
-          <w:szCs w:val="21"/>
-        </w:rPr>
-        <w:t xml:space="preserve">d ÷ 5   (also written  d/5) — dollars split into $5 groups.</w:t>
-      </w:r>
-    </w:p>
-    <w:p>
-      <w:pPr>
-        <w:spacing w:after="30"/>
-        <w:ind w:left="300"/>
-      </w:pPr>
-      <w:r>
-        <w:rPr>
-          <w:rFonts w:ascii="Arial" w:cs="Arial" w:eastAsia="Arial" w:hAnsi="Arial"/>
-          <w:b/>
-          <w:bCs/>
-          <w:color w:val="375623"/>
-          <w:sz w:val="21"/>
-          <w:szCs w:val="21"/>
-        </w:rPr>
-        <w:t xml:space="preserve">Evaluate: </w:t>
-      </w:r>
-      <w:r>
-        <w:rPr>
-          <w:rFonts w:ascii="Arial" w:cs="Arial" w:eastAsia="Arial" w:hAnsi="Arial"/>
-          <w:i w:val="false"/>
-          <w:iCs w:val="false"/>
-          <w:color w:val="000000"/>
-          <w:sz w:val="21"/>
-          <w:szCs w:val="21"/>
-        </w:rPr>
-        <w:t xml:space="preserve">If Joey washed 12 cars, how much did he make?  5(12) = $60.</w:t>
-      </w:r>
-    </w:p>
-    <w:p>
-      <w:pPr>
-        <w:spacing w:after="30"/>
-        <w:ind w:left="300"/>
-      </w:pPr>
-      <w:r>
-        <w:rPr>
-          <w:rFonts w:ascii="Arial" w:cs="Arial" w:eastAsia="Arial" w:hAnsi="Arial"/>
-          <w:b/>
-          <w:bCs/>
-          <w:color w:val="375623"/>
-          <w:sz w:val="21"/>
-          <w:szCs w:val="21"/>
-        </w:rPr>
-        <w:t xml:space="preserve">Teacher note: </w:t>
-      </w:r>
-      <w:r>
-        <w:rPr>
-          <w:rFonts w:ascii="Arial" w:cs="Arial" w:eastAsia="Arial" w:hAnsi="Arial"/>
-          <w:i/>
-          <w:iCs/>
-          <w:color w:val="595959"/>
-          <w:sz w:val="21"/>
-          <w:szCs w:val="21"/>
-        </w:rPr>
-        <w:t xml:space="preserve">The two parts run in opposite directions — the expression converts dollars → cars (d ÷ 5), while the follow-up converts cars → dollars (5 × 12). A good discussion point about inverse relationships.</w:t>
-      </w:r>
-    </w:p>
-    <w:p>
-      <w:pPr>
-        <w:spacing w:after="80"/>
-      </w:pPr>
-    </w:p>
-    <w:p>
-      <w:pPr>
-        <w:spacing w:after="40"/>
-      </w:pPr>
-      <w:r>
-        <w:rPr>
-          <w:rFonts w:ascii="Arial" w:cs="Arial" w:eastAsia="Arial" w:hAnsi="Arial"/>
-          <w:b/>
-          <w:bCs/>
-          <w:color w:val="1F3864"/>
-          <w:sz w:val="22"/>
-          <w:szCs w:val="22"/>
-        </w:rPr>
-        <w:t xml:space="preserve">11.  </w:t>
-      </w:r>
-      <w:r>
-        <w:rPr>
-          <w:rFonts w:ascii="Arial" w:cs="Arial" w:eastAsia="Arial" w:hAnsi="Arial"/>
-          <w:sz w:val="22"/>
-          <w:szCs w:val="22"/>
-        </w:rPr>
-        <w:t xml:space="preserve">Roberto goes to a pizza place. A pizza costs $12 plus $2 per topping. Write an expression to describe the cost.</w:t>
-      </w:r>
-    </w:p>
-    <w:p>
-      <w:pPr>
-        <w:spacing w:after="30"/>
-        <w:ind w:left="300"/>
-      </w:pPr>
-      <w:r>
-        <w:rPr>
-          <w:rFonts w:ascii="Arial" w:cs="Arial" w:eastAsia="Arial" w:hAnsi="Arial"/>
-          <w:b/>
-          <w:bCs/>
-          <w:color w:val="375623"/>
-          <w:sz w:val="21"/>
-          <w:szCs w:val="21"/>
-        </w:rPr>
-        <w:t xml:space="preserve">Expression: </w:t>
-      </w:r>
-      <w:r>
-        <w:rPr>
-          <w:rFonts w:ascii="Arial" w:cs="Arial" w:eastAsia="Arial" w:hAnsi="Arial"/>
-          <w:i w:val="false"/>
-          <w:iCs w:val="false"/>
-          <w:color w:val="000000"/>
-          <w:sz w:val="21"/>
-          <w:szCs w:val="21"/>
-        </w:rPr>
-        <w:t xml:space="preserve">12 + 2t   (t = number of toppings)</w:t>
-      </w:r>
-    </w:p>
-    <w:p>
-      <w:pPr>
-        <w:spacing w:after="30"/>
-        <w:ind w:left="300"/>
-      </w:pPr>
-      <w:r>
-        <w:rPr>
-          <w:rFonts w:ascii="Arial" w:cs="Arial" w:eastAsia="Arial" w:hAnsi="Arial"/>
-          <w:b/>
-          <w:bCs/>
-          <w:color w:val="375623"/>
-          <w:sz w:val="21"/>
-          <w:szCs w:val="21"/>
-        </w:rPr>
-        <w:t xml:space="preserve">Evaluate: </w:t>
-      </w:r>
-      <w:r>
-        <w:rPr>
-          <w:rFonts w:ascii="Arial" w:cs="Arial" w:eastAsia="Arial" w:hAnsi="Arial"/>
-          <w:i w:val="false"/>
-          <w:iCs w:val="false"/>
-          <w:color w:val="000000"/>
-          <w:sz w:val="21"/>
-          <w:szCs w:val="21"/>
-        </w:rPr>
-        <w:t xml:space="preserve">If Roberto ordered 4 toppings:  12 + 2(4) = 12 + 8 = $20.</w:t>
-      </w:r>
-    </w:p>
-    <w:p>
-      <w:pPr>
-        <w:spacing w:after="80"/>
-      </w:pPr>
-    </w:p>
+    <w:tbl>
+      <w:tblPr>
+        <w:tblW w:type="dxa" w:w="9360"/>
+        <w:tblBorders>
+          <w:top w:val="single" w:color="BFBFBF" w:sz="4"/>
+          <w:left w:val="single" w:color="BFBFBF" w:sz="4"/>
+          <w:bottom w:val="single" w:color="BFBFBF" w:sz="4"/>
+          <w:right w:val="single" w:color="BFBFBF" w:sz="4"/>
+          <w:insideH w:val="single" w:color="D9D9D9" w:sz="4"/>
+          <w:insideV w:val="single" w:color="D9D9D9" w:sz="4"/>
+        </w:tblBorders>
+      </w:tblPr>
+      <w:tblGrid>
+        <w:gridCol w:w="640"/>
+        <w:gridCol w:w="5360"/>
+        <w:gridCol w:w="1760"/>
+        <w:gridCol w:w="1600"/>
+      </w:tblGrid>
+      <w:tr>
+        <w:trPr>
+          <w:tblHeader/>
+        </w:trPr>
+        <w:tc>
+          <w:tcPr>
+            <w:tcW w:type="dxa" w:w="640"/>
+            <w:shd w:fill="DEEAF6" w:val="clear"/>
+            <w:tcMar>
+              <w:top w:type="dxa" w:w="70"/>
+              <w:left w:type="dxa" w:w="110"/>
+              <w:bottom w:type="dxa" w:w="70"/>
+              <w:right w:type="dxa" w:w="110"/>
+            </w:tcMar>
+          </w:tcPr>
+          <w:p>
+            <w:pPr>
+              <w:jc w:val="center"/>
+            </w:pPr>
+            <w:r>
+              <w:rPr>
+                <w:rFonts w:ascii="Arial" w:cs="Arial" w:eastAsia="Arial" w:hAnsi="Arial"/>
+                <w:b/>
+                <w:bCs/>
+                <w:color w:val="1F3864"/>
+                <w:sz w:val="21"/>
+                <w:szCs w:val="21"/>
+              </w:rPr>
+              <w:t xml:space="preserve">#</w:t>
+            </w:r>
+          </w:p>
+        </w:tc>
+        <w:tc>
+          <w:tcPr>
+            <w:tcW w:type="dxa" w:w="5360"/>
+            <w:shd w:fill="DEEAF6" w:val="clear"/>
+            <w:tcMar>
+              <w:top w:type="dxa" w:w="70"/>
+              <w:left w:type="dxa" w:w="110"/>
+              <w:bottom w:type="dxa" w:w="70"/>
+              <w:right w:type="dxa" w:w="110"/>
+            </w:tcMar>
+          </w:tcPr>
+          <w:p>
+            <w:pPr>
+              <w:jc w:val="center"/>
+            </w:pPr>
+            <w:r>
+              <w:rPr>
+                <w:rFonts w:ascii="Arial" w:cs="Arial" w:eastAsia="Arial" w:hAnsi="Arial"/>
+                <w:b/>
+                <w:bCs/>
+                <w:color w:val="1F3864"/>
+                <w:sz w:val="21"/>
+                <w:szCs w:val="21"/>
+              </w:rPr>
+              <w:t xml:space="preserve">Real-World Situation</w:t>
+            </w:r>
+          </w:p>
+        </w:tc>
+        <w:tc>
+          <w:tcPr>
+            <w:tcW w:type="dxa" w:w="1760"/>
+            <w:shd w:fill="DEEAF6" w:val="clear"/>
+            <w:tcMar>
+              <w:top w:type="dxa" w:w="70"/>
+              <w:left w:type="dxa" w:w="110"/>
+              <w:bottom w:type="dxa" w:w="70"/>
+              <w:right w:type="dxa" w:w="110"/>
+            </w:tcMar>
+          </w:tcPr>
+          <w:p>
+            <w:pPr>
+              <w:jc w:val="center"/>
+            </w:pPr>
+            <w:r>
+              <w:rPr>
+                <w:rFonts w:ascii="Arial" w:cs="Arial" w:eastAsia="Arial" w:hAnsi="Arial"/>
+                <w:b/>
+                <w:bCs/>
+                <w:color w:val="1F3864"/>
+                <w:sz w:val="21"/>
+                <w:szCs w:val="21"/>
+              </w:rPr>
+              <w:t xml:space="preserve">Expression</w:t>
+            </w:r>
+          </w:p>
+        </w:tc>
+        <w:tc>
+          <w:tcPr>
+            <w:tcW w:type="dxa" w:w="1600"/>
+            <w:shd w:fill="DEEAF6" w:val="clear"/>
+            <w:tcMar>
+              <w:top w:type="dxa" w:w="70"/>
+              <w:left w:type="dxa" w:w="110"/>
+              <w:bottom w:type="dxa" w:w="70"/>
+              <w:right w:type="dxa" w:w="110"/>
+            </w:tcMar>
+          </w:tcPr>
+          <w:p>
+            <w:pPr>
+              <w:jc w:val="center"/>
+            </w:pPr>
+            <w:r>
+              <w:rPr>
+                <w:rFonts w:ascii="Arial" w:cs="Arial" w:eastAsia="Arial" w:hAnsi="Arial"/>
+                <w:b/>
+                <w:bCs/>
+                <w:color w:val="1F3864"/>
+                <w:sz w:val="21"/>
+                <w:szCs w:val="21"/>
+              </w:rPr>
+              <w:t xml:space="preserve">Evaluate</w:t>
+            </w:r>
+          </w:p>
+        </w:tc>
+      </w:tr>
+      <w:tr>
+        <w:trPr>
+          <w:trHeight w:val="1000" w:hRule="atLeast"/>
+        </w:trPr>
+        <w:tc>
+          <w:tcPr>
+            <w:tcW w:type="dxa" w:w="640"/>
+            <w:tcMar>
+              <w:top w:type="dxa" w:w="70"/>
+              <w:left w:type="dxa" w:w="110"/>
+              <w:bottom w:type="dxa" w:w="70"/>
+              <w:right w:type="dxa" w:w="110"/>
+            </w:tcMar>
+          </w:tcPr>
+          <w:p>
+            <w:pPr>
+              <w:jc w:val="center"/>
+            </w:pPr>
+            <w:r>
+              <w:rPr>
+                <w:rFonts w:ascii="Arial" w:cs="Arial" w:eastAsia="Arial" w:hAnsi="Arial"/>
+                <w:b/>
+                <w:bCs/>
+                <w:color w:val="000000"/>
+                <w:sz w:val="21"/>
+                <w:szCs w:val="21"/>
+              </w:rPr>
+              <w:t xml:space="preserve">9</w:t>
+            </w:r>
+          </w:p>
+        </w:tc>
+        <w:tc>
+          <w:tcPr>
+            <w:tcW w:type="dxa" w:w="5360"/>
+            <w:tcMar>
+              <w:top w:type="dxa" w:w="70"/>
+              <w:left w:type="dxa" w:w="110"/>
+              <w:bottom w:type="dxa" w:w="70"/>
+              <w:right w:type="dxa" w:w="110"/>
+            </w:tcMar>
+          </w:tcPr>
+          <w:p>
+            <w:pPr>
+              <w:spacing w:after="60"/>
+            </w:pPr>
+            <w:r>
+              <w:rPr>
+                <w:rFonts w:ascii="Arial" w:cs="Arial" w:eastAsia="Arial" w:hAnsi="Arial"/>
+                <w:sz w:val="21"/>
+                <w:szCs w:val="21"/>
+              </w:rPr>
+              <w:t xml:space="preserve">John types 62 words per minute. Write an expression for the number of words he types in m minutes.</w:t>
+            </w:r>
+          </w:p>
+          <w:p>
+            <w:r>
+              <w:rPr>
+                <w:rFonts w:ascii="Arial" w:cs="Arial" w:eastAsia="Arial" w:hAnsi="Arial"/>
+                <w:i/>
+                <w:iCs/>
+                <w:color w:val="595959"/>
+                <w:sz w:val="20"/>
+                <w:szCs w:val="20"/>
+              </w:rPr>
+              <w:t xml:space="preserve">If John typed 25 minutes, how many words would that be?</w:t>
+            </w:r>
+          </w:p>
+        </w:tc>
+        <w:tc>
+          <w:tcPr>
+            <w:tcW w:type="dxa" w:w="1760"/>
+            <w:tcMar>
+              <w:top w:type="dxa" w:w="70"/>
+              <w:left w:type="dxa" w:w="110"/>
+              <w:bottom w:type="dxa" w:w="70"/>
+              <w:right w:type="dxa" w:w="110"/>
+            </w:tcMar>
+          </w:tcPr>
+          <w:p>
+            <w:pPr>
+              <w:spacing w:after="20" w:before="60"/>
+            </w:pPr>
+            <w:r>
+              <w:rPr>
+                <w:rFonts w:ascii="Arial" w:cs="Arial" w:eastAsia="Arial" w:hAnsi="Arial"/>
+                <w:color w:val="808080"/>
+                <w:sz w:val="20"/>
+                <w:szCs w:val="20"/>
+              </w:rPr>
+              <w:t xml:space="preserve">__________________________________</w:t>
+            </w:r>
+          </w:p>
+          <w:p>
+            <w:pPr>
+              <w:spacing w:after="20" w:before="60"/>
+            </w:pPr>
+            <w:r>
+              <w:rPr>
+                <w:rFonts w:ascii="Arial" w:cs="Arial" w:eastAsia="Arial" w:hAnsi="Arial"/>
+                <w:color w:val="808080"/>
+                <w:sz w:val="20"/>
+                <w:szCs w:val="20"/>
+              </w:rPr>
+              <w:t xml:space="preserve">__________________________________</w:t>
+            </w:r>
+          </w:p>
+        </w:tc>
+        <w:tc>
+          <w:tcPr>
+            <w:tcW w:type="dxa" w:w="1600"/>
+            <w:tcMar>
+              <w:top w:type="dxa" w:w="70"/>
+              <w:left w:type="dxa" w:w="110"/>
+              <w:bottom w:type="dxa" w:w="70"/>
+              <w:right w:type="dxa" w:w="110"/>
+            </w:tcMar>
+          </w:tcPr>
+          <w:p>
+            <w:pPr>
+              <w:spacing w:after="20" w:before="60"/>
+            </w:pPr>
+            <w:r>
+              <w:rPr>
+                <w:rFonts w:ascii="Arial" w:cs="Arial" w:eastAsia="Arial" w:hAnsi="Arial"/>
+                <w:color w:val="808080"/>
+                <w:sz w:val="20"/>
+                <w:szCs w:val="20"/>
+              </w:rPr>
+              <w:t xml:space="preserve">__________________________________</w:t>
+            </w:r>
+          </w:p>
+          <w:p>
+            <w:pPr>
+              <w:spacing w:after="20" w:before="60"/>
+            </w:pPr>
+            <w:r>
+              <w:rPr>
+                <w:rFonts w:ascii="Arial" w:cs="Arial" w:eastAsia="Arial" w:hAnsi="Arial"/>
+                <w:color w:val="808080"/>
+                <w:sz w:val="20"/>
+                <w:szCs w:val="20"/>
+              </w:rPr>
+              <w:t xml:space="preserve">__________________________________</w:t>
+            </w:r>
+          </w:p>
+        </w:tc>
+      </w:tr>
+      <w:tr>
+        <w:trPr>
+          <w:trHeight w:val="1000" w:hRule="atLeast"/>
+        </w:trPr>
+        <w:tc>
+          <w:tcPr>
+            <w:tcW w:type="dxa" w:w="640"/>
+            <w:tcMar>
+              <w:top w:type="dxa" w:w="70"/>
+              <w:left w:type="dxa" w:w="110"/>
+              <w:bottom w:type="dxa" w:w="70"/>
+              <w:right w:type="dxa" w:w="110"/>
+            </w:tcMar>
+          </w:tcPr>
+          <w:p>
+            <w:pPr>
+              <w:jc w:val="center"/>
+            </w:pPr>
+            <w:r>
+              <w:rPr>
+                <w:rFonts w:ascii="Arial" w:cs="Arial" w:eastAsia="Arial" w:hAnsi="Arial"/>
+                <w:b/>
+                <w:bCs/>
+                <w:color w:val="000000"/>
+                <w:sz w:val="21"/>
+                <w:szCs w:val="21"/>
+              </w:rPr>
+              <w:t xml:space="preserve">10</w:t>
+            </w:r>
+          </w:p>
+        </w:tc>
+        <w:tc>
+          <w:tcPr>
+            <w:tcW w:type="dxa" w:w="5360"/>
+            <w:tcMar>
+              <w:top w:type="dxa" w:w="70"/>
+              <w:left w:type="dxa" w:w="110"/>
+              <w:bottom w:type="dxa" w:w="70"/>
+              <w:right w:type="dxa" w:w="110"/>
+            </w:tcMar>
+          </w:tcPr>
+          <w:p>
+            <w:pPr>
+              <w:spacing w:after="60"/>
+            </w:pPr>
+            <w:r>
+              <w:rPr>
+                <w:rFonts w:ascii="Arial" w:cs="Arial" w:eastAsia="Arial" w:hAnsi="Arial"/>
+                <w:sz w:val="21"/>
+                <w:szCs w:val="21"/>
+              </w:rPr>
+              <w:t xml:space="preserve">Joey earns $5 for each car he washes. Write an expression for the number of cars Joey must wash to earn d dollars.</w:t>
+            </w:r>
+          </w:p>
+          <w:p>
+            <w:r>
+              <w:rPr>
+                <w:rFonts w:ascii="Arial" w:cs="Arial" w:eastAsia="Arial" w:hAnsi="Arial"/>
+                <w:i/>
+                <w:iCs/>
+                <w:color w:val="595959"/>
+                <w:sz w:val="20"/>
+                <w:szCs w:val="20"/>
+              </w:rPr>
+              <w:t xml:space="preserve">If Joey washed 12 cars, how much did he make?</w:t>
+            </w:r>
+          </w:p>
+        </w:tc>
+        <w:tc>
+          <w:tcPr>
+            <w:tcW w:type="dxa" w:w="1760"/>
+            <w:tcMar>
+              <w:top w:type="dxa" w:w="70"/>
+              <w:left w:type="dxa" w:w="110"/>
+              <w:bottom w:type="dxa" w:w="70"/>
+              <w:right w:type="dxa" w:w="110"/>
+            </w:tcMar>
+          </w:tcPr>
+          <w:p>
+            <w:pPr>
+              <w:spacing w:after="20" w:before="60"/>
+            </w:pPr>
+            <w:r>
+              <w:rPr>
+                <w:rFonts w:ascii="Arial" w:cs="Arial" w:eastAsia="Arial" w:hAnsi="Arial"/>
+                <w:color w:val="808080"/>
+                <w:sz w:val="20"/>
+                <w:szCs w:val="20"/>
+              </w:rPr>
+              <w:t xml:space="preserve">__________________________________</w:t>
+            </w:r>
+          </w:p>
+          <w:p>
+            <w:pPr>
+              <w:spacing w:after="20" w:before="60"/>
+            </w:pPr>
+            <w:r>
+              <w:rPr>
+                <w:rFonts w:ascii="Arial" w:cs="Arial" w:eastAsia="Arial" w:hAnsi="Arial"/>
+                <w:color w:val="808080"/>
+                <w:sz w:val="20"/>
+                <w:szCs w:val="20"/>
+              </w:rPr>
+              <w:t xml:space="preserve">__________________________________</w:t>
+            </w:r>
+          </w:p>
+        </w:tc>
+        <w:tc>
+          <w:tcPr>
+            <w:tcW w:type="dxa" w:w="1600"/>
+            <w:tcMar>
+              <w:top w:type="dxa" w:w="70"/>
+              <w:left w:type="dxa" w:w="110"/>
+              <w:bottom w:type="dxa" w:w="70"/>
+              <w:right w:type="dxa" w:w="110"/>
+            </w:tcMar>
+          </w:tcPr>
+          <w:p>
+            <w:pPr>
+              <w:spacing w:after="20" w:before="60"/>
+            </w:pPr>
+            <w:r>
+              <w:rPr>
+                <w:rFonts w:ascii="Arial" w:cs="Arial" w:eastAsia="Arial" w:hAnsi="Arial"/>
+                <w:color w:val="808080"/>
+                <w:sz w:val="20"/>
+                <w:szCs w:val="20"/>
+              </w:rPr>
+              <w:t xml:space="preserve">__________________________________</w:t>
+            </w:r>
+          </w:p>
+          <w:p>
+            <w:pPr>
+              <w:spacing w:after="20" w:before="60"/>
+            </w:pPr>
+            <w:r>
+              <w:rPr>
+                <w:rFonts w:ascii="Arial" w:cs="Arial" w:eastAsia="Arial" w:hAnsi="Arial"/>
+                <w:color w:val="808080"/>
+                <w:sz w:val="20"/>
+                <w:szCs w:val="20"/>
+              </w:rPr>
+              <w:t xml:space="preserve">__________________________________</w:t>
+            </w:r>
+          </w:p>
+        </w:tc>
+      </w:tr>
+      <w:tr>
+        <w:trPr>
+          <w:trHeight w:val="1000" w:hRule="atLeast"/>
+        </w:trPr>
+        <w:tc>
+          <w:tcPr>
+            <w:tcW w:type="dxa" w:w="640"/>
+            <w:tcMar>
+              <w:top w:type="dxa" w:w="70"/>
+              <w:left w:type="dxa" w:w="110"/>
+              <w:bottom w:type="dxa" w:w="70"/>
+              <w:right w:type="dxa" w:w="110"/>
+            </w:tcMar>
+          </w:tcPr>
+          <w:p>
+            <w:pPr>
+              <w:jc w:val="center"/>
+            </w:pPr>
+            <w:r>
+              <w:rPr>
+                <w:rFonts w:ascii="Arial" w:cs="Arial" w:eastAsia="Arial" w:hAnsi="Arial"/>
+                <w:b/>
+                <w:bCs/>
+                <w:color w:val="000000"/>
+                <w:sz w:val="21"/>
+                <w:szCs w:val="21"/>
+              </w:rPr>
+              <w:t xml:space="preserve">11</w:t>
+            </w:r>
+          </w:p>
+        </w:tc>
+        <w:tc>
+          <w:tcPr>
+            <w:tcW w:type="dxa" w:w="5360"/>
+            <w:tcMar>
+              <w:top w:type="dxa" w:w="70"/>
+              <w:left w:type="dxa" w:w="110"/>
+              <w:bottom w:type="dxa" w:w="70"/>
+              <w:right w:type="dxa" w:w="110"/>
+            </w:tcMar>
+          </w:tcPr>
+          <w:p>
+            <w:pPr>
+              <w:spacing w:after="60"/>
+            </w:pPr>
+            <w:r>
+              <w:rPr>
+                <w:rFonts w:ascii="Arial" w:cs="Arial" w:eastAsia="Arial" w:hAnsi="Arial"/>
+                <w:sz w:val="21"/>
+                <w:szCs w:val="21"/>
+              </w:rPr>
+              <w:t xml:space="preserve">Roberto goes to a pizza place. A pizza costs $12 plus $2 per topping. Write an expression to describe the cost.</w:t>
+            </w:r>
+          </w:p>
+          <w:p>
+            <w:r>
+              <w:rPr>
+                <w:rFonts w:ascii="Arial" w:cs="Arial" w:eastAsia="Arial" w:hAnsi="Arial"/>
+                <w:i/>
+                <w:iCs/>
+                <w:color w:val="595959"/>
+                <w:sz w:val="20"/>
+                <w:szCs w:val="20"/>
+              </w:rPr>
+              <w:t xml:space="preserve">If Roberto ordered 4 toppings, how much would the pizza cost?</w:t>
+            </w:r>
+          </w:p>
+        </w:tc>
+        <w:tc>
+          <w:tcPr>
+            <w:tcW w:type="dxa" w:w="1760"/>
+            <w:tcMar>
+              <w:top w:type="dxa" w:w="70"/>
+              <w:left w:type="dxa" w:w="110"/>
+              <w:bottom w:type="dxa" w:w="70"/>
+              <w:right w:type="dxa" w:w="110"/>
+            </w:tcMar>
+          </w:tcPr>
+          <w:p>
+            <w:pPr>
+              <w:spacing w:after="20" w:before="60"/>
+            </w:pPr>
+            <w:r>
+              <w:rPr>
+                <w:rFonts w:ascii="Arial" w:cs="Arial" w:eastAsia="Arial" w:hAnsi="Arial"/>
+                <w:color w:val="808080"/>
+                <w:sz w:val="20"/>
+                <w:szCs w:val="20"/>
+              </w:rPr>
+              <w:t xml:space="preserve">__________________________________</w:t>
+            </w:r>
+          </w:p>
+          <w:p>
+            <w:pPr>
+              <w:spacing w:after="20" w:before="60"/>
+            </w:pPr>
+            <w:r>
+              <w:rPr>
+                <w:rFonts w:ascii="Arial" w:cs="Arial" w:eastAsia="Arial" w:hAnsi="Arial"/>
+                <w:color w:val="808080"/>
+                <w:sz w:val="20"/>
+                <w:szCs w:val="20"/>
+              </w:rPr>
+              <w:t xml:space="preserve">__________________________________</w:t>
+            </w:r>
+          </w:p>
+        </w:tc>
+        <w:tc>
+          <w:tcPr>
+            <w:tcW w:type="dxa" w:w="1600"/>
+            <w:tcMar>
+              <w:top w:type="dxa" w:w="70"/>
+              <w:left w:type="dxa" w:w="110"/>
+              <w:bottom w:type="dxa" w:w="70"/>
+              <w:right w:type="dxa" w:w="110"/>
+            </w:tcMar>
+          </w:tcPr>
+          <w:p>
+            <w:pPr>
+              <w:spacing w:after="20" w:before="60"/>
+            </w:pPr>
+            <w:r>
+              <w:rPr>
+                <w:rFonts w:ascii="Arial" w:cs="Arial" w:eastAsia="Arial" w:hAnsi="Arial"/>
+                <w:color w:val="808080"/>
+                <w:sz w:val="20"/>
+                <w:szCs w:val="20"/>
+              </w:rPr>
+              <w:t xml:space="preserve">__________________________________</w:t>
+            </w:r>
+          </w:p>
+          <w:p>
+            <w:pPr>
+              <w:spacing w:after="20" w:before="60"/>
+            </w:pPr>
+            <w:r>
+              <w:rPr>
+                <w:rFonts w:ascii="Arial" w:cs="Arial" w:eastAsia="Arial" w:hAnsi="Arial"/>
+                <w:color w:val="808080"/>
+                <w:sz w:val="20"/>
+                <w:szCs w:val="20"/>
+              </w:rPr>
+              <w:t xml:space="preserve">__________________________________</w:t>
+            </w:r>
+          </w:p>
+        </w:tc>
+      </w:tr>
+    </w:tbl>
     <w:p>
       <w:r>
         <w:br w:type="page"/>
@@ -3585,7 +4363,7 @@
                 <w:sz w:val="21"/>
                 <w:szCs w:val="21"/>
               </w:rPr>
-              <w:t xml:space="preserve">•  Addition and multiplication can be written in either order:  9 + r = r + 9,  and  6 · h = h · 6  (same value).</w:t>
+              <w:t xml:space="preserve">•  Addition and multiplication can be written in either order:  a + b = b + a,  and  a · b = b · a  (same value).</w:t>
             </w:r>
           </w:p>
           <w:p>
@@ -3613,7 +4391,7 @@
                 <w:sz w:val="21"/>
                 <w:szCs w:val="21"/>
               </w:rPr>
-              <w:t xml:space="preserve">•  “less than” and “subtracted from” flip the order:  “5 less than x” → x – 5.</w:t>
+              <w:t xml:space="preserve">•  “less than” and “subtracted from” flip the order:  “8 less than n” → n – 8.</w:t>
             </w:r>
           </w:p>
           <w:p>
@@ -3627,7 +4405,7 @@
                 <w:sz w:val="21"/>
                 <w:szCs w:val="21"/>
               </w:rPr>
-              <w:t xml:space="preserve">•  A number written directly in front of a variable means multiply (it is the coefficient):  2g = 2 × g.</w:t>
+              <w:t xml:space="preserve">•  A number written directly in front of a variable means multiply (it is the coefficient):  5y = 5 × y.</w:t>
             </w:r>
           </w:p>
           <w:p>
@@ -3641,7 +4419,7 @@
                 <w:sz w:val="21"/>
                 <w:szCs w:val="21"/>
               </w:rPr>
-              <w:t xml:space="preserve">•  Use  6h,  6·h,  or  6(h)  for multiplication — avoid × so it isn’t mistaken for the variable x.</w:t>
+              <w:t xml:space="preserve">•  Use  4b,  4·b,  or  4(b)  for multiplication — avoid × so it isn’t mistaken for the variable x.</w:t>
             </w:r>
           </w:p>
           <w:p>
@@ -3702,7 +4480,7 @@
           <w:sz w:val="22"/>
           <w:szCs w:val="22"/>
         </w:rPr>
-        <w:t xml:space="preserve">Reversing subtraction: writing 5 – x for “5 less than x” (it should be x – 5).</w:t>
+        <w:t xml:space="preserve">Reversing subtraction: writing 8 – n for “8 less than n” (it should be n – 8).</w:t>
       </w:r>
     </w:p>
     <w:p>
@@ -3725,7 +4503,7 @@
           <w:sz w:val="22"/>
           <w:szCs w:val="22"/>
         </w:rPr>
-        <w:t xml:space="preserve">Reversing division / quotient order (“the quotient of m and 18” is m ÷ 18, not 18 ÷ m).</w:t>
+        <w:t xml:space="preserve">Reversing division / quotient order (“the quotient of a and b” is a ÷ b, not b ÷ a).</w:t>
       </w:r>
     </w:p>
     <w:p>
@@ -3771,7 +4549,7 @@
           <w:sz w:val="22"/>
           <w:szCs w:val="22"/>
         </w:rPr>
-        <w:t xml:space="preserve">Forgetting that “twice / double” means × 2 (so “twice a number g” is 2g).</w:t>
+        <w:t xml:space="preserve">Forgetting that “twice / double” means × 2 (so “twice a number n” is 2n).</w:t>
       </w:r>
     </w:p>
     <w:p>
@@ -3817,7 +4595,7 @@
           <w:sz w:val="22"/>
           <w:szCs w:val="22"/>
         </w:rPr>
-        <w:t xml:space="preserve">Dropping the constant — e.g., writing 2t for the pizza cost and forgetting the $12 base.</w:t>
+        <w:t xml:space="preserve">Dropping the constant in a “flat fee + rate” situation (e.g., writing only the rate term and forgetting the starting amount).</w:t>
       </w:r>
     </w:p>
     <w:p>
@@ -3960,7 +4738,7 @@
           <w:sz w:val="22"/>
           <w:szCs w:val="22"/>
         </w:rPr>
-        <w:t xml:space="preserve"> also includes at least one variable. We practiced translating between words and symbols in both directions — turning phrases like “7.9 more than the product of 6 and h” into </w:t>
+        <w:t xml:space="preserve"> also includes at least one variable. We practiced translating between words and symbols in both directions — turning a phrase such as “three more than twice a number” into </w:t>
       </w:r>
       <w:r>
         <w:rPr>
@@ -3973,7 +4751,7 @@
           <w:sz w:val="22"/>
           <w:szCs w:val="22"/>
         </w:rPr>
-        <w:t xml:space="preserve">6h + 7.9</w:t>
+        <w:t xml:space="preserve">2n + 3</w:t>
       </w:r>
       <w:r>
         <w:rPr>

</xml_diff>

<commit_message>
Make vocabulary a 2-column fill-in table with worked examples
Vocabulary is now two columns: column 1 is the definition sentence with
the vocab word blanked inline (A ______ is ...), column 2 shows a filled-in
example. Practice problems remain blank; no answers leak.

Co-Authored-By: Claude Opus 4.8 <noreply@anthropic.com>
Claude-Session: https://claude.ai/code/session_01FC3BfbH3eZoJiVptb2oNST
</commit_message>
<xml_diff>
--- a/algebra1-notes/Algebra1_Unit1_Lesson1_Variables_and_Expressions.docx
+++ b/algebra1-notes/Algebra1_Unit1_Lesson1_Variables_and_Expressions.docx
@@ -509,7 +509,7 @@
           <w:sz w:val="22"/>
           <w:szCs w:val="22"/>
         </w:rPr>
-        <w:t xml:space="preserve">Read each definition and write the correct vocabulary word in the first column. Then write your own example in the last column.</w:t>
+        <w:t xml:space="preserve">Fill in each blank with the correct vocabulary word. Use the Word Bank below if you need help; the examples are provided.</w:t>
       </w:r>
     </w:p>
     <w:tbl>
@@ -525,9 +525,8 @@
         </w:tblBorders>
       </w:tblPr>
       <w:tblGrid>
-        <w:gridCol w:w="2600"/>
-        <w:gridCol w:w="4560"/>
-        <w:gridCol w:w="2200"/>
+        <w:gridCol w:w="6860"/>
+        <w:gridCol w:w="2500"/>
       </w:tblGrid>
       <w:tr>
         <w:trPr>
@@ -535,7 +534,7 @@
         </w:trPr>
         <w:tc>
           <w:tcPr>
-            <w:tcW w:type="dxa" w:w="2600"/>
+            <w:tcW w:type="dxa" w:w="6860"/>
             <w:shd w:fill="DEEAF6" w:val="clear"/>
             <w:tcMar>
               <w:top w:type="dxa" w:w="70"/>
@@ -557,13 +556,13 @@
                 <w:sz w:val="21"/>
                 <w:szCs w:val="21"/>
               </w:rPr>
-              <w:t xml:space="preserve">Vocabulary Word</w:t>
-            </w:r>
-          </w:p>
-        </w:tc>
-        <w:tc>
-          <w:tcPr>
-            <w:tcW w:type="dxa" w:w="4560"/>
+              <w:t xml:space="preserve">Vocabulary &amp; Definition  (fill in the blank)</w:t>
+            </w:r>
+          </w:p>
+        </w:tc>
+        <w:tc>
+          <w:tcPr>
+            <w:tcW w:type="dxa" w:w="2500"/>
             <w:shd w:fill="DEEAF6" w:val="clear"/>
             <w:tcMar>
               <w:top w:type="dxa" w:w="70"/>
@@ -585,34 +584,6 @@
                 <w:sz w:val="21"/>
                 <w:szCs w:val="21"/>
               </w:rPr>
-              <w:t xml:space="preserve">Definition</w:t>
-            </w:r>
-          </w:p>
-        </w:tc>
-        <w:tc>
-          <w:tcPr>
-            <w:tcW w:type="dxa" w:w="2200"/>
-            <w:shd w:fill="DEEAF6" w:val="clear"/>
-            <w:tcMar>
-              <w:top w:type="dxa" w:w="70"/>
-              <w:left w:type="dxa" w:w="110"/>
-              <w:bottom w:type="dxa" w:w="70"/>
-              <w:right w:type="dxa" w:w="110"/>
-            </w:tcMar>
-          </w:tcPr>
-          <w:p>
-            <w:pPr>
-              <w:jc w:val="center"/>
-            </w:pPr>
-            <w:r>
-              <w:rPr>
-                <w:rFonts w:ascii="Arial" w:cs="Arial" w:eastAsia="Arial" w:hAnsi="Arial"/>
-                <w:b/>
-                <w:bCs/>
-                <w:color w:val="1F3864"/>
-                <w:sz w:val="21"/>
-                <w:szCs w:val="21"/>
-              </w:rPr>
               <w:t xml:space="preserve">Example</w:t>
             </w:r>
           </w:p>
@@ -620,632 +591,456 @@
       </w:tr>
       <w:tr>
         <w:trPr>
-          <w:trHeight w:val="620" w:hRule="atLeast"/>
+          <w:trHeight w:val="560" w:hRule="atLeast"/>
         </w:trPr>
         <w:tc>
           <w:tcPr>
-            <w:tcW w:type="dxa" w:w="2600"/>
-            <w:tcMar>
-              <w:top w:type="dxa" w:w="70"/>
-              <w:left w:type="dxa" w:w="110"/>
-              <w:bottom w:type="dxa" w:w="70"/>
-              <w:right w:type="dxa" w:w="110"/>
-            </w:tcMar>
-          </w:tcPr>
-          <w:p>
-            <w:pPr>
-              <w:spacing w:after="20" w:before="60"/>
-            </w:pPr>
-            <w:r>
-              <w:rPr>
-                <w:rFonts w:ascii="Arial" w:cs="Arial" w:eastAsia="Arial" w:hAnsi="Arial"/>
-                <w:color w:val="808080"/>
+            <w:tcW w:type="dxa" w:w="6860"/>
+            <w:tcMar>
+              <w:top w:type="dxa" w:w="70"/>
+              <w:left w:type="dxa" w:w="110"/>
+              <w:bottom w:type="dxa" w:w="70"/>
+              <w:right w:type="dxa" w:w="110"/>
+            </w:tcMar>
+          </w:tcPr>
+          <w:p>
+            <w:pPr>
+              <w:spacing w:after="60" w:before="60"/>
+            </w:pPr>
+            <w:r>
+              <w:rPr>
+                <w:rFonts w:ascii="Arial" w:cs="Arial" w:eastAsia="Arial" w:hAnsi="Arial"/>
+                <w:sz w:val="21"/>
+                <w:szCs w:val="21"/>
+              </w:rPr>
+              <w:t xml:space="preserve">A ________________ is a letter or a symbol used to represent a value that can change.</w:t>
+            </w:r>
+          </w:p>
+        </w:tc>
+        <w:tc>
+          <w:tcPr>
+            <w:tcW w:type="dxa" w:w="2500"/>
+            <w:tcMar>
+              <w:top w:type="dxa" w:w="70"/>
+              <w:left w:type="dxa" w:w="110"/>
+              <w:bottom w:type="dxa" w:w="70"/>
+              <w:right w:type="dxa" w:w="110"/>
+            </w:tcMar>
+          </w:tcPr>
+          <w:p>
+            <w:pPr>
+              <w:spacing w:after="60" w:before="60"/>
+              <w:jc w:val="center"/>
+            </w:pPr>
+            <w:r>
+              <w:rPr>
+                <w:rFonts w:ascii="Arial" w:cs="Arial" w:eastAsia="Arial" w:hAnsi="Arial"/>
+                <w:i/>
+                <w:iCs/>
+                <w:color w:val="595959"/>
                 <w:sz w:val="20"/>
                 <w:szCs w:val="20"/>
               </w:rPr>
-              <w:t xml:space="preserve">__________________________________</w:t>
-            </w:r>
-          </w:p>
-        </w:tc>
-        <w:tc>
-          <w:tcPr>
-            <w:tcW w:type="dxa" w:w="4560"/>
-            <w:tcMar>
-              <w:top w:type="dxa" w:w="70"/>
-              <w:left w:type="dxa" w:w="110"/>
-              <w:bottom w:type="dxa" w:w="70"/>
-              <w:right w:type="dxa" w:w="110"/>
-            </w:tcMar>
-          </w:tcPr>
-          <w:p>
-            <w:r>
-              <w:rPr>
-                <w:rFonts w:ascii="Arial" w:cs="Arial" w:eastAsia="Arial" w:hAnsi="Arial"/>
-                <w:b w:val="false"/>
-                <w:bCs w:val="false"/>
-                <w:color w:val="000000"/>
-                <w:sz w:val="21"/>
-                <w:szCs w:val="21"/>
-              </w:rPr>
-              <w:t xml:space="preserve">A letter or a symbol used to represent a value that can change.</w:t>
-            </w:r>
-          </w:p>
-        </w:tc>
-        <w:tc>
-          <w:tcPr>
-            <w:tcW w:type="dxa" w:w="2200"/>
-            <w:tcMar>
-              <w:top w:type="dxa" w:w="70"/>
-              <w:left w:type="dxa" w:w="110"/>
-              <w:bottom w:type="dxa" w:w="70"/>
-              <w:right w:type="dxa" w:w="110"/>
-            </w:tcMar>
-          </w:tcPr>
-          <w:p>
-            <w:pPr>
-              <w:spacing w:after="20" w:before="60"/>
-            </w:pPr>
-            <w:r>
-              <w:rPr>
-                <w:rFonts w:ascii="Arial" w:cs="Arial" w:eastAsia="Arial" w:hAnsi="Arial"/>
-                <w:color w:val="808080"/>
-                <w:sz w:val="20"/>
-                <w:szCs w:val="20"/>
-              </w:rPr>
-              <w:t xml:space="preserve">__________________________________</w:t>
+              <w:t xml:space="preserve">x,  m,  g,  h</w:t>
             </w:r>
           </w:p>
         </w:tc>
       </w:tr>
       <w:tr>
         <w:trPr>
-          <w:trHeight w:val="620" w:hRule="atLeast"/>
+          <w:trHeight w:val="560" w:hRule="atLeast"/>
         </w:trPr>
         <w:tc>
           <w:tcPr>
-            <w:tcW w:type="dxa" w:w="2600"/>
-            <w:tcMar>
-              <w:top w:type="dxa" w:w="70"/>
-              <w:left w:type="dxa" w:w="110"/>
-              <w:bottom w:type="dxa" w:w="70"/>
-              <w:right w:type="dxa" w:w="110"/>
-            </w:tcMar>
-          </w:tcPr>
-          <w:p>
-            <w:pPr>
-              <w:spacing w:after="20" w:before="60"/>
-            </w:pPr>
-            <w:r>
-              <w:rPr>
-                <w:rFonts w:ascii="Arial" w:cs="Arial" w:eastAsia="Arial" w:hAnsi="Arial"/>
-                <w:color w:val="808080"/>
+            <w:tcW w:type="dxa" w:w="6860"/>
+            <w:tcMar>
+              <w:top w:type="dxa" w:w="70"/>
+              <w:left w:type="dxa" w:w="110"/>
+              <w:bottom w:type="dxa" w:w="70"/>
+              <w:right w:type="dxa" w:w="110"/>
+            </w:tcMar>
+          </w:tcPr>
+          <w:p>
+            <w:pPr>
+              <w:spacing w:after="60" w:before="60"/>
+            </w:pPr>
+            <w:r>
+              <w:rPr>
+                <w:rFonts w:ascii="Arial" w:cs="Arial" w:eastAsia="Arial" w:hAnsi="Arial"/>
+                <w:sz w:val="21"/>
+                <w:szCs w:val="21"/>
+              </w:rPr>
+              <w:t xml:space="preserve">A ________________ is a value that does not change.</w:t>
+            </w:r>
+          </w:p>
+        </w:tc>
+        <w:tc>
+          <w:tcPr>
+            <w:tcW w:type="dxa" w:w="2500"/>
+            <w:tcMar>
+              <w:top w:type="dxa" w:w="70"/>
+              <w:left w:type="dxa" w:w="110"/>
+              <w:bottom w:type="dxa" w:w="70"/>
+              <w:right w:type="dxa" w:w="110"/>
+            </w:tcMar>
+          </w:tcPr>
+          <w:p>
+            <w:pPr>
+              <w:spacing w:after="60" w:before="60"/>
+              <w:jc w:val="center"/>
+            </w:pPr>
+            <w:r>
+              <w:rPr>
+                <w:rFonts w:ascii="Arial" w:cs="Arial" w:eastAsia="Arial" w:hAnsi="Arial"/>
+                <w:i/>
+                <w:iCs/>
+                <w:color w:val="595959"/>
                 <w:sz w:val="20"/>
                 <w:szCs w:val="20"/>
               </w:rPr>
-              <w:t xml:space="preserve">__________________________________</w:t>
-            </w:r>
-          </w:p>
-        </w:tc>
-        <w:tc>
-          <w:tcPr>
-            <w:tcW w:type="dxa" w:w="4560"/>
-            <w:tcMar>
-              <w:top w:type="dxa" w:w="70"/>
-              <w:left w:type="dxa" w:w="110"/>
-              <w:bottom w:type="dxa" w:w="70"/>
-              <w:right w:type="dxa" w:w="110"/>
-            </w:tcMar>
-          </w:tcPr>
-          <w:p>
-            <w:r>
-              <w:rPr>
-                <w:rFonts w:ascii="Arial" w:cs="Arial" w:eastAsia="Arial" w:hAnsi="Arial"/>
-                <w:b w:val="false"/>
-                <w:bCs w:val="false"/>
-                <w:color w:val="000000"/>
-                <w:sz w:val="21"/>
-                <w:szCs w:val="21"/>
-              </w:rPr>
-              <w:t xml:space="preserve">A value that does not change.</w:t>
-            </w:r>
-          </w:p>
-        </w:tc>
-        <w:tc>
-          <w:tcPr>
-            <w:tcW w:type="dxa" w:w="2200"/>
-            <w:tcMar>
-              <w:top w:type="dxa" w:w="70"/>
-              <w:left w:type="dxa" w:w="110"/>
-              <w:bottom w:type="dxa" w:w="70"/>
-              <w:right w:type="dxa" w:w="110"/>
-            </w:tcMar>
-          </w:tcPr>
-          <w:p>
-            <w:pPr>
-              <w:spacing w:after="20" w:before="60"/>
-            </w:pPr>
-            <w:r>
-              <w:rPr>
-                <w:rFonts w:ascii="Arial" w:cs="Arial" w:eastAsia="Arial" w:hAnsi="Arial"/>
-                <w:color w:val="808080"/>
-                <w:sz w:val="20"/>
-                <w:szCs w:val="20"/>
-              </w:rPr>
-              <w:t xml:space="preserve">__________________________________</w:t>
+              <w:t xml:space="preserve">12,  7.9,  100</w:t>
             </w:r>
           </w:p>
         </w:tc>
       </w:tr>
       <w:tr>
         <w:trPr>
-          <w:trHeight w:val="620" w:hRule="atLeast"/>
+          <w:trHeight w:val="560" w:hRule="atLeast"/>
         </w:trPr>
         <w:tc>
           <w:tcPr>
-            <w:tcW w:type="dxa" w:w="2600"/>
-            <w:tcMar>
-              <w:top w:type="dxa" w:w="70"/>
-              <w:left w:type="dxa" w:w="110"/>
-              <w:bottom w:type="dxa" w:w="70"/>
-              <w:right w:type="dxa" w:w="110"/>
-            </w:tcMar>
-          </w:tcPr>
-          <w:p>
-            <w:pPr>
-              <w:spacing w:after="20" w:before="60"/>
-            </w:pPr>
-            <w:r>
-              <w:rPr>
-                <w:rFonts w:ascii="Arial" w:cs="Arial" w:eastAsia="Arial" w:hAnsi="Arial"/>
-                <w:color w:val="808080"/>
+            <w:tcW w:type="dxa" w:w="6860"/>
+            <w:tcMar>
+              <w:top w:type="dxa" w:w="70"/>
+              <w:left w:type="dxa" w:w="110"/>
+              <w:bottom w:type="dxa" w:w="70"/>
+              <w:right w:type="dxa" w:w="110"/>
+            </w:tcMar>
+          </w:tcPr>
+          <w:p>
+            <w:pPr>
+              <w:spacing w:after="60" w:before="60"/>
+            </w:pPr>
+            <w:r>
+              <w:rPr>
+                <w:rFonts w:ascii="Arial" w:cs="Arial" w:eastAsia="Arial" w:hAnsi="Arial"/>
+                <w:sz w:val="21"/>
+                <w:szCs w:val="21"/>
+              </w:rPr>
+              <w:t xml:space="preserve">A ________________ contains only constants and operations.</w:t>
+            </w:r>
+          </w:p>
+        </w:tc>
+        <w:tc>
+          <w:tcPr>
+            <w:tcW w:type="dxa" w:w="2500"/>
+            <w:tcMar>
+              <w:top w:type="dxa" w:w="70"/>
+              <w:left w:type="dxa" w:w="110"/>
+              <w:bottom w:type="dxa" w:w="70"/>
+              <w:right w:type="dxa" w:w="110"/>
+            </w:tcMar>
+          </w:tcPr>
+          <w:p>
+            <w:pPr>
+              <w:spacing w:after="60" w:before="60"/>
+              <w:jc w:val="center"/>
+            </w:pPr>
+            <w:r>
+              <w:rPr>
+                <w:rFonts w:ascii="Arial" w:cs="Arial" w:eastAsia="Arial" w:hAnsi="Arial"/>
+                <w:i/>
+                <w:iCs/>
+                <w:color w:val="595959"/>
                 <w:sz w:val="20"/>
                 <w:szCs w:val="20"/>
               </w:rPr>
-              <w:t xml:space="preserve">__________________________________</w:t>
-            </w:r>
-          </w:p>
-        </w:tc>
-        <w:tc>
-          <w:tcPr>
-            <w:tcW w:type="dxa" w:w="4560"/>
-            <w:tcMar>
-              <w:top w:type="dxa" w:w="70"/>
-              <w:left w:type="dxa" w:w="110"/>
-              <w:bottom w:type="dxa" w:w="70"/>
-              <w:right w:type="dxa" w:w="110"/>
-            </w:tcMar>
-          </w:tcPr>
-          <w:p>
-            <w:r>
-              <w:rPr>
-                <w:rFonts w:ascii="Arial" w:cs="Arial" w:eastAsia="Arial" w:hAnsi="Arial"/>
-                <w:b w:val="false"/>
-                <w:bCs w:val="false"/>
-                <w:color w:val="000000"/>
-                <w:sz w:val="21"/>
-                <w:szCs w:val="21"/>
-              </w:rPr>
-              <w:t xml:space="preserve">An expression that contains only constants and operations.</w:t>
-            </w:r>
-          </w:p>
-        </w:tc>
-        <w:tc>
-          <w:tcPr>
-            <w:tcW w:type="dxa" w:w="2200"/>
-            <w:tcMar>
-              <w:top w:type="dxa" w:w="70"/>
-              <w:left w:type="dxa" w:w="110"/>
-              <w:bottom w:type="dxa" w:w="70"/>
-              <w:right w:type="dxa" w:w="110"/>
-            </w:tcMar>
-          </w:tcPr>
-          <w:p>
-            <w:pPr>
-              <w:spacing w:after="20" w:before="60"/>
-            </w:pPr>
-            <w:r>
-              <w:rPr>
-                <w:rFonts w:ascii="Arial" w:cs="Arial" w:eastAsia="Arial" w:hAnsi="Arial"/>
-                <w:color w:val="808080"/>
-                <w:sz w:val="20"/>
-                <w:szCs w:val="20"/>
-              </w:rPr>
-              <w:t xml:space="preserve">__________________________________</w:t>
+              <w:t xml:space="preserve">6 + 4 × 2</w:t>
             </w:r>
           </w:p>
         </w:tc>
       </w:tr>
       <w:tr>
         <w:trPr>
-          <w:trHeight w:val="620" w:hRule="atLeast"/>
+          <w:trHeight w:val="560" w:hRule="atLeast"/>
         </w:trPr>
         <w:tc>
           <w:tcPr>
-            <w:tcW w:type="dxa" w:w="2600"/>
-            <w:tcMar>
-              <w:top w:type="dxa" w:w="70"/>
-              <w:left w:type="dxa" w:w="110"/>
-              <w:bottom w:type="dxa" w:w="70"/>
-              <w:right w:type="dxa" w:w="110"/>
-            </w:tcMar>
-          </w:tcPr>
-          <w:p>
-            <w:pPr>
-              <w:spacing w:after="20" w:before="60"/>
-            </w:pPr>
-            <w:r>
-              <w:rPr>
-                <w:rFonts w:ascii="Arial" w:cs="Arial" w:eastAsia="Arial" w:hAnsi="Arial"/>
-                <w:color w:val="808080"/>
+            <w:tcW w:type="dxa" w:w="6860"/>
+            <w:tcMar>
+              <w:top w:type="dxa" w:w="70"/>
+              <w:left w:type="dxa" w:w="110"/>
+              <w:bottom w:type="dxa" w:w="70"/>
+              <w:right w:type="dxa" w:w="110"/>
+            </w:tcMar>
+          </w:tcPr>
+          <w:p>
+            <w:pPr>
+              <w:spacing w:after="60" w:before="60"/>
+            </w:pPr>
+            <w:r>
+              <w:rPr>
+                <w:rFonts w:ascii="Arial" w:cs="Arial" w:eastAsia="Arial" w:hAnsi="Arial"/>
+                <w:sz w:val="21"/>
+                <w:szCs w:val="21"/>
+              </w:rPr>
+              <w:t xml:space="preserve">An ________________ may contain variables, constants, and operations.</w:t>
+            </w:r>
+          </w:p>
+        </w:tc>
+        <w:tc>
+          <w:tcPr>
+            <w:tcW w:type="dxa" w:w="2500"/>
+            <w:tcMar>
+              <w:top w:type="dxa" w:w="70"/>
+              <w:left w:type="dxa" w:w="110"/>
+              <w:bottom w:type="dxa" w:w="70"/>
+              <w:right w:type="dxa" w:w="110"/>
+            </w:tcMar>
+          </w:tcPr>
+          <w:p>
+            <w:pPr>
+              <w:spacing w:after="60" w:before="60"/>
+              <w:jc w:val="center"/>
+            </w:pPr>
+            <w:r>
+              <w:rPr>
+                <w:rFonts w:ascii="Arial" w:cs="Arial" w:eastAsia="Arial" w:hAnsi="Arial"/>
+                <w:i/>
+                <w:iCs/>
+                <w:color w:val="595959"/>
                 <w:sz w:val="20"/>
                 <w:szCs w:val="20"/>
               </w:rPr>
-              <w:t xml:space="preserve">__________________________________</w:t>
-            </w:r>
-          </w:p>
-        </w:tc>
-        <w:tc>
-          <w:tcPr>
-            <w:tcW w:type="dxa" w:w="4560"/>
-            <w:tcMar>
-              <w:top w:type="dxa" w:w="70"/>
-              <w:left w:type="dxa" w:w="110"/>
-              <w:bottom w:type="dxa" w:w="70"/>
-              <w:right w:type="dxa" w:w="110"/>
-            </w:tcMar>
-          </w:tcPr>
-          <w:p>
-            <w:r>
-              <w:rPr>
-                <w:rFonts w:ascii="Arial" w:cs="Arial" w:eastAsia="Arial" w:hAnsi="Arial"/>
-                <w:b w:val="false"/>
-                <w:bCs w:val="false"/>
-                <w:color w:val="000000"/>
-                <w:sz w:val="21"/>
-                <w:szCs w:val="21"/>
-              </w:rPr>
-              <w:t xml:space="preserve">An expression that may contain variables, constants, and operations.</w:t>
-            </w:r>
-          </w:p>
-        </w:tc>
-        <w:tc>
-          <w:tcPr>
-            <w:tcW w:type="dxa" w:w="2200"/>
-            <w:tcMar>
-              <w:top w:type="dxa" w:w="70"/>
-              <w:left w:type="dxa" w:w="110"/>
-              <w:bottom w:type="dxa" w:w="70"/>
-              <w:right w:type="dxa" w:w="110"/>
-            </w:tcMar>
-          </w:tcPr>
-          <w:p>
-            <w:pPr>
-              <w:spacing w:after="20" w:before="60"/>
-            </w:pPr>
-            <w:r>
-              <w:rPr>
-                <w:rFonts w:ascii="Arial" w:cs="Arial" w:eastAsia="Arial" w:hAnsi="Arial"/>
-                <w:color w:val="808080"/>
-                <w:sz w:val="20"/>
-                <w:szCs w:val="20"/>
-              </w:rPr>
-              <w:t xml:space="preserve">__________________________________</w:t>
+              <w:t xml:space="preserve">3x + 5</w:t>
             </w:r>
           </w:p>
         </w:tc>
       </w:tr>
       <w:tr>
         <w:trPr>
-          <w:trHeight w:val="620" w:hRule="atLeast"/>
+          <w:trHeight w:val="560" w:hRule="atLeast"/>
         </w:trPr>
         <w:tc>
           <w:tcPr>
-            <w:tcW w:type="dxa" w:w="2600"/>
-            <w:tcMar>
-              <w:top w:type="dxa" w:w="70"/>
-              <w:left w:type="dxa" w:w="110"/>
-              <w:bottom w:type="dxa" w:w="70"/>
-              <w:right w:type="dxa" w:w="110"/>
-            </w:tcMar>
-          </w:tcPr>
-          <w:p>
-            <w:pPr>
-              <w:spacing w:after="20" w:before="60"/>
-            </w:pPr>
-            <w:r>
-              <w:rPr>
-                <w:rFonts w:ascii="Arial" w:cs="Arial" w:eastAsia="Arial" w:hAnsi="Arial"/>
-                <w:color w:val="808080"/>
+            <w:tcW w:type="dxa" w:w="6860"/>
+            <w:tcMar>
+              <w:top w:type="dxa" w:w="70"/>
+              <w:left w:type="dxa" w:w="110"/>
+              <w:bottom w:type="dxa" w:w="70"/>
+              <w:right w:type="dxa" w:w="110"/>
+            </w:tcMar>
+          </w:tcPr>
+          <w:p>
+            <w:pPr>
+              <w:spacing w:after="60" w:before="60"/>
+            </w:pPr>
+            <w:r>
+              <w:rPr>
+                <w:rFonts w:ascii="Arial" w:cs="Arial" w:eastAsia="Arial" w:hAnsi="Arial"/>
+                <w:sz w:val="21"/>
+                <w:szCs w:val="21"/>
+              </w:rPr>
+              <w:t xml:space="preserve">A ________________ is a single number, a variable, or the product/quotient of numbers and variables, separated by + or – signs.</w:t>
+            </w:r>
+          </w:p>
+        </w:tc>
+        <w:tc>
+          <w:tcPr>
+            <w:tcW w:type="dxa" w:w="2500"/>
+            <w:tcMar>
+              <w:top w:type="dxa" w:w="70"/>
+              <w:left w:type="dxa" w:w="110"/>
+              <w:bottom w:type="dxa" w:w="70"/>
+              <w:right w:type="dxa" w:w="110"/>
+            </w:tcMar>
+          </w:tcPr>
+          <w:p>
+            <w:pPr>
+              <w:spacing w:after="60" w:before="60"/>
+              <w:jc w:val="center"/>
+            </w:pPr>
+            <w:r>
+              <w:rPr>
+                <w:rFonts w:ascii="Arial" w:cs="Arial" w:eastAsia="Arial" w:hAnsi="Arial"/>
+                <w:i/>
+                <w:iCs/>
+                <w:color w:val="595959"/>
                 <w:sz w:val="20"/>
                 <w:szCs w:val="20"/>
               </w:rPr>
-              <w:t xml:space="preserve">__________________________________</w:t>
-            </w:r>
-          </w:p>
-        </w:tc>
-        <w:tc>
-          <w:tcPr>
-            <w:tcW w:type="dxa" w:w="4560"/>
-            <w:tcMar>
-              <w:top w:type="dxa" w:w="70"/>
-              <w:left w:type="dxa" w:w="110"/>
-              <w:bottom w:type="dxa" w:w="70"/>
-              <w:right w:type="dxa" w:w="110"/>
-            </w:tcMar>
-          </w:tcPr>
-          <w:p>
-            <w:r>
-              <w:rPr>
-                <w:rFonts w:ascii="Arial" w:cs="Arial" w:eastAsia="Arial" w:hAnsi="Arial"/>
-                <w:b w:val="false"/>
-                <w:bCs w:val="false"/>
-                <w:color w:val="000000"/>
-                <w:sz w:val="21"/>
-                <w:szCs w:val="21"/>
-              </w:rPr>
-              <w:t xml:space="preserve">A single number, a variable, or the product/quotient of numbers and variables, separated by + or – signs.</w:t>
-            </w:r>
-          </w:p>
-        </w:tc>
-        <w:tc>
-          <w:tcPr>
-            <w:tcW w:type="dxa" w:w="2200"/>
-            <w:tcMar>
-              <w:top w:type="dxa" w:w="70"/>
-              <w:left w:type="dxa" w:w="110"/>
-              <w:bottom w:type="dxa" w:w="70"/>
-              <w:right w:type="dxa" w:w="110"/>
-            </w:tcMar>
-          </w:tcPr>
-          <w:p>
-            <w:pPr>
-              <w:spacing w:after="20" w:before="60"/>
-            </w:pPr>
-            <w:r>
-              <w:rPr>
-                <w:rFonts w:ascii="Arial" w:cs="Arial" w:eastAsia="Arial" w:hAnsi="Arial"/>
-                <w:color w:val="808080"/>
-                <w:sz w:val="20"/>
-                <w:szCs w:val="20"/>
-              </w:rPr>
-              <w:t xml:space="preserve">__________________________________</w:t>
+              <w:t xml:space="preserve">In 4x + 9, the terms are 4x and 9</w:t>
             </w:r>
           </w:p>
         </w:tc>
       </w:tr>
       <w:tr>
         <w:trPr>
-          <w:trHeight w:val="620" w:hRule="atLeast"/>
+          <w:trHeight w:val="560" w:hRule="atLeast"/>
         </w:trPr>
         <w:tc>
           <w:tcPr>
-            <w:tcW w:type="dxa" w:w="2600"/>
-            <w:tcMar>
-              <w:top w:type="dxa" w:w="70"/>
-              <w:left w:type="dxa" w:w="110"/>
-              <w:bottom w:type="dxa" w:w="70"/>
-              <w:right w:type="dxa" w:w="110"/>
-            </w:tcMar>
-          </w:tcPr>
-          <w:p>
-            <w:pPr>
-              <w:spacing w:after="20" w:before="60"/>
-            </w:pPr>
-            <w:r>
-              <w:rPr>
-                <w:rFonts w:ascii="Arial" w:cs="Arial" w:eastAsia="Arial" w:hAnsi="Arial"/>
-                <w:color w:val="808080"/>
+            <w:tcW w:type="dxa" w:w="6860"/>
+            <w:tcMar>
+              <w:top w:type="dxa" w:w="70"/>
+              <w:left w:type="dxa" w:w="110"/>
+              <w:bottom w:type="dxa" w:w="70"/>
+              <w:right w:type="dxa" w:w="110"/>
+            </w:tcMar>
+          </w:tcPr>
+          <w:p>
+            <w:pPr>
+              <w:spacing w:after="60" w:before="60"/>
+            </w:pPr>
+            <w:r>
+              <w:rPr>
+                <w:rFonts w:ascii="Arial" w:cs="Arial" w:eastAsia="Arial" w:hAnsi="Arial"/>
+                <w:sz w:val="21"/>
+                <w:szCs w:val="21"/>
+              </w:rPr>
+              <w:t xml:space="preserve">A ________________ is the number that is multiplied by a variable in a term.</w:t>
+            </w:r>
+          </w:p>
+        </w:tc>
+        <w:tc>
+          <w:tcPr>
+            <w:tcW w:type="dxa" w:w="2500"/>
+            <w:tcMar>
+              <w:top w:type="dxa" w:w="70"/>
+              <w:left w:type="dxa" w:w="110"/>
+              <w:bottom w:type="dxa" w:w="70"/>
+              <w:right w:type="dxa" w:w="110"/>
+            </w:tcMar>
+          </w:tcPr>
+          <w:p>
+            <w:pPr>
+              <w:spacing w:after="60" w:before="60"/>
+              <w:jc w:val="center"/>
+            </w:pPr>
+            <w:r>
+              <w:rPr>
+                <w:rFonts w:ascii="Arial" w:cs="Arial" w:eastAsia="Arial" w:hAnsi="Arial"/>
+                <w:i/>
+                <w:iCs/>
+                <w:color w:val="595959"/>
                 <w:sz w:val="20"/>
                 <w:szCs w:val="20"/>
               </w:rPr>
-              <w:t xml:space="preserve">__________________________________</w:t>
-            </w:r>
-          </w:p>
-        </w:tc>
-        <w:tc>
-          <w:tcPr>
-            <w:tcW w:type="dxa" w:w="4560"/>
-            <w:tcMar>
-              <w:top w:type="dxa" w:w="70"/>
-              <w:left w:type="dxa" w:w="110"/>
-              <w:bottom w:type="dxa" w:w="70"/>
-              <w:right w:type="dxa" w:w="110"/>
-            </w:tcMar>
-          </w:tcPr>
-          <w:p>
-            <w:r>
-              <w:rPr>
-                <w:rFonts w:ascii="Arial" w:cs="Arial" w:eastAsia="Arial" w:hAnsi="Arial"/>
-                <w:b w:val="false"/>
-                <w:bCs w:val="false"/>
-                <w:color w:val="000000"/>
-                <w:sz w:val="21"/>
-                <w:szCs w:val="21"/>
-              </w:rPr>
-              <w:t xml:space="preserve">The number that is multiplied by a variable in a term.</w:t>
-            </w:r>
-          </w:p>
-        </w:tc>
-        <w:tc>
-          <w:tcPr>
-            <w:tcW w:type="dxa" w:w="2200"/>
-            <w:tcMar>
-              <w:top w:type="dxa" w:w="70"/>
-              <w:left w:type="dxa" w:w="110"/>
-              <w:bottom w:type="dxa" w:w="70"/>
-              <w:right w:type="dxa" w:w="110"/>
-            </w:tcMar>
-          </w:tcPr>
-          <w:p>
-            <w:pPr>
-              <w:spacing w:after="20" w:before="60"/>
-            </w:pPr>
-            <w:r>
-              <w:rPr>
-                <w:rFonts w:ascii="Arial" w:cs="Arial" w:eastAsia="Arial" w:hAnsi="Arial"/>
-                <w:color w:val="808080"/>
-                <w:sz w:val="20"/>
-                <w:szCs w:val="20"/>
-              </w:rPr>
-              <w:t xml:space="preserve">__________________________________</w:t>
+              <w:t xml:space="preserve">In 5y, the coefficient is 5</w:t>
             </w:r>
           </w:p>
         </w:tc>
       </w:tr>
       <w:tr>
         <w:trPr>
-          <w:trHeight w:val="620" w:hRule="atLeast"/>
+          <w:trHeight w:val="560" w:hRule="atLeast"/>
         </w:trPr>
         <w:tc>
           <w:tcPr>
-            <w:tcW w:type="dxa" w:w="2600"/>
-            <w:tcMar>
-              <w:top w:type="dxa" w:w="70"/>
-              <w:left w:type="dxa" w:w="110"/>
-              <w:bottom w:type="dxa" w:w="70"/>
-              <w:right w:type="dxa" w:w="110"/>
-            </w:tcMar>
-          </w:tcPr>
-          <w:p>
-            <w:pPr>
-              <w:spacing w:after="20" w:before="60"/>
-            </w:pPr>
-            <w:r>
-              <w:rPr>
-                <w:rFonts w:ascii="Arial" w:cs="Arial" w:eastAsia="Arial" w:hAnsi="Arial"/>
-                <w:color w:val="808080"/>
+            <w:tcW w:type="dxa" w:w="6860"/>
+            <w:tcMar>
+              <w:top w:type="dxa" w:w="70"/>
+              <w:left w:type="dxa" w:w="110"/>
+              <w:bottom w:type="dxa" w:w="70"/>
+              <w:right w:type="dxa" w:w="110"/>
+            </w:tcMar>
+          </w:tcPr>
+          <w:p>
+            <w:pPr>
+              <w:spacing w:after="60" w:before="60"/>
+            </w:pPr>
+            <w:r>
+              <w:rPr>
+                <w:rFonts w:ascii="Arial" w:cs="Arial" w:eastAsia="Arial" w:hAnsi="Arial"/>
+                <w:sz w:val="21"/>
+                <w:szCs w:val="21"/>
+              </w:rPr>
+              <w:t xml:space="preserve">An ________________ is a mathematical action such as addition, subtraction, multiplication, or division.</w:t>
+            </w:r>
+          </w:p>
+        </w:tc>
+        <w:tc>
+          <w:tcPr>
+            <w:tcW w:type="dxa" w:w="2500"/>
+            <w:tcMar>
+              <w:top w:type="dxa" w:w="70"/>
+              <w:left w:type="dxa" w:w="110"/>
+              <w:bottom w:type="dxa" w:w="70"/>
+              <w:right w:type="dxa" w:w="110"/>
+            </w:tcMar>
+          </w:tcPr>
+          <w:p>
+            <w:pPr>
+              <w:spacing w:after="60" w:before="60"/>
+              <w:jc w:val="center"/>
+            </w:pPr>
+            <w:r>
+              <w:rPr>
+                <w:rFonts w:ascii="Arial" w:cs="Arial" w:eastAsia="Arial" w:hAnsi="Arial"/>
+                <w:i/>
+                <w:iCs/>
+                <w:color w:val="595959"/>
                 <w:sz w:val="20"/>
                 <w:szCs w:val="20"/>
               </w:rPr>
-              <w:t xml:space="preserve">__________________________________</w:t>
-            </w:r>
-          </w:p>
-        </w:tc>
-        <w:tc>
-          <w:tcPr>
-            <w:tcW w:type="dxa" w:w="4560"/>
-            <w:tcMar>
-              <w:top w:type="dxa" w:w="70"/>
-              <w:left w:type="dxa" w:w="110"/>
-              <w:bottom w:type="dxa" w:w="70"/>
-              <w:right w:type="dxa" w:w="110"/>
-            </w:tcMar>
-          </w:tcPr>
-          <w:p>
-            <w:r>
-              <w:rPr>
-                <w:rFonts w:ascii="Arial" w:cs="Arial" w:eastAsia="Arial" w:hAnsi="Arial"/>
-                <w:b w:val="false"/>
-                <w:bCs w:val="false"/>
-                <w:color w:val="000000"/>
-                <w:sz w:val="21"/>
-                <w:szCs w:val="21"/>
-              </w:rPr>
-              <w:t xml:space="preserve">A mathematical action such as addition, subtraction, multiplication, or division.</w:t>
-            </w:r>
-          </w:p>
-        </w:tc>
-        <w:tc>
-          <w:tcPr>
-            <w:tcW w:type="dxa" w:w="2200"/>
-            <w:tcMar>
-              <w:top w:type="dxa" w:w="70"/>
-              <w:left w:type="dxa" w:w="110"/>
-              <w:bottom w:type="dxa" w:w="70"/>
-              <w:right w:type="dxa" w:w="110"/>
-            </w:tcMar>
-          </w:tcPr>
-          <w:p>
-            <w:pPr>
-              <w:spacing w:after="20" w:before="60"/>
-            </w:pPr>
-            <w:r>
-              <w:rPr>
-                <w:rFonts w:ascii="Arial" w:cs="Arial" w:eastAsia="Arial" w:hAnsi="Arial"/>
-                <w:color w:val="808080"/>
-                <w:sz w:val="20"/>
-                <w:szCs w:val="20"/>
-              </w:rPr>
-              <w:t xml:space="preserve">__________________________________</w:t>
+              <w:t xml:space="preserve">+   –   ×   ÷</w:t>
             </w:r>
           </w:p>
         </w:tc>
       </w:tr>
       <w:tr>
         <w:trPr>
-          <w:trHeight w:val="620" w:hRule="atLeast"/>
+          <w:trHeight w:val="560" w:hRule="atLeast"/>
         </w:trPr>
         <w:tc>
           <w:tcPr>
-            <w:tcW w:type="dxa" w:w="2600"/>
-            <w:tcMar>
-              <w:top w:type="dxa" w:w="70"/>
-              <w:left w:type="dxa" w:w="110"/>
-              <w:bottom w:type="dxa" w:w="70"/>
-              <w:right w:type="dxa" w:w="110"/>
-            </w:tcMar>
-          </w:tcPr>
-          <w:p>
-            <w:pPr>
-              <w:spacing w:after="20" w:before="60"/>
-            </w:pPr>
-            <w:r>
-              <w:rPr>
-                <w:rFonts w:ascii="Arial" w:cs="Arial" w:eastAsia="Arial" w:hAnsi="Arial"/>
-                <w:color w:val="808080"/>
+            <w:tcW w:type="dxa" w:w="6860"/>
+            <w:tcMar>
+              <w:top w:type="dxa" w:w="70"/>
+              <w:left w:type="dxa" w:w="110"/>
+              <w:bottom w:type="dxa" w:w="70"/>
+              <w:right w:type="dxa" w:w="110"/>
+            </w:tcMar>
+          </w:tcPr>
+          <w:p>
+            <w:pPr>
+              <w:spacing w:after="60" w:before="60"/>
+            </w:pPr>
+            <w:r>
+              <w:rPr>
+                <w:rFonts w:ascii="Arial" w:cs="Arial" w:eastAsia="Arial" w:hAnsi="Arial"/>
+                <w:sz w:val="21"/>
+                <w:szCs w:val="21"/>
+              </w:rPr>
+              <w:t xml:space="preserve">To ________________ an expression means to find its value by substituting a number in for each variable.</w:t>
+            </w:r>
+          </w:p>
+        </w:tc>
+        <w:tc>
+          <w:tcPr>
+            <w:tcW w:type="dxa" w:w="2500"/>
+            <w:tcMar>
+              <w:top w:type="dxa" w:w="70"/>
+              <w:left w:type="dxa" w:w="110"/>
+              <w:bottom w:type="dxa" w:w="70"/>
+              <w:right w:type="dxa" w:w="110"/>
+            </w:tcMar>
+          </w:tcPr>
+          <w:p>
+            <w:pPr>
+              <w:spacing w:after="60" w:before="60"/>
+              <w:jc w:val="center"/>
+            </w:pPr>
+            <w:r>
+              <w:rPr>
+                <w:rFonts w:ascii="Arial" w:cs="Arial" w:eastAsia="Arial" w:hAnsi="Arial"/>
+                <w:i/>
+                <w:iCs/>
+                <w:color w:val="595959"/>
                 <w:sz w:val="20"/>
                 <w:szCs w:val="20"/>
               </w:rPr>
-              <w:t xml:space="preserve">__________________________________</w:t>
-            </w:r>
-          </w:p>
-        </w:tc>
-        <w:tc>
-          <w:tcPr>
-            <w:tcW w:type="dxa" w:w="4560"/>
-            <w:tcMar>
-              <w:top w:type="dxa" w:w="70"/>
-              <w:left w:type="dxa" w:w="110"/>
-              <w:bottom w:type="dxa" w:w="70"/>
-              <w:right w:type="dxa" w:w="110"/>
-            </w:tcMar>
-          </w:tcPr>
-          <w:p>
-            <w:r>
-              <w:rPr>
-                <w:rFonts w:ascii="Arial" w:cs="Arial" w:eastAsia="Arial" w:hAnsi="Arial"/>
-                <w:b w:val="false"/>
-                <w:bCs w:val="false"/>
-                <w:color w:val="000000"/>
-                <w:sz w:val="21"/>
-                <w:szCs w:val="21"/>
-              </w:rPr>
-              <w:t xml:space="preserve">To find the value of an expression by substituting a number in for each variable.</w:t>
-            </w:r>
-          </w:p>
-        </w:tc>
-        <w:tc>
-          <w:tcPr>
-            <w:tcW w:type="dxa" w:w="2200"/>
-            <w:tcMar>
-              <w:top w:type="dxa" w:w="70"/>
-              <w:left w:type="dxa" w:w="110"/>
-              <w:bottom w:type="dxa" w:w="70"/>
-              <w:right w:type="dxa" w:w="110"/>
-            </w:tcMar>
-          </w:tcPr>
-          <w:p>
-            <w:pPr>
-              <w:spacing w:after="20" w:before="60"/>
-            </w:pPr>
-            <w:r>
-              <w:rPr>
-                <w:rFonts w:ascii="Arial" w:cs="Arial" w:eastAsia="Arial" w:hAnsi="Arial"/>
-                <w:color w:val="808080"/>
-                <w:sz w:val="20"/>
-                <w:szCs w:val="20"/>
-              </w:rPr>
-              <w:t xml:space="preserve">__________________________________</w:t>
+              <w:t xml:space="preserve">If n = 4, then 3n = 12</w:t>
             </w:r>
           </w:p>
         </w:tc>

</xml_diff>

<commit_message>
Tighten spacing so related content groups together
Reduce before/after spacing on section and sub headers, set body and
list line spacing to single, trim redundant spacer paragraphs, and
compact table cell padding. No content changes.

Co-Authored-By: Claude Opus 4.8 <noreply@anthropic.com>
Claude-Session: https://claude.ai/code/session_01FC3BfbH3eZoJiVptb2oNST
</commit_message>
<xml_diff>
--- a/algebra1-notes/Algebra1_Unit1_Lesson1_Variables_and_Expressions.docx
+++ b/algebra1-notes/Algebra1_Unit1_Lesson1_Variables_and_Expressions.docx
@@ -41,9 +41,9 @@
     <w:p>
       <w:pPr>
         <w:pBdr>
-          <w:bottom w:val="single" w:color="2E74B5" w:sz="18" w:space="6"/>
+          <w:bottom w:val="single" w:color="2E74B5" w:sz="18" w:space="5"/>
         </w:pBdr>
-        <w:spacing w:after="200"/>
+        <w:spacing w:after="100"/>
         <w:jc w:val="center"/>
       </w:pPr>
       <w:r>
@@ -62,9 +62,9 @@
       <w:pPr>
         <w:keepNext/>
         <w:pBdr>
-          <w:bottom w:val="single" w:color="2E74B5" w:sz="12" w:space="4"/>
+          <w:bottom w:val="single" w:color="2E74B5" w:sz="12" w:space="3"/>
         </w:pBdr>
-        <w:spacing w:after="120" w:before="260"/>
+        <w:spacing w:after="50" w:before="160"/>
       </w:pPr>
       <w:r>
         <w:rPr>
@@ -81,7 +81,7 @@
     </w:p>
     <w:p>
       <w:pPr>
-        <w:spacing w:after="60" w:line="276"/>
+        <w:spacing w:after="60" w:line="240"/>
       </w:pPr>
       <w:r>
         <w:rPr>
@@ -104,7 +104,7 @@
           <w:ilvl w:val="0"/>
           <w:numId w:val="2"/>
         </w:numPr>
-        <w:spacing w:after="60" w:line="264"/>
+        <w:spacing w:after="30" w:line="240"/>
       </w:pPr>
       <w:r>
         <w:rPr>
@@ -122,7 +122,7 @@
           <w:ilvl w:val="0"/>
           <w:numId w:val="2"/>
         </w:numPr>
-        <w:spacing w:after="60" w:line="264"/>
+        <w:spacing w:after="30" w:line="240"/>
       </w:pPr>
       <w:r>
         <w:rPr>
@@ -140,7 +140,7 @@
           <w:ilvl w:val="0"/>
           <w:numId w:val="2"/>
         </w:numPr>
-        <w:spacing w:after="60" w:line="264"/>
+        <w:spacing w:after="30" w:line="240"/>
       </w:pPr>
       <w:r>
         <w:rPr>
@@ -158,7 +158,7 @@
           <w:ilvl w:val="0"/>
           <w:numId w:val="2"/>
         </w:numPr>
-        <w:spacing w:after="60" w:line="264"/>
+        <w:spacing w:after="30" w:line="240"/>
       </w:pPr>
       <w:r>
         <w:rPr>
@@ -176,7 +176,7 @@
           <w:ilvl w:val="0"/>
           <w:numId w:val="2"/>
         </w:numPr>
-        <w:spacing w:after="60" w:line="264"/>
+        <w:spacing w:after="30" w:line="240"/>
       </w:pPr>
       <w:r>
         <w:rPr>
@@ -194,7 +194,7 @@
           <w:ilvl w:val="0"/>
           <w:numId w:val="2"/>
         </w:numPr>
-        <w:spacing w:after="60" w:line="264"/>
+        <w:spacing w:after="30" w:line="240"/>
       </w:pPr>
       <w:r>
         <w:rPr>
@@ -209,9 +209,9 @@
       <w:pPr>
         <w:keepNext/>
         <w:pBdr>
-          <w:bottom w:val="single" w:color="2E74B5" w:sz="12" w:space="4"/>
+          <w:bottom w:val="single" w:color="2E74B5" w:sz="12" w:space="3"/>
         </w:pBdr>
-        <w:spacing w:after="120" w:before="260"/>
+        <w:spacing w:after="50" w:before="160"/>
       </w:pPr>
       <w:r>
         <w:rPr>
@@ -228,7 +228,7 @@
     </w:p>
     <w:p>
       <w:pPr>
-        <w:spacing w:after="100" w:line="276"/>
+        <w:spacing w:after="60" w:line="240"/>
       </w:pPr>
       <w:r>
         <w:rPr>
@@ -251,7 +251,7 @@
           <w:ilvl w:val="0"/>
           <w:numId w:val="3"/>
         </w:numPr>
-        <w:spacing w:after="60" w:line="264"/>
+        <w:spacing w:after="30" w:line="240"/>
       </w:pPr>
       <w:r>
         <w:rPr>
@@ -287,7 +287,7 @@
           <w:ilvl w:val="0"/>
           <w:numId w:val="3"/>
         </w:numPr>
-        <w:spacing w:after="60" w:line="264"/>
+        <w:spacing w:after="30" w:line="240"/>
       </w:pPr>
       <w:r>
         <w:rPr>
@@ -323,7 +323,7 @@
           <w:ilvl w:val="0"/>
           <w:numId w:val="3"/>
         </w:numPr>
-        <w:spacing w:after="60" w:line="264"/>
+        <w:spacing w:after="30" w:line="240"/>
       </w:pPr>
       <w:r>
         <w:rPr>
@@ -359,7 +359,7 @@
           <w:ilvl w:val="0"/>
           <w:numId w:val="3"/>
         </w:numPr>
-        <w:spacing w:after="60" w:line="264"/>
+        <w:spacing w:after="30" w:line="240"/>
       </w:pPr>
       <w:r>
         <w:rPr>
@@ -395,7 +395,7 @@
           <w:ilvl w:val="0"/>
           <w:numId w:val="3"/>
         </w:numPr>
-        <w:spacing w:after="60" w:line="264"/>
+        <w:spacing w:after="30" w:line="240"/>
       </w:pPr>
       <w:r>
         <w:rPr>
@@ -431,7 +431,7 @@
           <w:ilvl w:val="0"/>
           <w:numId w:val="3"/>
         </w:numPr>
-        <w:spacing w:after="60" w:line="264"/>
+        <w:spacing w:after="30" w:line="240"/>
       </w:pPr>
       <w:r>
         <w:rPr>
@@ -464,9 +464,9 @@
       <w:pPr>
         <w:keepNext/>
         <w:pBdr>
-          <w:bottom w:val="single" w:color="2E74B5" w:sz="12" w:space="4"/>
+          <w:bottom w:val="single" w:color="2E74B5" w:sz="12" w:space="3"/>
         </w:pBdr>
-        <w:spacing w:after="120" w:before="260"/>
+        <w:spacing w:after="50" w:before="160"/>
       </w:pPr>
       <w:r>
         <w:rPr>
@@ -483,7 +483,7 @@
     </w:p>
     <w:p>
       <w:pPr>
-        <w:spacing w:after="80" w:line="276"/>
+        <w:spacing w:after="80" w:line="240"/>
       </w:pPr>
       <w:r>
         <w:rPr>
@@ -605,7 +605,7 @@
           </w:tcPr>
           <w:p>
             <w:pPr>
-              <w:spacing w:after="60" w:before="60"/>
+              <w:spacing w:after="30" w:before="30"/>
             </w:pPr>
             <w:r>
               <w:rPr>
@@ -629,7 +629,7 @@
           </w:tcPr>
           <w:p>
             <w:pPr>
-              <w:spacing w:after="60" w:before="60"/>
+              <w:spacing w:after="30" w:before="30"/>
               <w:jc w:val="center"/>
             </w:pPr>
             <w:r>
@@ -662,7 +662,7 @@
           </w:tcPr>
           <w:p>
             <w:pPr>
-              <w:spacing w:after="60" w:before="60"/>
+              <w:spacing w:after="30" w:before="30"/>
             </w:pPr>
             <w:r>
               <w:rPr>
@@ -686,7 +686,7 @@
           </w:tcPr>
           <w:p>
             <w:pPr>
-              <w:spacing w:after="60" w:before="60"/>
+              <w:spacing w:after="30" w:before="30"/>
               <w:jc w:val="center"/>
             </w:pPr>
             <w:r>
@@ -719,7 +719,7 @@
           </w:tcPr>
           <w:p>
             <w:pPr>
-              <w:spacing w:after="60" w:before="60"/>
+              <w:spacing w:after="30" w:before="30"/>
             </w:pPr>
             <w:r>
               <w:rPr>
@@ -743,7 +743,7 @@
           </w:tcPr>
           <w:p>
             <w:pPr>
-              <w:spacing w:after="60" w:before="60"/>
+              <w:spacing w:after="30" w:before="30"/>
               <w:jc w:val="center"/>
             </w:pPr>
             <w:r>
@@ -776,7 +776,7 @@
           </w:tcPr>
           <w:p>
             <w:pPr>
-              <w:spacing w:after="60" w:before="60"/>
+              <w:spacing w:after="30" w:before="30"/>
             </w:pPr>
             <w:r>
               <w:rPr>
@@ -800,7 +800,7 @@
           </w:tcPr>
           <w:p>
             <w:pPr>
-              <w:spacing w:after="60" w:before="60"/>
+              <w:spacing w:after="30" w:before="30"/>
               <w:jc w:val="center"/>
             </w:pPr>
             <w:r>
@@ -833,7 +833,7 @@
           </w:tcPr>
           <w:p>
             <w:pPr>
-              <w:spacing w:after="60" w:before="60"/>
+              <w:spacing w:after="30" w:before="30"/>
             </w:pPr>
             <w:r>
               <w:rPr>
@@ -857,7 +857,7 @@
           </w:tcPr>
           <w:p>
             <w:pPr>
-              <w:spacing w:after="60" w:before="60"/>
+              <w:spacing w:after="30" w:before="30"/>
               <w:jc w:val="center"/>
             </w:pPr>
             <w:r>
@@ -890,7 +890,7 @@
           </w:tcPr>
           <w:p>
             <w:pPr>
-              <w:spacing w:after="60" w:before="60"/>
+              <w:spacing w:after="30" w:before="30"/>
             </w:pPr>
             <w:r>
               <w:rPr>
@@ -914,7 +914,7 @@
           </w:tcPr>
           <w:p>
             <w:pPr>
-              <w:spacing w:after="60" w:before="60"/>
+              <w:spacing w:after="30" w:before="30"/>
               <w:jc w:val="center"/>
             </w:pPr>
             <w:r>
@@ -947,7 +947,7 @@
           </w:tcPr>
           <w:p>
             <w:pPr>
-              <w:spacing w:after="60" w:before="60"/>
+              <w:spacing w:after="30" w:before="30"/>
             </w:pPr>
             <w:r>
               <w:rPr>
@@ -971,7 +971,7 @@
           </w:tcPr>
           <w:p>
             <w:pPr>
-              <w:spacing w:after="60" w:before="60"/>
+              <w:spacing w:after="30" w:before="30"/>
               <w:jc w:val="center"/>
             </w:pPr>
             <w:r>
@@ -1004,7 +1004,7 @@
           </w:tcPr>
           <w:p>
             <w:pPr>
-              <w:spacing w:after="60" w:before="60"/>
+              <w:spacing w:after="30" w:before="30"/>
             </w:pPr>
             <w:r>
               <w:rPr>
@@ -1028,7 +1028,7 @@
           </w:tcPr>
           <w:p>
             <w:pPr>
-              <w:spacing w:after="60" w:before="60"/>
+              <w:spacing w:after="30" w:before="30"/>
               <w:jc w:val="center"/>
             </w:pPr>
             <w:r>
@@ -1048,7 +1048,7 @@
     </w:tbl>
     <w:p>
       <w:pPr>
-        <w:spacing w:before="140"/>
+        <w:spacing w:before="80"/>
       </w:pPr>
       <w:r>
         <w:rPr>
@@ -1079,7 +1079,7 @@
     </w:p>
     <w:p>
       <w:pPr>
-        <w:spacing w:before="100"/>
+        <w:spacing w:before="60"/>
       </w:pPr>
       <w:r>
         <w:rPr>
@@ -1117,9 +1117,9 @@
       <w:pPr>
         <w:keepNext/>
         <w:pBdr>
-          <w:bottom w:val="single" w:color="2E74B5" w:sz="12" w:space="4"/>
+          <w:bottom w:val="single" w:color="2E74B5" w:sz="12" w:space="3"/>
         </w:pBdr>
-        <w:spacing w:after="120" w:before="260"/>
+        <w:spacing w:after="50" w:before="160"/>
       </w:pPr>
       <w:r>
         <w:rPr>
@@ -1137,7 +1137,7 @@
     <w:p>
       <w:pPr>
         <w:keepNext/>
-        <w:spacing w:after="80" w:before="160"/>
+        <w:spacing w:after="40" w:before="100"/>
       </w:pPr>
       <w:r>
         <w:rPr>
@@ -1153,7 +1153,7 @@
     </w:p>
     <w:p>
       <w:pPr>
-        <w:spacing w:after="100" w:line="276"/>
+        <w:spacing w:after="60" w:line="240"/>
       </w:pPr>
       <w:r>
         <w:rPr>
@@ -1276,7 +1276,7 @@
     <w:p>
       <w:pPr>
         <w:keepNext/>
-        <w:spacing w:after="80" w:before="160"/>
+        <w:spacing w:after="40" w:before="100"/>
       </w:pPr>
       <w:r>
         <w:rPr>
@@ -1292,7 +1292,7 @@
     </w:p>
     <w:p>
       <w:pPr>
-        <w:spacing w:after="80" w:line="276"/>
+        <w:spacing w:after="80" w:line="240"/>
       </w:pPr>
       <w:r>
         <w:rPr>
@@ -1950,7 +1950,7 @@
     </w:tbl>
     <w:p>
       <w:pPr>
-        <w:spacing w:after="120" w:before="140"/>
+        <w:spacing w:after="40" w:before="80"/>
       </w:pPr>
     </w:p>
     <w:tbl>
@@ -2044,7 +2044,7 @@
     <w:p>
       <w:pPr>
         <w:keepNext/>
-        <w:spacing w:after="80" w:before="160"/>
+        <w:spacing w:after="40" w:before="100"/>
       </w:pPr>
       <w:r>
         <w:rPr>
@@ -2060,7 +2060,7 @@
     </w:p>
     <w:p>
       <w:pPr>
-        <w:spacing w:after="60" w:line="276"/>
+        <w:spacing w:after="60" w:line="240"/>
       </w:pPr>
       <w:r>
         <w:rPr>
@@ -2083,7 +2083,7 @@
           <w:ilvl w:val="0"/>
           <w:numId w:val="3"/>
         </w:numPr>
-        <w:spacing w:after="60" w:line="264"/>
+        <w:spacing w:after="30" w:line="240"/>
       </w:pPr>
       <w:r>
         <w:rPr>
@@ -2119,7 +2119,7 @@
           <w:ilvl w:val="0"/>
           <w:numId w:val="3"/>
         </w:numPr>
-        <w:spacing w:after="60" w:line="264"/>
+        <w:spacing w:after="30" w:line="240"/>
       </w:pPr>
       <w:r>
         <w:rPr>
@@ -2155,7 +2155,7 @@
           <w:ilvl w:val="0"/>
           <w:numId w:val="3"/>
         </w:numPr>
-        <w:spacing w:after="60" w:line="264"/>
+        <w:spacing w:after="30" w:line="240"/>
       </w:pPr>
       <w:r>
         <w:rPr>
@@ -2186,7 +2186,7 @@
     </w:p>
     <w:p>
       <w:pPr>
-        <w:spacing w:after="100" w:line="276"/>
+        <w:spacing w:after="60" w:line="240"/>
       </w:pPr>
       <w:r>
         <w:rPr>
@@ -2257,7 +2257,7 @@
     <w:p>
       <w:pPr>
         <w:keepNext/>
-        <w:spacing w:after="80" w:before="160"/>
+        <w:spacing w:after="40" w:before="100"/>
       </w:pPr>
       <w:r>
         <w:rPr>
@@ -2273,7 +2273,7 @@
     </w:p>
     <w:p>
       <w:pPr>
-        <w:spacing w:after="100" w:line="276"/>
+        <w:spacing w:after="60" w:line="240"/>
       </w:pPr>
       <w:r>
         <w:rPr>
@@ -2376,9 +2376,9 @@
       <w:pPr>
         <w:keepNext/>
         <w:pBdr>
-          <w:bottom w:val="single" w:color="2E74B5" w:sz="12" w:space="4"/>
+          <w:bottom w:val="single" w:color="2E74B5" w:sz="12" w:space="3"/>
         </w:pBdr>
-        <w:spacing w:after="120" w:before="260"/>
+        <w:spacing w:after="50" w:before="160"/>
       </w:pPr>
       <w:r>
         <w:rPr>
@@ -2396,7 +2396,7 @@
     <w:p>
       <w:pPr>
         <w:keepNext/>
-        <w:spacing w:after="80" w:before="160"/>
+        <w:spacing w:after="40" w:before="100"/>
       </w:pPr>
       <w:r>
         <w:rPr>
@@ -2872,13 +2872,13 @@
     </w:tbl>
     <w:p>
       <w:pPr>
-        <w:spacing w:before="160"/>
+        <w:spacing w:before="60"/>
       </w:pPr>
     </w:p>
     <w:p>
       <w:pPr>
         <w:keepNext/>
-        <w:spacing w:after="80" w:before="160"/>
+        <w:spacing w:after="40" w:before="100"/>
       </w:pPr>
       <w:r>
         <w:rPr>
@@ -3481,13 +3481,13 @@
     </w:tbl>
     <w:p>
       <w:pPr>
-        <w:spacing w:before="160"/>
+        <w:spacing w:before="60"/>
       </w:pPr>
     </w:p>
     <w:p>
       <w:pPr>
         <w:keepNext/>
-        <w:spacing w:after="80" w:before="160"/>
+        <w:spacing w:after="40" w:before="100"/>
       </w:pPr>
       <w:r>
         <w:rPr>
@@ -4087,9 +4087,9 @@
       <w:pPr>
         <w:keepNext/>
         <w:pBdr>
-          <w:bottom w:val="single" w:color="2E74B5" w:sz="12" w:space="4"/>
+          <w:bottom w:val="single" w:color="2E74B5" w:sz="12" w:space="3"/>
         </w:pBdr>
-        <w:spacing w:after="120" w:before="260"/>
+        <w:spacing w:after="50" w:before="160"/>
       </w:pPr>
       <w:r>
         <w:rPr>
@@ -4238,9 +4238,9 @@
       <w:pPr>
         <w:keepNext/>
         <w:pBdr>
-          <w:bottom w:val="single" w:color="2E74B5" w:sz="12" w:space="4"/>
+          <w:bottom w:val="single" w:color="2E74B5" w:sz="12" w:space="3"/>
         </w:pBdr>
-        <w:spacing w:after="120" w:before="260"/>
+        <w:spacing w:after="50" w:before="160"/>
       </w:pPr>
       <w:r>
         <w:rPr>
@@ -4262,7 +4262,7 @@
           <w:ilvl w:val="0"/>
           <w:numId w:val="3"/>
         </w:numPr>
-        <w:spacing w:after="60" w:line="264"/>
+        <w:spacing w:after="30" w:line="240"/>
       </w:pPr>
       <w:r>
         <w:rPr>
@@ -4285,7 +4285,7 @@
           <w:ilvl w:val="0"/>
           <w:numId w:val="3"/>
         </w:numPr>
-        <w:spacing w:after="60" w:line="264"/>
+        <w:spacing w:after="30" w:line="240"/>
       </w:pPr>
       <w:r>
         <w:rPr>
@@ -4308,7 +4308,7 @@
           <w:ilvl w:val="0"/>
           <w:numId w:val="3"/>
         </w:numPr>
-        <w:spacing w:after="60" w:line="264"/>
+        <w:spacing w:after="30" w:line="240"/>
       </w:pPr>
       <w:r>
         <w:rPr>
@@ -4331,7 +4331,7 @@
           <w:ilvl w:val="0"/>
           <w:numId w:val="3"/>
         </w:numPr>
-        <w:spacing w:after="60" w:line="264"/>
+        <w:spacing w:after="30" w:line="240"/>
       </w:pPr>
       <w:r>
         <w:rPr>
@@ -4354,7 +4354,7 @@
           <w:ilvl w:val="0"/>
           <w:numId w:val="3"/>
         </w:numPr>
-        <w:spacing w:after="60" w:line="264"/>
+        <w:spacing w:after="30" w:line="240"/>
       </w:pPr>
       <w:r>
         <w:rPr>
@@ -4377,7 +4377,7 @@
           <w:ilvl w:val="0"/>
           <w:numId w:val="3"/>
         </w:numPr>
-        <w:spacing w:after="60" w:line="264"/>
+        <w:spacing w:after="30" w:line="240"/>
       </w:pPr>
       <w:r>
         <w:rPr>
@@ -4397,9 +4397,9 @@
       <w:pPr>
         <w:keepNext/>
         <w:pBdr>
-          <w:bottom w:val="single" w:color="2E74B5" w:sz="12" w:space="4"/>
+          <w:bottom w:val="single" w:color="2E74B5" w:sz="12" w:space="3"/>
         </w:pBdr>
-        <w:spacing w:after="120" w:before="260"/>
+        <w:spacing w:after="50" w:before="160"/>
       </w:pPr>
       <w:r>
         <w:rPr>
@@ -4416,7 +4416,7 @@
     </w:p>
     <w:p>
       <w:pPr>
-        <w:spacing w:after="100" w:line="276"/>
+        <w:spacing w:after="60" w:line="240"/>
       </w:pPr>
       <w:r>
         <w:rPr>
@@ -4618,9 +4618,9 @@
       <w:pPr>
         <w:keepNext/>
         <w:pBdr>
-          <w:bottom w:val="single" w:color="2E74B5" w:sz="12" w:space="4"/>
+          <w:bottom w:val="single" w:color="2E74B5" w:sz="12" w:space="3"/>
         </w:pBdr>
-        <w:spacing w:after="120" w:before="260"/>
+        <w:spacing w:after="50" w:before="160"/>
       </w:pPr>
       <w:r>
         <w:rPr>
@@ -4642,7 +4642,7 @@
           <w:ilvl w:val="0"/>
           <w:numId w:val="3"/>
         </w:numPr>
-        <w:spacing w:after="60" w:line="264"/>
+        <w:spacing w:after="30" w:line="240"/>
       </w:pPr>
       <w:r>
         <w:rPr>
@@ -4665,7 +4665,7 @@
           <w:ilvl w:val="0"/>
           <w:numId w:val="3"/>
         </w:numPr>
-        <w:spacing w:after="60" w:line="264"/>
+        <w:spacing w:after="30" w:line="240"/>
       </w:pPr>
       <w:r>
         <w:rPr>
@@ -4688,7 +4688,7 @@
           <w:ilvl w:val="0"/>
           <w:numId w:val="3"/>
         </w:numPr>
-        <w:spacing w:after="60" w:line="264"/>
+        <w:spacing w:after="30" w:line="240"/>
       </w:pPr>
       <w:r>
         <w:rPr>
@@ -4711,7 +4711,7 @@
           <w:ilvl w:val="0"/>
           <w:numId w:val="3"/>
         </w:numPr>
-        <w:spacing w:after="60" w:line="264"/>
+        <w:spacing w:after="30" w:line="240"/>
       </w:pPr>
       <w:r>
         <w:rPr>
@@ -4734,7 +4734,7 @@
           <w:ilvl w:val="0"/>
           <w:numId w:val="3"/>
         </w:numPr>
-        <w:spacing w:after="60" w:line="264"/>
+        <w:spacing w:after="30" w:line="240"/>
       </w:pPr>
       <w:r>
         <w:rPr>
@@ -4757,7 +4757,7 @@
           <w:ilvl w:val="0"/>
           <w:numId w:val="3"/>
         </w:numPr>
-        <w:spacing w:after="60" w:line="264"/>
+        <w:spacing w:after="30" w:line="240"/>
       </w:pPr>
       <w:r>
         <w:rPr>

</xml_diff>

<commit_message>
Enforce professional pagination (keep sections together)
Lay the lesson out as five page-groups with manual page breaks at each
major boundary (Vocabulary, Main Lesson Notes, Examples, Rules), and
stamp keep-lines-together on every paragraph, keep-with-next through
headings/tables/lists, and cantSplit on every table row so nothing
splits across pages. Add a pagination section to the QA report.

Co-Authored-By: Claude Opus 4.8 <noreply@anthropic.com>
Claude-Session: https://claude.ai/code/session_01FC3BfbH3eZoJiVptb2oNST
</commit_message>
<xml_diff>
--- a/algebra1-notes/Algebra1_Unit1_Lesson1_Variables_and_Expressions.docx
+++ b/algebra1-notes/Algebra1_Unit1_Lesson1_Variables_and_Expressions.docx
@@ -4,6 +4,7 @@
   <w:body>
     <w:p>
       <w:pPr>
+        <w:keepLines/>
         <w:spacing w:after="20"/>
         <w:jc w:val="center"/>
       </w:pPr>
@@ -23,6 +24,7 @@
     </w:p>
     <w:p>
       <w:pPr>
+        <w:keepLines/>
         <w:spacing w:after="40"/>
         <w:jc w:val="center"/>
       </w:pPr>
@@ -40,6 +42,7 @@
     </w:p>
     <w:p>
       <w:pPr>
+        <w:keepLines/>
         <w:pBdr>
           <w:bottom w:val="single" w:color="2E74B5" w:sz="18" w:space="5"/>
         </w:pBdr>
@@ -61,6 +64,7 @@
     <w:p>
       <w:pPr>
         <w:keepNext/>
+        <w:keepLines/>
         <w:pBdr>
           <w:bottom w:val="single" w:color="2E74B5" w:sz="12" w:space="3"/>
         </w:pBdr>
@@ -81,6 +85,8 @@
     </w:p>
     <w:p>
       <w:pPr>
+        <w:keepNext/>
+        <w:keepLines/>
         <w:spacing w:after="60" w:line="240"/>
       </w:pPr>
       <w:r>
@@ -100,6 +106,8 @@
     <w:p>
       <w:pPr>
         <w:pStyle w:val="ListParagraph"/>
+        <w:keepNext/>
+        <w:keepLines/>
         <w:numPr>
           <w:ilvl w:val="0"/>
           <w:numId w:val="2"/>
@@ -118,6 +126,8 @@
     <w:p>
       <w:pPr>
         <w:pStyle w:val="ListParagraph"/>
+        <w:keepNext/>
+        <w:keepLines/>
         <w:numPr>
           <w:ilvl w:val="0"/>
           <w:numId w:val="2"/>
@@ -136,6 +146,8 @@
     <w:p>
       <w:pPr>
         <w:pStyle w:val="ListParagraph"/>
+        <w:keepNext/>
+        <w:keepLines/>
         <w:numPr>
           <w:ilvl w:val="0"/>
           <w:numId w:val="2"/>
@@ -154,6 +166,8 @@
     <w:p>
       <w:pPr>
         <w:pStyle w:val="ListParagraph"/>
+        <w:keepNext/>
+        <w:keepLines/>
         <w:numPr>
           <w:ilvl w:val="0"/>
           <w:numId w:val="2"/>
@@ -172,6 +186,8 @@
     <w:p>
       <w:pPr>
         <w:pStyle w:val="ListParagraph"/>
+        <w:keepNext/>
+        <w:keepLines/>
         <w:numPr>
           <w:ilvl w:val="0"/>
           <w:numId w:val="2"/>
@@ -190,6 +206,7 @@
     <w:p>
       <w:pPr>
         <w:pStyle w:val="ListParagraph"/>
+        <w:keepLines/>
         <w:numPr>
           <w:ilvl w:val="0"/>
           <w:numId w:val="2"/>
@@ -208,6 +225,7 @@
     <w:p>
       <w:pPr>
         <w:keepNext/>
+        <w:keepLines/>
         <w:pBdr>
           <w:bottom w:val="single" w:color="2E74B5" w:sz="12" w:space="3"/>
         </w:pBdr>
@@ -228,6 +246,8 @@
     </w:p>
     <w:p>
       <w:pPr>
+        <w:keepNext/>
+        <w:keepLines/>
         <w:spacing w:after="60" w:line="240"/>
       </w:pPr>
       <w:r>
@@ -247,6 +267,8 @@
     <w:p>
       <w:pPr>
         <w:pStyle w:val="ListParagraph"/>
+        <w:keepNext/>
+        <w:keepLines/>
         <w:numPr>
           <w:ilvl w:val="0"/>
           <w:numId w:val="3"/>
@@ -283,6 +305,8 @@
     <w:p>
       <w:pPr>
         <w:pStyle w:val="ListParagraph"/>
+        <w:keepNext/>
+        <w:keepLines/>
         <w:numPr>
           <w:ilvl w:val="0"/>
           <w:numId w:val="3"/>
@@ -319,6 +343,8 @@
     <w:p>
       <w:pPr>
         <w:pStyle w:val="ListParagraph"/>
+        <w:keepNext/>
+        <w:keepLines/>
         <w:numPr>
           <w:ilvl w:val="0"/>
           <w:numId w:val="3"/>
@@ -355,6 +381,8 @@
     <w:p>
       <w:pPr>
         <w:pStyle w:val="ListParagraph"/>
+        <w:keepNext/>
+        <w:keepLines/>
         <w:numPr>
           <w:ilvl w:val="0"/>
           <w:numId w:val="3"/>
@@ -391,6 +419,8 @@
     <w:p>
       <w:pPr>
         <w:pStyle w:val="ListParagraph"/>
+        <w:keepNext/>
+        <w:keepLines/>
         <w:numPr>
           <w:ilvl w:val="0"/>
           <w:numId w:val="3"/>
@@ -427,6 +457,7 @@
     <w:p>
       <w:pPr>
         <w:pStyle w:val="ListParagraph"/>
+        <w:keepLines/>
         <w:numPr>
           <w:ilvl w:val="0"/>
           <w:numId w:val="3"/>
@@ -462,7 +493,16 @@
     </w:p>
     <w:p>
       <w:pPr>
+        <w:keepLines/>
+      </w:pPr>
+      <w:r>
+        <w:br w:type="page"/>
+      </w:r>
+    </w:p>
+    <w:p>
+      <w:pPr>
         <w:keepNext/>
+        <w:keepLines/>
         <w:pBdr>
           <w:bottom w:val="single" w:color="2E74B5" w:sz="12" w:space="3"/>
         </w:pBdr>
@@ -483,6 +523,8 @@
     </w:p>
     <w:p>
       <w:pPr>
+        <w:keepNext/>
+        <w:keepLines/>
         <w:spacing w:after="80" w:line="240"/>
       </w:pPr>
       <w:r>
@@ -531,6 +573,7 @@
       <w:tr>
         <w:trPr>
           <w:tblHeader/>
+          <w:cantSplit/>
         </w:trPr>
         <w:tc>
           <w:tcPr>
@@ -545,6 +588,8 @@
           </w:tcPr>
           <w:p>
             <w:pPr>
+              <w:keepNext/>
+              <w:keepLines/>
               <w:jc w:val="center"/>
             </w:pPr>
             <w:r>
@@ -573,6 +618,8 @@
           </w:tcPr>
           <w:p>
             <w:pPr>
+              <w:keepNext/>
+              <w:keepLines/>
               <w:jc w:val="center"/>
             </w:pPr>
             <w:r>
@@ -592,6 +639,7 @@
       <w:tr>
         <w:trPr>
           <w:trHeight w:val="560" w:hRule="atLeast"/>
+          <w:cantSplit/>
         </w:trPr>
         <w:tc>
           <w:tcPr>
@@ -605,6 +653,8 @@
           </w:tcPr>
           <w:p>
             <w:pPr>
+              <w:keepNext/>
+              <w:keepLines/>
               <w:spacing w:after="30" w:before="30"/>
             </w:pPr>
             <w:r>
@@ -629,6 +679,8 @@
           </w:tcPr>
           <w:p>
             <w:pPr>
+              <w:keepNext/>
+              <w:keepLines/>
               <w:spacing w:after="30" w:before="30"/>
               <w:jc w:val="center"/>
             </w:pPr>
@@ -649,6 +701,7 @@
       <w:tr>
         <w:trPr>
           <w:trHeight w:val="560" w:hRule="atLeast"/>
+          <w:cantSplit/>
         </w:trPr>
         <w:tc>
           <w:tcPr>
@@ -662,6 +715,8 @@
           </w:tcPr>
           <w:p>
             <w:pPr>
+              <w:keepNext/>
+              <w:keepLines/>
               <w:spacing w:after="30" w:before="30"/>
             </w:pPr>
             <w:r>
@@ -686,6 +741,8 @@
           </w:tcPr>
           <w:p>
             <w:pPr>
+              <w:keepNext/>
+              <w:keepLines/>
               <w:spacing w:after="30" w:before="30"/>
               <w:jc w:val="center"/>
             </w:pPr>
@@ -706,6 +763,7 @@
       <w:tr>
         <w:trPr>
           <w:trHeight w:val="560" w:hRule="atLeast"/>
+          <w:cantSplit/>
         </w:trPr>
         <w:tc>
           <w:tcPr>
@@ -719,6 +777,8 @@
           </w:tcPr>
           <w:p>
             <w:pPr>
+              <w:keepNext/>
+              <w:keepLines/>
               <w:spacing w:after="30" w:before="30"/>
             </w:pPr>
             <w:r>
@@ -743,6 +803,8 @@
           </w:tcPr>
           <w:p>
             <w:pPr>
+              <w:keepNext/>
+              <w:keepLines/>
               <w:spacing w:after="30" w:before="30"/>
               <w:jc w:val="center"/>
             </w:pPr>
@@ -763,6 +825,7 @@
       <w:tr>
         <w:trPr>
           <w:trHeight w:val="560" w:hRule="atLeast"/>
+          <w:cantSplit/>
         </w:trPr>
         <w:tc>
           <w:tcPr>
@@ -776,6 +839,8 @@
           </w:tcPr>
           <w:p>
             <w:pPr>
+              <w:keepNext/>
+              <w:keepLines/>
               <w:spacing w:after="30" w:before="30"/>
             </w:pPr>
             <w:r>
@@ -800,6 +865,8 @@
           </w:tcPr>
           <w:p>
             <w:pPr>
+              <w:keepNext/>
+              <w:keepLines/>
               <w:spacing w:after="30" w:before="30"/>
               <w:jc w:val="center"/>
             </w:pPr>
@@ -820,6 +887,7 @@
       <w:tr>
         <w:trPr>
           <w:trHeight w:val="560" w:hRule="atLeast"/>
+          <w:cantSplit/>
         </w:trPr>
         <w:tc>
           <w:tcPr>
@@ -833,6 +901,8 @@
           </w:tcPr>
           <w:p>
             <w:pPr>
+              <w:keepNext/>
+              <w:keepLines/>
               <w:spacing w:after="30" w:before="30"/>
             </w:pPr>
             <w:r>
@@ -857,6 +927,8 @@
           </w:tcPr>
           <w:p>
             <w:pPr>
+              <w:keepNext/>
+              <w:keepLines/>
               <w:spacing w:after="30" w:before="30"/>
               <w:jc w:val="center"/>
             </w:pPr>
@@ -877,6 +949,7 @@
       <w:tr>
         <w:trPr>
           <w:trHeight w:val="560" w:hRule="atLeast"/>
+          <w:cantSplit/>
         </w:trPr>
         <w:tc>
           <w:tcPr>
@@ -890,6 +963,8 @@
           </w:tcPr>
           <w:p>
             <w:pPr>
+              <w:keepNext/>
+              <w:keepLines/>
               <w:spacing w:after="30" w:before="30"/>
             </w:pPr>
             <w:r>
@@ -914,6 +989,8 @@
           </w:tcPr>
           <w:p>
             <w:pPr>
+              <w:keepNext/>
+              <w:keepLines/>
               <w:spacing w:after="30" w:before="30"/>
               <w:jc w:val="center"/>
             </w:pPr>
@@ -934,6 +1011,7 @@
       <w:tr>
         <w:trPr>
           <w:trHeight w:val="560" w:hRule="atLeast"/>
+          <w:cantSplit/>
         </w:trPr>
         <w:tc>
           <w:tcPr>
@@ -947,6 +1025,8 @@
           </w:tcPr>
           <w:p>
             <w:pPr>
+              <w:keepNext/>
+              <w:keepLines/>
               <w:spacing w:after="30" w:before="30"/>
             </w:pPr>
             <w:r>
@@ -971,6 +1051,8 @@
           </w:tcPr>
           <w:p>
             <w:pPr>
+              <w:keepNext/>
+              <w:keepLines/>
               <w:spacing w:after="30" w:before="30"/>
               <w:jc w:val="center"/>
             </w:pPr>
@@ -991,6 +1073,7 @@
       <w:tr>
         <w:trPr>
           <w:trHeight w:val="560" w:hRule="atLeast"/>
+          <w:cantSplit/>
         </w:trPr>
         <w:tc>
           <w:tcPr>
@@ -1004,6 +1087,7 @@
           </w:tcPr>
           <w:p>
             <w:pPr>
+              <w:keepLines/>
               <w:spacing w:after="30" w:before="30"/>
             </w:pPr>
             <w:r>
@@ -1028,6 +1112,7 @@
           </w:tcPr>
           <w:p>
             <w:pPr>
+              <w:keepLines/>
               <w:spacing w:after="30" w:before="30"/>
               <w:jc w:val="center"/>
             </w:pPr>
@@ -1048,6 +1133,7 @@
     </w:tbl>
     <w:p>
       <w:pPr>
+        <w:keepLines/>
         <w:spacing w:before="80"/>
       </w:pPr>
       <w:r>
@@ -1079,6 +1165,7 @@
     </w:p>
     <w:p>
       <w:pPr>
+        <w:keepLines/>
         <w:spacing w:before="60"/>
       </w:pPr>
       <w:r>
@@ -1109,6 +1196,9 @@
       </w:r>
     </w:p>
     <w:p>
+      <w:pPr>
+        <w:keepLines/>
+      </w:pPr>
       <w:r>
         <w:br w:type="page"/>
       </w:r>
@@ -1116,6 +1206,7 @@
     <w:p>
       <w:pPr>
         <w:keepNext/>
+        <w:keepLines/>
         <w:pBdr>
           <w:bottom w:val="single" w:color="2E74B5" w:sz="12" w:space="3"/>
         </w:pBdr>
@@ -1137,6 +1228,7 @@
     <w:p>
       <w:pPr>
         <w:keepNext/>
+        <w:keepLines/>
         <w:spacing w:after="40" w:before="100"/>
       </w:pPr>
       <w:r>
@@ -1153,6 +1245,7 @@
     </w:p>
     <w:p>
       <w:pPr>
+        <w:keepLines/>
         <w:spacing w:after="60" w:line="240"/>
       </w:pPr>
       <w:r>
@@ -1276,6 +1369,7 @@
     <w:p>
       <w:pPr>
         <w:keepNext/>
+        <w:keepLines/>
         <w:spacing w:after="40" w:before="100"/>
       </w:pPr>
       <w:r>
@@ -1292,6 +1386,8 @@
     </w:p>
     <w:p>
       <w:pPr>
+        <w:keepNext/>
+        <w:keepLines/>
         <w:spacing w:after="80" w:line="240"/>
       </w:pPr>
       <w:r>
@@ -1329,6 +1425,7 @@
       <w:tr>
         <w:trPr>
           <w:tblHeader/>
+          <w:cantSplit/>
         </w:trPr>
         <w:tc>
           <w:tcPr>
@@ -1342,6 +1439,10 @@
             </w:tcMar>
           </w:tcPr>
           <w:p>
+            <w:pPr>
+              <w:keepNext/>
+              <w:keepLines/>
+            </w:pPr>
             <w:r>
               <w:rPr>
                 <w:rFonts w:ascii="Arial" w:cs="Arial" w:eastAsia="Arial" w:hAnsi="Arial"/>
@@ -1367,6 +1468,10 @@
             </w:tcMar>
           </w:tcPr>
           <w:p>
+            <w:pPr>
+              <w:keepNext/>
+              <w:keepLines/>
+            </w:pPr>
             <w:r>
               <w:rPr>
                 <w:rFonts w:ascii="Arial" w:cs="Arial" w:eastAsia="Arial" w:hAnsi="Arial"/>
@@ -1392,6 +1497,10 @@
             </w:tcMar>
           </w:tcPr>
           <w:p>
+            <w:pPr>
+              <w:keepNext/>
+              <w:keepLines/>
+            </w:pPr>
             <w:r>
               <w:rPr>
                 <w:rFonts w:ascii="Arial" w:cs="Arial" w:eastAsia="Arial" w:hAnsi="Arial"/>
@@ -1417,6 +1526,10 @@
             </w:tcMar>
           </w:tcPr>
           <w:p>
+            <w:pPr>
+              <w:keepNext/>
+              <w:keepLines/>
+            </w:pPr>
             <w:r>
               <w:rPr>
                 <w:rFonts w:ascii="Arial" w:cs="Arial" w:eastAsia="Arial" w:hAnsi="Arial"/>
@@ -1432,6 +1545,9 @@
         </w:tc>
       </w:tr>
       <w:tr>
+        <w:trPr>
+          <w:cantSplit/>
+        </w:trPr>
         <w:tc>
           <w:tcPr>
             <w:tcW w:type="dxa" w:w="2340"/>
@@ -1443,6 +1559,10 @@
             </w:tcMar>
           </w:tcPr>
           <w:p>
+            <w:pPr>
+              <w:keepNext/>
+              <w:keepLines/>
+            </w:pPr>
             <w:r>
               <w:rPr>
                 <w:rFonts w:ascii="Arial" w:cs="Arial" w:eastAsia="Arial" w:hAnsi="Arial"/>
@@ -1464,6 +1584,10 @@
             </w:tcMar>
           </w:tcPr>
           <w:p>
+            <w:pPr>
+              <w:keepNext/>
+              <w:keepLines/>
+            </w:pPr>
             <w:r>
               <w:rPr>
                 <w:rFonts w:ascii="Arial" w:cs="Arial" w:eastAsia="Arial" w:hAnsi="Arial"/>
@@ -1485,6 +1609,10 @@
             </w:tcMar>
           </w:tcPr>
           <w:p>
+            <w:pPr>
+              <w:keepNext/>
+              <w:keepLines/>
+            </w:pPr>
             <w:r>
               <w:rPr>
                 <w:rFonts w:ascii="Arial" w:cs="Arial" w:eastAsia="Arial" w:hAnsi="Arial"/>
@@ -1506,6 +1634,10 @@
             </w:tcMar>
           </w:tcPr>
           <w:p>
+            <w:pPr>
+              <w:keepNext/>
+              <w:keepLines/>
+            </w:pPr>
             <w:r>
               <w:rPr>
                 <w:rFonts w:ascii="Arial" w:cs="Arial" w:eastAsia="Arial" w:hAnsi="Arial"/>
@@ -1518,6 +1650,9 @@
         </w:tc>
       </w:tr>
       <w:tr>
+        <w:trPr>
+          <w:cantSplit/>
+        </w:trPr>
         <w:tc>
           <w:tcPr>
             <w:tcW w:type="dxa" w:w="2340"/>
@@ -1529,6 +1664,10 @@
             </w:tcMar>
           </w:tcPr>
           <w:p>
+            <w:pPr>
+              <w:keepNext/>
+              <w:keepLines/>
+            </w:pPr>
             <w:r>
               <w:rPr>
                 <w:rFonts w:ascii="Arial" w:cs="Arial" w:eastAsia="Arial" w:hAnsi="Arial"/>
@@ -1550,6 +1689,10 @@
             </w:tcMar>
           </w:tcPr>
           <w:p>
+            <w:pPr>
+              <w:keepNext/>
+              <w:keepLines/>
+            </w:pPr>
             <w:r>
               <w:rPr>
                 <w:rFonts w:ascii="Arial" w:cs="Arial" w:eastAsia="Arial" w:hAnsi="Arial"/>
@@ -1571,6 +1714,10 @@
             </w:tcMar>
           </w:tcPr>
           <w:p>
+            <w:pPr>
+              <w:keepNext/>
+              <w:keepLines/>
+            </w:pPr>
             <w:r>
               <w:rPr>
                 <w:rFonts w:ascii="Arial" w:cs="Arial" w:eastAsia="Arial" w:hAnsi="Arial"/>
@@ -1592,6 +1739,10 @@
             </w:tcMar>
           </w:tcPr>
           <w:p>
+            <w:pPr>
+              <w:keepNext/>
+              <w:keepLines/>
+            </w:pPr>
             <w:r>
               <w:rPr>
                 <w:rFonts w:ascii="Arial" w:cs="Arial" w:eastAsia="Arial" w:hAnsi="Arial"/>
@@ -1604,6 +1755,9 @@
         </w:tc>
       </w:tr>
       <w:tr>
+        <w:trPr>
+          <w:cantSplit/>
+        </w:trPr>
         <w:tc>
           <w:tcPr>
             <w:tcW w:type="dxa" w:w="2340"/>
@@ -1615,6 +1769,10 @@
             </w:tcMar>
           </w:tcPr>
           <w:p>
+            <w:pPr>
+              <w:keepNext/>
+              <w:keepLines/>
+            </w:pPr>
             <w:r>
               <w:rPr>
                 <w:rFonts w:ascii="Arial" w:cs="Arial" w:eastAsia="Arial" w:hAnsi="Arial"/>
@@ -1636,6 +1794,10 @@
             </w:tcMar>
           </w:tcPr>
           <w:p>
+            <w:pPr>
+              <w:keepNext/>
+              <w:keepLines/>
+            </w:pPr>
             <w:r>
               <w:rPr>
                 <w:rFonts w:ascii="Arial" w:cs="Arial" w:eastAsia="Arial" w:hAnsi="Arial"/>
@@ -1657,6 +1819,10 @@
             </w:tcMar>
           </w:tcPr>
           <w:p>
+            <w:pPr>
+              <w:keepNext/>
+              <w:keepLines/>
+            </w:pPr>
             <w:r>
               <w:rPr>
                 <w:rFonts w:ascii="Arial" w:cs="Arial" w:eastAsia="Arial" w:hAnsi="Arial"/>
@@ -1678,6 +1844,10 @@
             </w:tcMar>
           </w:tcPr>
           <w:p>
+            <w:pPr>
+              <w:keepNext/>
+              <w:keepLines/>
+            </w:pPr>
             <w:r>
               <w:rPr>
                 <w:rFonts w:ascii="Arial" w:cs="Arial" w:eastAsia="Arial" w:hAnsi="Arial"/>
@@ -1690,6 +1860,9 @@
         </w:tc>
       </w:tr>
       <w:tr>
+        <w:trPr>
+          <w:cantSplit/>
+        </w:trPr>
         <w:tc>
           <w:tcPr>
             <w:tcW w:type="dxa" w:w="2340"/>
@@ -1701,6 +1874,10 @@
             </w:tcMar>
           </w:tcPr>
           <w:p>
+            <w:pPr>
+              <w:keepNext/>
+              <w:keepLines/>
+            </w:pPr>
             <w:r>
               <w:rPr>
                 <w:rFonts w:ascii="Arial" w:cs="Arial" w:eastAsia="Arial" w:hAnsi="Arial"/>
@@ -1722,6 +1899,10 @@
             </w:tcMar>
           </w:tcPr>
           <w:p>
+            <w:pPr>
+              <w:keepNext/>
+              <w:keepLines/>
+            </w:pPr>
             <w:r>
               <w:rPr>
                 <w:rFonts w:ascii="Arial" w:cs="Arial" w:eastAsia="Arial" w:hAnsi="Arial"/>
@@ -1743,6 +1924,10 @@
             </w:tcMar>
           </w:tcPr>
           <w:p>
+            <w:pPr>
+              <w:keepNext/>
+              <w:keepLines/>
+            </w:pPr>
             <w:r>
               <w:rPr>
                 <w:rFonts w:ascii="Arial" w:cs="Arial" w:eastAsia="Arial" w:hAnsi="Arial"/>
@@ -1764,6 +1949,10 @@
             </w:tcMar>
           </w:tcPr>
           <w:p>
+            <w:pPr>
+              <w:keepNext/>
+              <w:keepLines/>
+            </w:pPr>
             <w:r>
               <w:rPr>
                 <w:rFonts w:ascii="Arial" w:cs="Arial" w:eastAsia="Arial" w:hAnsi="Arial"/>
@@ -1776,6 +1965,9 @@
         </w:tc>
       </w:tr>
       <w:tr>
+        <w:trPr>
+          <w:cantSplit/>
+        </w:trPr>
         <w:tc>
           <w:tcPr>
             <w:tcW w:type="dxa" w:w="2340"/>
@@ -1787,6 +1979,10 @@
             </w:tcMar>
           </w:tcPr>
           <w:p>
+            <w:pPr>
+              <w:keepNext/>
+              <w:keepLines/>
+            </w:pPr>
             <w:r>
               <w:rPr>
                 <w:rFonts w:ascii="Arial" w:cs="Arial" w:eastAsia="Arial" w:hAnsi="Arial"/>
@@ -1808,6 +2004,10 @@
             </w:tcMar>
           </w:tcPr>
           <w:p>
+            <w:pPr>
+              <w:keepNext/>
+              <w:keepLines/>
+            </w:pPr>
             <w:r>
               <w:rPr>
                 <w:rFonts w:ascii="Arial" w:cs="Arial" w:eastAsia="Arial" w:hAnsi="Arial"/>
@@ -1829,6 +2029,10 @@
             </w:tcMar>
           </w:tcPr>
           <w:p>
+            <w:pPr>
+              <w:keepNext/>
+              <w:keepLines/>
+            </w:pPr>
             <w:r>
               <w:rPr>
                 <w:rFonts w:ascii="Arial" w:cs="Arial" w:eastAsia="Arial" w:hAnsi="Arial"/>
@@ -1850,6 +2054,10 @@
             </w:tcMar>
           </w:tcPr>
           <w:p>
+            <w:pPr>
+              <w:keepNext/>
+              <w:keepLines/>
+            </w:pPr>
             <w:r>
               <w:rPr>
                 <w:rFonts w:ascii="Arial" w:cs="Arial" w:eastAsia="Arial" w:hAnsi="Arial"/>
@@ -1862,6 +2070,9 @@
         </w:tc>
       </w:tr>
       <w:tr>
+        <w:trPr>
+          <w:cantSplit/>
+        </w:trPr>
         <w:tc>
           <w:tcPr>
             <w:tcW w:type="dxa" w:w="2340"/>
@@ -1873,6 +2084,9 @@
             </w:tcMar>
           </w:tcPr>
           <w:p>
+            <w:pPr>
+              <w:keepLines/>
+            </w:pPr>
             <w:r>
               <w:rPr>
                 <w:rFonts w:ascii="Arial" w:cs="Arial" w:eastAsia="Arial" w:hAnsi="Arial"/>
@@ -1894,6 +2108,9 @@
             </w:tcMar>
           </w:tcPr>
           <w:p>
+            <w:pPr>
+              <w:keepLines/>
+            </w:pPr>
             <w:r>
               <w:rPr>
                 <w:rFonts w:ascii="Arial" w:cs="Arial" w:eastAsia="Arial" w:hAnsi="Arial"/>
@@ -1915,6 +2132,9 @@
             </w:tcMar>
           </w:tcPr>
           <w:p>
+            <w:pPr>
+              <w:keepLines/>
+            </w:pPr>
             <w:r>
               <w:rPr>
                 <w:rFonts w:ascii="Arial" w:cs="Arial" w:eastAsia="Arial" w:hAnsi="Arial"/>
@@ -1936,6 +2156,9 @@
             </w:tcMar>
           </w:tcPr>
           <w:p>
+            <w:pPr>
+              <w:keepLines/>
+            </w:pPr>
             <w:r>
               <w:rPr>
                 <w:rFonts w:ascii="Arial" w:cs="Arial" w:eastAsia="Arial" w:hAnsi="Arial"/>
@@ -1950,6 +2173,8 @@
     </w:tbl>
     <w:p>
       <w:pPr>
+        <w:keepNext/>
+        <w:keepLines/>
         <w:spacing w:after="40" w:before="80"/>
       </w:pPr>
     </w:p>
@@ -1969,6 +2194,9 @@
         <w:gridCol w:w="9360"/>
       </w:tblGrid>
       <w:tr>
+        <w:trPr>
+          <w:cantSplit/>
+        </w:trPr>
         <w:tc>
           <w:tcPr>
             <w:tcW w:type="dxa" w:w="9360"/>
@@ -1982,6 +2210,7 @@
           </w:tcPr>
           <w:p>
             <w:pPr>
+              <w:keepLines/>
               <w:spacing w:after="40"/>
             </w:pPr>
             <w:r>
@@ -1998,6 +2227,7 @@
           </w:p>
           <w:p>
             <w:pPr>
+              <w:keepLines/>
               <w:spacing w:after="40"/>
             </w:pPr>
             <w:r>
@@ -2012,6 +2242,7 @@
           </w:p>
           <w:p>
             <w:pPr>
+              <w:keepLines/>
               <w:spacing w:after="40"/>
             </w:pPr>
             <w:r>
@@ -2026,6 +2257,7 @@
           </w:p>
           <w:p>
             <w:pPr>
+              <w:keepLines/>
               <w:spacing w:after="0"/>
             </w:pPr>
             <w:r>
@@ -2044,6 +2276,7 @@
     <w:p>
       <w:pPr>
         <w:keepNext/>
+        <w:keepLines/>
         <w:spacing w:after="40" w:before="100"/>
       </w:pPr>
       <w:r>
@@ -2060,6 +2293,8 @@
     </w:p>
     <w:p>
       <w:pPr>
+        <w:keepNext/>
+        <w:keepLines/>
         <w:spacing w:after="60" w:line="240"/>
       </w:pPr>
       <w:r>
@@ -2079,6 +2314,8 @@
     <w:p>
       <w:pPr>
         <w:pStyle w:val="ListParagraph"/>
+        <w:keepNext/>
+        <w:keepLines/>
         <w:numPr>
           <w:ilvl w:val="0"/>
           <w:numId w:val="3"/>
@@ -2115,6 +2352,8 @@
     <w:p>
       <w:pPr>
         <w:pStyle w:val="ListParagraph"/>
+        <w:keepNext/>
+        <w:keepLines/>
         <w:numPr>
           <w:ilvl w:val="0"/>
           <w:numId w:val="3"/>
@@ -2151,6 +2390,7 @@
     <w:p>
       <w:pPr>
         <w:pStyle w:val="ListParagraph"/>
+        <w:keepLines/>
         <w:numPr>
           <w:ilvl w:val="0"/>
           <w:numId w:val="3"/>
@@ -2186,6 +2426,7 @@
     </w:p>
     <w:p>
       <w:pPr>
+        <w:keepLines/>
         <w:spacing w:after="60" w:line="240"/>
       </w:pPr>
       <w:r>
@@ -2257,6 +2498,7 @@
     <w:p>
       <w:pPr>
         <w:keepNext/>
+        <w:keepLines/>
         <w:spacing w:after="40" w:before="100"/>
       </w:pPr>
       <w:r>
@@ -2273,6 +2515,7 @@
     </w:p>
     <w:p>
       <w:pPr>
+        <w:keepLines/>
         <w:spacing w:after="60" w:line="240"/>
       </w:pPr>
       <w:r>
@@ -2368,6 +2611,9 @@
       </w:r>
     </w:p>
     <w:p>
+      <w:pPr>
+        <w:keepLines/>
+      </w:pPr>
       <w:r>
         <w:br w:type="page"/>
       </w:r>
@@ -2375,6 +2621,7 @@
     <w:p>
       <w:pPr>
         <w:keepNext/>
+        <w:keepLines/>
         <w:pBdr>
           <w:bottom w:val="single" w:color="2E74B5" w:sz="12" w:space="3"/>
         </w:pBdr>
@@ -2396,6 +2643,7 @@
     <w:p>
       <w:pPr>
         <w:keepNext/>
+        <w:keepLines/>
         <w:spacing w:after="40" w:before="100"/>
       </w:pPr>
       <w:r>
@@ -2430,6 +2678,7 @@
       <w:tr>
         <w:trPr>
           <w:tblHeader/>
+          <w:cantSplit/>
         </w:trPr>
         <w:tc>
           <w:tcPr>
@@ -2444,6 +2693,8 @@
           </w:tcPr>
           <w:p>
             <w:pPr>
+              <w:keepNext/>
+              <w:keepLines/>
               <w:jc w:val="center"/>
             </w:pPr>
             <w:r>
@@ -2471,6 +2722,10 @@
             </w:tcMar>
           </w:tcPr>
           <w:p>
+            <w:pPr>
+              <w:keepNext/>
+              <w:keepLines/>
+            </w:pPr>
             <w:r>
               <w:rPr>
                 <w:rFonts w:ascii="Arial" w:cs="Arial" w:eastAsia="Arial" w:hAnsi="Arial"/>
@@ -2497,6 +2752,8 @@
           </w:tcPr>
           <w:p>
             <w:pPr>
+              <w:keepNext/>
+              <w:keepLines/>
               <w:jc w:val="center"/>
             </w:pPr>
             <w:r>
@@ -2516,6 +2773,7 @@
       <w:tr>
         <w:trPr>
           <w:trHeight w:val="560" w:hRule="atLeast"/>
+          <w:cantSplit/>
         </w:trPr>
         <w:tc>
           <w:tcPr>
@@ -2529,6 +2787,8 @@
           </w:tcPr>
           <w:p>
             <w:pPr>
+              <w:keepNext/>
+              <w:keepLines/>
               <w:jc w:val="center"/>
             </w:pPr>
             <w:r>
@@ -2555,6 +2815,10 @@
             </w:tcMar>
           </w:tcPr>
           <w:p>
+            <w:pPr>
+              <w:keepNext/>
+              <w:keepLines/>
+            </w:pPr>
             <w:r>
               <w:rPr>
                 <w:rFonts w:ascii="Arial" w:cs="Arial" w:eastAsia="Arial" w:hAnsi="Arial"/>
@@ -2588,6 +2852,8 @@
           </w:tcPr>
           <w:p>
             <w:pPr>
+              <w:keepNext/>
+              <w:keepLines/>
               <w:spacing w:after="20" w:before="60"/>
             </w:pPr>
             <w:r>
@@ -2605,6 +2871,7 @@
       <w:tr>
         <w:trPr>
           <w:trHeight w:val="560" w:hRule="atLeast"/>
+          <w:cantSplit/>
         </w:trPr>
         <w:tc>
           <w:tcPr>
@@ -2618,6 +2885,8 @@
           </w:tcPr>
           <w:p>
             <w:pPr>
+              <w:keepNext/>
+              <w:keepLines/>
               <w:jc w:val="center"/>
             </w:pPr>
             <w:r>
@@ -2644,6 +2913,10 @@
             </w:tcMar>
           </w:tcPr>
           <w:p>
+            <w:pPr>
+              <w:keepNext/>
+              <w:keepLines/>
+            </w:pPr>
             <w:r>
               <w:rPr>
                 <w:rFonts w:ascii="Arial" w:cs="Arial" w:eastAsia="Arial" w:hAnsi="Arial"/>
@@ -2677,6 +2950,8 @@
           </w:tcPr>
           <w:p>
             <w:pPr>
+              <w:keepNext/>
+              <w:keepLines/>
               <w:spacing w:after="20" w:before="60"/>
             </w:pPr>
             <w:r>
@@ -2694,6 +2969,7 @@
       <w:tr>
         <w:trPr>
           <w:trHeight w:val="560" w:hRule="atLeast"/>
+          <w:cantSplit/>
         </w:trPr>
         <w:tc>
           <w:tcPr>
@@ -2707,6 +2983,8 @@
           </w:tcPr>
           <w:p>
             <w:pPr>
+              <w:keepNext/>
+              <w:keepLines/>
               <w:jc w:val="center"/>
             </w:pPr>
             <w:r>
@@ -2733,6 +3011,10 @@
             </w:tcMar>
           </w:tcPr>
           <w:p>
+            <w:pPr>
+              <w:keepNext/>
+              <w:keepLines/>
+            </w:pPr>
             <w:r>
               <w:rPr>
                 <w:rFonts w:ascii="Arial" w:cs="Arial" w:eastAsia="Arial" w:hAnsi="Arial"/>
@@ -2766,6 +3048,8 @@
           </w:tcPr>
           <w:p>
             <w:pPr>
+              <w:keepNext/>
+              <w:keepLines/>
               <w:spacing w:after="20" w:before="60"/>
             </w:pPr>
             <w:r>
@@ -2783,6 +3067,7 @@
       <w:tr>
         <w:trPr>
           <w:trHeight w:val="560" w:hRule="atLeast"/>
+          <w:cantSplit/>
         </w:trPr>
         <w:tc>
           <w:tcPr>
@@ -2796,6 +3081,7 @@
           </w:tcPr>
           <w:p>
             <w:pPr>
+              <w:keepLines/>
               <w:jc w:val="center"/>
             </w:pPr>
             <w:r>
@@ -2822,6 +3108,9 @@
             </w:tcMar>
           </w:tcPr>
           <w:p>
+            <w:pPr>
+              <w:keepLines/>
+            </w:pPr>
             <w:r>
               <w:rPr>
                 <w:rFonts w:ascii="Arial" w:cs="Arial" w:eastAsia="Arial" w:hAnsi="Arial"/>
@@ -2855,6 +3144,7 @@
           </w:tcPr>
           <w:p>
             <w:pPr>
+              <w:keepLines/>
               <w:spacing w:after="20" w:before="60"/>
             </w:pPr>
             <w:r>
@@ -2872,12 +3162,14 @@
     </w:tbl>
     <w:p>
       <w:pPr>
+        <w:keepLines/>
         <w:spacing w:before="60"/>
       </w:pPr>
     </w:p>
     <w:p>
       <w:pPr>
         <w:keepNext/>
+        <w:keepLines/>
         <w:spacing w:after="40" w:before="100"/>
       </w:pPr>
       <w:r>
@@ -2912,6 +3204,7 @@
       <w:tr>
         <w:trPr>
           <w:tblHeader/>
+          <w:cantSplit/>
         </w:trPr>
         <w:tc>
           <w:tcPr>
@@ -2926,6 +3219,8 @@
           </w:tcPr>
           <w:p>
             <w:pPr>
+              <w:keepNext/>
+              <w:keepLines/>
               <w:jc w:val="center"/>
             </w:pPr>
             <w:r>
@@ -2954,6 +3249,8 @@
           </w:tcPr>
           <w:p>
             <w:pPr>
+              <w:keepNext/>
+              <w:keepLines/>
               <w:jc w:val="center"/>
             </w:pPr>
             <w:r>
@@ -2982,6 +3279,8 @@
           </w:tcPr>
           <w:p>
             <w:pPr>
+              <w:keepNext/>
+              <w:keepLines/>
               <w:jc w:val="center"/>
             </w:pPr>
             <w:r>
@@ -3001,6 +3300,7 @@
       <w:tr>
         <w:trPr>
           <w:trHeight w:val="760" w:hRule="atLeast"/>
+          <w:cantSplit/>
         </w:trPr>
         <w:tc>
           <w:tcPr>
@@ -3014,6 +3314,8 @@
           </w:tcPr>
           <w:p>
             <w:pPr>
+              <w:keepNext/>
+              <w:keepLines/>
               <w:jc w:val="center"/>
             </w:pPr>
             <w:r>
@@ -3041,6 +3343,8 @@
           </w:tcPr>
           <w:p>
             <w:pPr>
+              <w:keepNext/>
+              <w:keepLines/>
               <w:spacing w:before="120"/>
               <w:jc w:val="center"/>
             </w:pPr>
@@ -3068,6 +3372,8 @@
           </w:tcPr>
           <w:p>
             <w:pPr>
+              <w:keepNext/>
+              <w:keepLines/>
               <w:spacing w:after="30" w:before="80"/>
             </w:pPr>
             <w:r>
@@ -3093,6 +3399,8 @@
           </w:p>
           <w:p>
             <w:pPr>
+              <w:keepNext/>
+              <w:keepLines/>
               <w:spacing w:after="40"/>
             </w:pPr>
             <w:r>
@@ -3121,6 +3429,7 @@
       <w:tr>
         <w:trPr>
           <w:trHeight w:val="760" w:hRule="atLeast"/>
+          <w:cantSplit/>
         </w:trPr>
         <w:tc>
           <w:tcPr>
@@ -3134,6 +3443,8 @@
           </w:tcPr>
           <w:p>
             <w:pPr>
+              <w:keepNext/>
+              <w:keepLines/>
               <w:jc w:val="center"/>
             </w:pPr>
             <w:r>
@@ -3161,6 +3472,8 @@
           </w:tcPr>
           <w:p>
             <w:pPr>
+              <w:keepNext/>
+              <w:keepLines/>
               <w:spacing w:before="120"/>
               <w:jc w:val="center"/>
             </w:pPr>
@@ -3188,6 +3501,8 @@
           </w:tcPr>
           <w:p>
             <w:pPr>
+              <w:keepNext/>
+              <w:keepLines/>
               <w:spacing w:after="30" w:before="80"/>
             </w:pPr>
             <w:r>
@@ -3213,6 +3528,8 @@
           </w:p>
           <w:p>
             <w:pPr>
+              <w:keepNext/>
+              <w:keepLines/>
               <w:spacing w:after="40"/>
             </w:pPr>
             <w:r>
@@ -3241,6 +3558,7 @@
       <w:tr>
         <w:trPr>
           <w:trHeight w:val="760" w:hRule="atLeast"/>
+          <w:cantSplit/>
         </w:trPr>
         <w:tc>
           <w:tcPr>
@@ -3254,6 +3572,8 @@
           </w:tcPr>
           <w:p>
             <w:pPr>
+              <w:keepNext/>
+              <w:keepLines/>
               <w:jc w:val="center"/>
             </w:pPr>
             <w:r>
@@ -3281,6 +3601,8 @@
           </w:tcPr>
           <w:p>
             <w:pPr>
+              <w:keepNext/>
+              <w:keepLines/>
               <w:spacing w:before="120"/>
               <w:jc w:val="center"/>
             </w:pPr>
@@ -3308,6 +3630,8 @@
           </w:tcPr>
           <w:p>
             <w:pPr>
+              <w:keepNext/>
+              <w:keepLines/>
               <w:spacing w:after="30" w:before="80"/>
             </w:pPr>
             <w:r>
@@ -3333,6 +3657,8 @@
           </w:p>
           <w:p>
             <w:pPr>
+              <w:keepNext/>
+              <w:keepLines/>
               <w:spacing w:after="40"/>
             </w:pPr>
             <w:r>
@@ -3361,6 +3687,7 @@
       <w:tr>
         <w:trPr>
           <w:trHeight w:val="760" w:hRule="atLeast"/>
+          <w:cantSplit/>
         </w:trPr>
         <w:tc>
           <w:tcPr>
@@ -3374,6 +3701,7 @@
           </w:tcPr>
           <w:p>
             <w:pPr>
+              <w:keepLines/>
               <w:jc w:val="center"/>
             </w:pPr>
             <w:r>
@@ -3401,6 +3729,7 @@
           </w:tcPr>
           <w:p>
             <w:pPr>
+              <w:keepLines/>
               <w:spacing w:before="120"/>
               <w:jc w:val="center"/>
             </w:pPr>
@@ -3428,6 +3757,7 @@
           </w:tcPr>
           <w:p>
             <w:pPr>
+              <w:keepLines/>
               <w:spacing w:after="30" w:before="80"/>
             </w:pPr>
             <w:r>
@@ -3453,6 +3783,7 @@
           </w:p>
           <w:p>
             <w:pPr>
+              <w:keepLines/>
               <w:spacing w:after="40"/>
             </w:pPr>
             <w:r>
@@ -3481,12 +3812,14 @@
     </w:tbl>
     <w:p>
       <w:pPr>
+        <w:keepLines/>
         <w:spacing w:before="60"/>
       </w:pPr>
     </w:p>
     <w:p>
       <w:pPr>
         <w:keepNext/>
+        <w:keepLines/>
         <w:spacing w:after="40" w:before="100"/>
       </w:pPr>
       <w:r>
@@ -3522,6 +3855,7 @@
       <w:tr>
         <w:trPr>
           <w:tblHeader/>
+          <w:cantSplit/>
         </w:trPr>
         <w:tc>
           <w:tcPr>
@@ -3536,6 +3870,8 @@
           </w:tcPr>
           <w:p>
             <w:pPr>
+              <w:keepNext/>
+              <w:keepLines/>
               <w:jc w:val="center"/>
             </w:pPr>
             <w:r>
@@ -3564,6 +3900,8 @@
           </w:tcPr>
           <w:p>
             <w:pPr>
+              <w:keepNext/>
+              <w:keepLines/>
               <w:jc w:val="center"/>
             </w:pPr>
             <w:r>
@@ -3592,6 +3930,8 @@
           </w:tcPr>
           <w:p>
             <w:pPr>
+              <w:keepNext/>
+              <w:keepLines/>
               <w:jc w:val="center"/>
             </w:pPr>
             <w:r>
@@ -3620,6 +3960,8 @@
           </w:tcPr>
           <w:p>
             <w:pPr>
+              <w:keepNext/>
+              <w:keepLines/>
               <w:jc w:val="center"/>
             </w:pPr>
             <w:r>
@@ -3639,6 +3981,7 @@
       <w:tr>
         <w:trPr>
           <w:trHeight w:val="1000" w:hRule="atLeast"/>
+          <w:cantSplit/>
         </w:trPr>
         <w:tc>
           <w:tcPr>
@@ -3652,6 +3995,8 @@
           </w:tcPr>
           <w:p>
             <w:pPr>
+              <w:keepNext/>
+              <w:keepLines/>
               <w:jc w:val="center"/>
             </w:pPr>
             <w:r>
@@ -3679,6 +4024,8 @@
           </w:tcPr>
           <w:p>
             <w:pPr>
+              <w:keepNext/>
+              <w:keepLines/>
               <w:spacing w:after="60"/>
             </w:pPr>
             <w:r>
@@ -3691,6 +4038,10 @@
             </w:r>
           </w:p>
           <w:p>
+            <w:pPr>
+              <w:keepNext/>
+              <w:keepLines/>
+            </w:pPr>
             <w:r>
               <w:rPr>
                 <w:rFonts w:ascii="Arial" w:cs="Arial" w:eastAsia="Arial" w:hAnsi="Arial"/>
@@ -3716,6 +4067,8 @@
           </w:tcPr>
           <w:p>
             <w:pPr>
+              <w:keepNext/>
+              <w:keepLines/>
               <w:spacing w:after="20" w:before="60"/>
             </w:pPr>
             <w:r>
@@ -3730,6 +4083,8 @@
           </w:p>
           <w:p>
             <w:pPr>
+              <w:keepNext/>
+              <w:keepLines/>
               <w:spacing w:after="20" w:before="60"/>
             </w:pPr>
             <w:r>
@@ -3755,6 +4110,8 @@
           </w:tcPr>
           <w:p>
             <w:pPr>
+              <w:keepNext/>
+              <w:keepLines/>
               <w:spacing w:after="20" w:before="60"/>
             </w:pPr>
             <w:r>
@@ -3769,6 +4126,8 @@
           </w:p>
           <w:p>
             <w:pPr>
+              <w:keepNext/>
+              <w:keepLines/>
               <w:spacing w:after="20" w:before="60"/>
             </w:pPr>
             <w:r>
@@ -3786,6 +4145,7 @@
       <w:tr>
         <w:trPr>
           <w:trHeight w:val="1000" w:hRule="atLeast"/>
+          <w:cantSplit/>
         </w:trPr>
         <w:tc>
           <w:tcPr>
@@ -3799,6 +4159,8 @@
           </w:tcPr>
           <w:p>
             <w:pPr>
+              <w:keepNext/>
+              <w:keepLines/>
               <w:jc w:val="center"/>
             </w:pPr>
             <w:r>
@@ -3826,6 +4188,8 @@
           </w:tcPr>
           <w:p>
             <w:pPr>
+              <w:keepNext/>
+              <w:keepLines/>
               <w:spacing w:after="60"/>
             </w:pPr>
             <w:r>
@@ -3838,6 +4202,10 @@
             </w:r>
           </w:p>
           <w:p>
+            <w:pPr>
+              <w:keepNext/>
+              <w:keepLines/>
+            </w:pPr>
             <w:r>
               <w:rPr>
                 <w:rFonts w:ascii="Arial" w:cs="Arial" w:eastAsia="Arial" w:hAnsi="Arial"/>
@@ -3863,6 +4231,8 @@
           </w:tcPr>
           <w:p>
             <w:pPr>
+              <w:keepNext/>
+              <w:keepLines/>
               <w:spacing w:after="20" w:before="60"/>
             </w:pPr>
             <w:r>
@@ -3877,6 +4247,8 @@
           </w:p>
           <w:p>
             <w:pPr>
+              <w:keepNext/>
+              <w:keepLines/>
               <w:spacing w:after="20" w:before="60"/>
             </w:pPr>
             <w:r>
@@ -3902,6 +4274,8 @@
           </w:tcPr>
           <w:p>
             <w:pPr>
+              <w:keepNext/>
+              <w:keepLines/>
               <w:spacing w:after="20" w:before="60"/>
             </w:pPr>
             <w:r>
@@ -3916,6 +4290,8 @@
           </w:p>
           <w:p>
             <w:pPr>
+              <w:keepNext/>
+              <w:keepLines/>
               <w:spacing w:after="20" w:before="60"/>
             </w:pPr>
             <w:r>
@@ -3933,6 +4309,7 @@
       <w:tr>
         <w:trPr>
           <w:trHeight w:val="1000" w:hRule="atLeast"/>
+          <w:cantSplit/>
         </w:trPr>
         <w:tc>
           <w:tcPr>
@@ -3946,6 +4323,7 @@
           </w:tcPr>
           <w:p>
             <w:pPr>
+              <w:keepLines/>
               <w:jc w:val="center"/>
             </w:pPr>
             <w:r>
@@ -3973,6 +4351,7 @@
           </w:tcPr>
           <w:p>
             <w:pPr>
+              <w:keepLines/>
               <w:spacing w:after="60"/>
             </w:pPr>
             <w:r>
@@ -3985,6 +4364,9 @@
             </w:r>
           </w:p>
           <w:p>
+            <w:pPr>
+              <w:keepLines/>
+            </w:pPr>
             <w:r>
               <w:rPr>
                 <w:rFonts w:ascii="Arial" w:cs="Arial" w:eastAsia="Arial" w:hAnsi="Arial"/>
@@ -4010,6 +4392,7 @@
           </w:tcPr>
           <w:p>
             <w:pPr>
+              <w:keepLines/>
               <w:spacing w:after="20" w:before="60"/>
             </w:pPr>
             <w:r>
@@ -4024,6 +4407,7 @@
           </w:p>
           <w:p>
             <w:pPr>
+              <w:keepLines/>
               <w:spacing w:after="20" w:before="60"/>
             </w:pPr>
             <w:r>
@@ -4049,6 +4433,7 @@
           </w:tcPr>
           <w:p>
             <w:pPr>
+              <w:keepLines/>
               <w:spacing w:after="20" w:before="60"/>
             </w:pPr>
             <w:r>
@@ -4063,6 +4448,7 @@
           </w:p>
           <w:p>
             <w:pPr>
+              <w:keepLines/>
               <w:spacing w:after="20" w:before="60"/>
             </w:pPr>
             <w:r>
@@ -4079,6 +4465,9 @@
       </w:tr>
     </w:tbl>
     <w:p>
+      <w:pPr>
+        <w:keepLines/>
+      </w:pPr>
       <w:r>
         <w:br w:type="page"/>
       </w:r>
@@ -4086,6 +4475,7 @@
     <w:p>
       <w:pPr>
         <w:keepNext/>
+        <w:keepLines/>
         <w:pBdr>
           <w:bottom w:val="single" w:color="2E74B5" w:sz="12" w:space="3"/>
         </w:pBdr>
@@ -4120,6 +4510,9 @@
         <w:gridCol w:w="9360"/>
       </w:tblGrid>
       <w:tr>
+        <w:trPr>
+          <w:cantSplit/>
+        </w:trPr>
         <w:tc>
           <w:tcPr>
             <w:tcW w:type="dxa" w:w="9360"/>
@@ -4133,6 +4526,7 @@
           </w:tcPr>
           <w:p>
             <w:pPr>
+              <w:keepLines/>
               <w:spacing w:after="40"/>
             </w:pPr>
             <w:r>
@@ -4149,6 +4543,7 @@
           </w:p>
           <w:p>
             <w:pPr>
+              <w:keepLines/>
               <w:spacing w:after="40"/>
             </w:pPr>
             <w:r>
@@ -4163,6 +4558,7 @@
           </w:p>
           <w:p>
             <w:pPr>
+              <w:keepLines/>
               <w:spacing w:after="40"/>
             </w:pPr>
             <w:r>
@@ -4177,6 +4573,7 @@
           </w:p>
           <w:p>
             <w:pPr>
+              <w:keepLines/>
               <w:spacing w:after="40"/>
             </w:pPr>
             <w:r>
@@ -4191,6 +4588,7 @@
           </w:p>
           <w:p>
             <w:pPr>
+              <w:keepLines/>
               <w:spacing w:after="40"/>
             </w:pPr>
             <w:r>
@@ -4205,6 +4603,7 @@
           </w:p>
           <w:p>
             <w:pPr>
+              <w:keepLines/>
               <w:spacing w:after="40"/>
             </w:pPr>
             <w:r>
@@ -4219,6 +4618,7 @@
           </w:p>
           <w:p>
             <w:pPr>
+              <w:keepLines/>
               <w:spacing w:after="0"/>
             </w:pPr>
             <w:r>
@@ -4237,6 +4637,7 @@
     <w:p>
       <w:pPr>
         <w:keepNext/>
+        <w:keepLines/>
         <w:pBdr>
           <w:bottom w:val="single" w:color="2E74B5" w:sz="12" w:space="3"/>
         </w:pBdr>
@@ -4258,6 +4659,8 @@
     <w:p>
       <w:pPr>
         <w:pStyle w:val="ListParagraph"/>
+        <w:keepNext/>
+        <w:keepLines/>
         <w:numPr>
           <w:ilvl w:val="0"/>
           <w:numId w:val="3"/>
@@ -4281,6 +4684,8 @@
     <w:p>
       <w:pPr>
         <w:pStyle w:val="ListParagraph"/>
+        <w:keepNext/>
+        <w:keepLines/>
         <w:numPr>
           <w:ilvl w:val="0"/>
           <w:numId w:val="3"/>
@@ -4304,6 +4709,8 @@
     <w:p>
       <w:pPr>
         <w:pStyle w:val="ListParagraph"/>
+        <w:keepNext/>
+        <w:keepLines/>
         <w:numPr>
           <w:ilvl w:val="0"/>
           <w:numId w:val="3"/>
@@ -4327,6 +4734,8 @@
     <w:p>
       <w:pPr>
         <w:pStyle w:val="ListParagraph"/>
+        <w:keepNext/>
+        <w:keepLines/>
         <w:numPr>
           <w:ilvl w:val="0"/>
           <w:numId w:val="3"/>
@@ -4350,6 +4759,8 @@
     <w:p>
       <w:pPr>
         <w:pStyle w:val="ListParagraph"/>
+        <w:keepNext/>
+        <w:keepLines/>
         <w:numPr>
           <w:ilvl w:val="0"/>
           <w:numId w:val="3"/>
@@ -4373,6 +4784,7 @@
     <w:p>
       <w:pPr>
         <w:pStyle w:val="ListParagraph"/>
+        <w:keepLines/>
         <w:numPr>
           <w:ilvl w:val="0"/>
           <w:numId w:val="3"/>
@@ -4396,6 +4808,7 @@
     <w:p>
       <w:pPr>
         <w:keepNext/>
+        <w:keepLines/>
         <w:pBdr>
           <w:bottom w:val="single" w:color="2E74B5" w:sz="12" w:space="3"/>
         </w:pBdr>
@@ -4416,6 +4829,7 @@
     </w:p>
     <w:p>
       <w:pPr>
+        <w:keepLines/>
         <w:spacing w:after="60" w:line="240"/>
       </w:pPr>
       <w:r>
@@ -4617,6 +5031,7 @@
     <w:p>
       <w:pPr>
         <w:keepNext/>
+        <w:keepLines/>
         <w:pBdr>
           <w:bottom w:val="single" w:color="2E74B5" w:sz="12" w:space="3"/>
         </w:pBdr>
@@ -4638,6 +5053,8 @@
     <w:p>
       <w:pPr>
         <w:pStyle w:val="ListParagraph"/>
+        <w:keepNext/>
+        <w:keepLines/>
         <w:numPr>
           <w:ilvl w:val="0"/>
           <w:numId w:val="3"/>
@@ -4661,6 +5078,8 @@
     <w:p>
       <w:pPr>
         <w:pStyle w:val="ListParagraph"/>
+        <w:keepNext/>
+        <w:keepLines/>
         <w:numPr>
           <w:ilvl w:val="0"/>
           <w:numId w:val="3"/>
@@ -4684,6 +5103,8 @@
     <w:p>
       <w:pPr>
         <w:pStyle w:val="ListParagraph"/>
+        <w:keepNext/>
+        <w:keepLines/>
         <w:numPr>
           <w:ilvl w:val="0"/>
           <w:numId w:val="3"/>
@@ -4707,6 +5128,8 @@
     <w:p>
       <w:pPr>
         <w:pStyle w:val="ListParagraph"/>
+        <w:keepNext/>
+        <w:keepLines/>
         <w:numPr>
           <w:ilvl w:val="0"/>
           <w:numId w:val="3"/>
@@ -4730,6 +5153,8 @@
     <w:p>
       <w:pPr>
         <w:pStyle w:val="ListParagraph"/>
+        <w:keepNext/>
+        <w:keepLines/>
         <w:numPr>
           <w:ilvl w:val="0"/>
           <w:numId w:val="3"/>
@@ -4753,6 +5178,7 @@
     <w:p>
       <w:pPr>
         <w:pStyle w:val="ListParagraph"/>
+        <w:keepLines/>
         <w:numPr>
           <w:ilvl w:val="0"/>
           <w:numId w:val="3"/>

</xml_diff>

<commit_message>
Move Common Mistakes before Examples
Reorder so Common Mistakes follows Main Lesson Notes and precedes the
Examples practice section. Update the QA report page-layout table.

Co-Authored-By: Claude Opus 4.8 <noreply@anthropic.com>
Claude-Session: https://claude.ai/code/session_01FC3BfbH3eZoJiVptb2oNST
</commit_message>
<xml_diff>
--- a/algebra1-notes/Algebra1_Unit1_Lesson1_Variables_and_Expressions.docx
+++ b/algebra1-notes/Algebra1_Unit1_Lesson1_Variables_and_Expressions.docx
@@ -2612,6 +2612,177 @@
     </w:p>
     <w:p>
       <w:pPr>
+        <w:keepNext/>
+        <w:keepLines/>
+        <w:pBdr>
+          <w:bottom w:val="single" w:color="2E74B5" w:sz="12" w:space="3"/>
+        </w:pBdr>
+        <w:spacing w:after="50" w:before="160"/>
+      </w:pPr>
+      <w:r>
+        <w:rPr>
+          <w:rFonts w:ascii="Arial" w:cs="Arial" w:eastAsia="Arial" w:hAnsi="Arial"/>
+          <w:b/>
+          <w:bCs/>
+          <w:caps/>
+          <w:color w:val="1F3864"/>
+          <w:sz w:val="26"/>
+          <w:szCs w:val="26"/>
+        </w:rPr>
+        <w:t xml:space="preserve">Common Mistakes</w:t>
+      </w:r>
+    </w:p>
+    <w:p>
+      <w:pPr>
+        <w:pStyle w:val="ListParagraph"/>
+        <w:keepNext/>
+        <w:keepLines/>
+        <w:numPr>
+          <w:ilvl w:val="0"/>
+          <w:numId w:val="3"/>
+        </w:numPr>
+        <w:spacing w:after="30" w:line="240"/>
+      </w:pPr>
+      <w:r>
+        <w:rPr>
+          <w:rFonts w:ascii="Arial" w:cs="Arial" w:eastAsia="Arial" w:hAnsi="Arial"/>
+          <w:b w:val="false"/>
+          <w:bCs w:val="false"/>
+          <w:i w:val="false"/>
+          <w:iCs w:val="false"/>
+          <w:color w:val="000000"/>
+          <w:sz w:val="22"/>
+          <w:szCs w:val="22"/>
+        </w:rPr>
+        <w:t xml:space="preserve">Reversing subtraction: writing 8 – n for “8 less than n” (it should be n – 8).</w:t>
+      </w:r>
+    </w:p>
+    <w:p>
+      <w:pPr>
+        <w:pStyle w:val="ListParagraph"/>
+        <w:keepNext/>
+        <w:keepLines/>
+        <w:numPr>
+          <w:ilvl w:val="0"/>
+          <w:numId w:val="3"/>
+        </w:numPr>
+        <w:spacing w:after="30" w:line="240"/>
+      </w:pPr>
+      <w:r>
+        <w:rPr>
+          <w:rFonts w:ascii="Arial" w:cs="Arial" w:eastAsia="Arial" w:hAnsi="Arial"/>
+          <w:b w:val="false"/>
+          <w:bCs w:val="false"/>
+          <w:i w:val="false"/>
+          <w:iCs w:val="false"/>
+          <w:color w:val="000000"/>
+          <w:sz w:val="22"/>
+          <w:szCs w:val="22"/>
+        </w:rPr>
+        <w:t xml:space="preserve">Reversing division / quotient order (“the quotient of a and b” is a ÷ b, not b ÷ a).</w:t>
+      </w:r>
+    </w:p>
+    <w:p>
+      <w:pPr>
+        <w:pStyle w:val="ListParagraph"/>
+        <w:keepNext/>
+        <w:keepLines/>
+        <w:numPr>
+          <w:ilvl w:val="0"/>
+          <w:numId w:val="3"/>
+        </w:numPr>
+        <w:spacing w:after="30" w:line="240"/>
+      </w:pPr>
+      <w:r>
+        <w:rPr>
+          <w:rFonts w:ascii="Arial" w:cs="Arial" w:eastAsia="Arial" w:hAnsi="Arial"/>
+          <w:b w:val="false"/>
+          <w:bCs w:val="false"/>
+          <w:i w:val="false"/>
+          <w:iCs w:val="false"/>
+          <w:color w:val="000000"/>
+          <w:sz w:val="22"/>
+          <w:szCs w:val="22"/>
+        </w:rPr>
+        <w:t xml:space="preserve">Using × for multiply, which looks like the variable x — use a coefficient, a dot, or parentheses.</w:t>
+      </w:r>
+    </w:p>
+    <w:p>
+      <w:pPr>
+        <w:pStyle w:val="ListParagraph"/>
+        <w:keepNext/>
+        <w:keepLines/>
+        <w:numPr>
+          <w:ilvl w:val="0"/>
+          <w:numId w:val="3"/>
+        </w:numPr>
+        <w:spacing w:after="30" w:line="240"/>
+      </w:pPr>
+      <w:r>
+        <w:rPr>
+          <w:rFonts w:ascii="Arial" w:cs="Arial" w:eastAsia="Arial" w:hAnsi="Arial"/>
+          <w:b w:val="false"/>
+          <w:bCs w:val="false"/>
+          <w:i w:val="false"/>
+          <w:iCs w:val="false"/>
+          <w:color w:val="000000"/>
+          <w:sz w:val="22"/>
+          <w:szCs w:val="22"/>
+        </w:rPr>
+        <w:t xml:space="preserve">Forgetting that “twice / double” means × 2 (so “twice a number n” is 2n).</w:t>
+      </w:r>
+    </w:p>
+    <w:p>
+      <w:pPr>
+        <w:pStyle w:val="ListParagraph"/>
+        <w:keepNext/>
+        <w:keepLines/>
+        <w:numPr>
+          <w:ilvl w:val="0"/>
+          <w:numId w:val="3"/>
+        </w:numPr>
+        <w:spacing w:after="30" w:line="240"/>
+      </w:pPr>
+      <w:r>
+        <w:rPr>
+          <w:rFonts w:ascii="Arial" w:cs="Arial" w:eastAsia="Arial" w:hAnsi="Arial"/>
+          <w:b w:val="false"/>
+          <w:bCs w:val="false"/>
+          <w:i w:val="false"/>
+          <w:iCs w:val="false"/>
+          <w:color w:val="000000"/>
+          <w:sz w:val="22"/>
+          <w:szCs w:val="22"/>
+        </w:rPr>
+        <w:t xml:space="preserve">Trying to “solve” or find a single number for an expression that still contains a variable.</w:t>
+      </w:r>
+    </w:p>
+    <w:p>
+      <w:pPr>
+        <w:pStyle w:val="ListParagraph"/>
+        <w:keepLines/>
+        <w:numPr>
+          <w:ilvl w:val="0"/>
+          <w:numId w:val="3"/>
+        </w:numPr>
+        <w:spacing w:after="30" w:line="240"/>
+      </w:pPr>
+      <w:r>
+        <w:rPr>
+          <w:rFonts w:ascii="Arial" w:cs="Arial" w:eastAsia="Arial" w:hAnsi="Arial"/>
+          <w:b w:val="false"/>
+          <w:bCs w:val="false"/>
+          <w:i w:val="false"/>
+          <w:iCs w:val="false"/>
+          <w:color w:val="000000"/>
+          <w:sz w:val="22"/>
+          <w:szCs w:val="22"/>
+        </w:rPr>
+        <w:t xml:space="preserve">Dropping the constant in a “flat fee + rate” situation (e.g., writing only the rate term and forgetting the starting amount).</w:t>
+      </w:r>
+    </w:p>
+    <w:p>
+      <w:pPr>
         <w:keepLines/>
       </w:pPr>
       <w:r>
@@ -4634,177 +4805,6 @@
         </w:tc>
       </w:tr>
     </w:tbl>
-    <w:p>
-      <w:pPr>
-        <w:keepNext/>
-        <w:keepLines/>
-        <w:pBdr>
-          <w:bottom w:val="single" w:color="2E74B5" w:sz="12" w:space="3"/>
-        </w:pBdr>
-        <w:spacing w:after="50" w:before="160"/>
-      </w:pPr>
-      <w:r>
-        <w:rPr>
-          <w:rFonts w:ascii="Arial" w:cs="Arial" w:eastAsia="Arial" w:hAnsi="Arial"/>
-          <w:b/>
-          <w:bCs/>
-          <w:caps/>
-          <w:color w:val="1F3864"/>
-          <w:sz w:val="26"/>
-          <w:szCs w:val="26"/>
-        </w:rPr>
-        <w:t xml:space="preserve">Common Mistakes</w:t>
-      </w:r>
-    </w:p>
-    <w:p>
-      <w:pPr>
-        <w:pStyle w:val="ListParagraph"/>
-        <w:keepNext/>
-        <w:keepLines/>
-        <w:numPr>
-          <w:ilvl w:val="0"/>
-          <w:numId w:val="3"/>
-        </w:numPr>
-        <w:spacing w:after="30" w:line="240"/>
-      </w:pPr>
-      <w:r>
-        <w:rPr>
-          <w:rFonts w:ascii="Arial" w:cs="Arial" w:eastAsia="Arial" w:hAnsi="Arial"/>
-          <w:b w:val="false"/>
-          <w:bCs w:val="false"/>
-          <w:i w:val="false"/>
-          <w:iCs w:val="false"/>
-          <w:color w:val="000000"/>
-          <w:sz w:val="22"/>
-          <w:szCs w:val="22"/>
-        </w:rPr>
-        <w:t xml:space="preserve">Reversing subtraction: writing 8 – n for “8 less than n” (it should be n – 8).</w:t>
-      </w:r>
-    </w:p>
-    <w:p>
-      <w:pPr>
-        <w:pStyle w:val="ListParagraph"/>
-        <w:keepNext/>
-        <w:keepLines/>
-        <w:numPr>
-          <w:ilvl w:val="0"/>
-          <w:numId w:val="3"/>
-        </w:numPr>
-        <w:spacing w:after="30" w:line="240"/>
-      </w:pPr>
-      <w:r>
-        <w:rPr>
-          <w:rFonts w:ascii="Arial" w:cs="Arial" w:eastAsia="Arial" w:hAnsi="Arial"/>
-          <w:b w:val="false"/>
-          <w:bCs w:val="false"/>
-          <w:i w:val="false"/>
-          <w:iCs w:val="false"/>
-          <w:color w:val="000000"/>
-          <w:sz w:val="22"/>
-          <w:szCs w:val="22"/>
-        </w:rPr>
-        <w:t xml:space="preserve">Reversing division / quotient order (“the quotient of a and b” is a ÷ b, not b ÷ a).</w:t>
-      </w:r>
-    </w:p>
-    <w:p>
-      <w:pPr>
-        <w:pStyle w:val="ListParagraph"/>
-        <w:keepNext/>
-        <w:keepLines/>
-        <w:numPr>
-          <w:ilvl w:val="0"/>
-          <w:numId w:val="3"/>
-        </w:numPr>
-        <w:spacing w:after="30" w:line="240"/>
-      </w:pPr>
-      <w:r>
-        <w:rPr>
-          <w:rFonts w:ascii="Arial" w:cs="Arial" w:eastAsia="Arial" w:hAnsi="Arial"/>
-          <w:b w:val="false"/>
-          <w:bCs w:val="false"/>
-          <w:i w:val="false"/>
-          <w:iCs w:val="false"/>
-          <w:color w:val="000000"/>
-          <w:sz w:val="22"/>
-          <w:szCs w:val="22"/>
-        </w:rPr>
-        <w:t xml:space="preserve">Using × for multiply, which looks like the variable x — use a coefficient, a dot, or parentheses.</w:t>
-      </w:r>
-    </w:p>
-    <w:p>
-      <w:pPr>
-        <w:pStyle w:val="ListParagraph"/>
-        <w:keepNext/>
-        <w:keepLines/>
-        <w:numPr>
-          <w:ilvl w:val="0"/>
-          <w:numId w:val="3"/>
-        </w:numPr>
-        <w:spacing w:after="30" w:line="240"/>
-      </w:pPr>
-      <w:r>
-        <w:rPr>
-          <w:rFonts w:ascii="Arial" w:cs="Arial" w:eastAsia="Arial" w:hAnsi="Arial"/>
-          <w:b w:val="false"/>
-          <w:bCs w:val="false"/>
-          <w:i w:val="false"/>
-          <w:iCs w:val="false"/>
-          <w:color w:val="000000"/>
-          <w:sz w:val="22"/>
-          <w:szCs w:val="22"/>
-        </w:rPr>
-        <w:t xml:space="preserve">Forgetting that “twice / double” means × 2 (so “twice a number n” is 2n).</w:t>
-      </w:r>
-    </w:p>
-    <w:p>
-      <w:pPr>
-        <w:pStyle w:val="ListParagraph"/>
-        <w:keepNext/>
-        <w:keepLines/>
-        <w:numPr>
-          <w:ilvl w:val="0"/>
-          <w:numId w:val="3"/>
-        </w:numPr>
-        <w:spacing w:after="30" w:line="240"/>
-      </w:pPr>
-      <w:r>
-        <w:rPr>
-          <w:rFonts w:ascii="Arial" w:cs="Arial" w:eastAsia="Arial" w:hAnsi="Arial"/>
-          <w:b w:val="false"/>
-          <w:bCs w:val="false"/>
-          <w:i w:val="false"/>
-          <w:iCs w:val="false"/>
-          <w:color w:val="000000"/>
-          <w:sz w:val="22"/>
-          <w:szCs w:val="22"/>
-        </w:rPr>
-        <w:t xml:space="preserve">Trying to “solve” or find a single number for an expression that still contains a variable.</w:t>
-      </w:r>
-    </w:p>
-    <w:p>
-      <w:pPr>
-        <w:pStyle w:val="ListParagraph"/>
-        <w:keepLines/>
-        <w:numPr>
-          <w:ilvl w:val="0"/>
-          <w:numId w:val="3"/>
-        </w:numPr>
-        <w:spacing w:after="30" w:line="240"/>
-      </w:pPr>
-      <w:r>
-        <w:rPr>
-          <w:rFonts w:ascii="Arial" w:cs="Arial" w:eastAsia="Arial" w:hAnsi="Arial"/>
-          <w:b w:val="false"/>
-          <w:bCs w:val="false"/>
-          <w:i w:val="false"/>
-          <w:iCs w:val="false"/>
-          <w:color w:val="000000"/>
-          <w:sz w:val="22"/>
-          <w:szCs w:val="22"/>
-        </w:rPr>
-        <w:t xml:space="preserve">Dropping the constant in a “flat fee + rate” situation (e.g., writing only the rate term and forgetting the starting amount).</w:t>
-      </w:r>
-    </w:p>
     <w:p>
       <w:pPr>
         <w:keepNext/>

</xml_diff>